<commit_message>
Commit of Modified Website About Us section
</commit_message>
<xml_diff>
--- a/Prompt_to_Cursor_Instructions_Log.docx
+++ b/Prompt_to_Cursor_Instructions_Log.docx
@@ -327,7 +327,35 @@
         <w:rPr>
           <w:lang w:val="en-US"/>
         </w:rPr>
-        <w:t xml:space="preserve"> ). It also offers lists of the names of proteins/genes associated with signalling pathways, as sourced from the Reactome database’s Pathway Browser (</w:t>
+        <w:t xml:space="preserve"> ). It also offers lists of the names of proteins/genes associated with </w:t>
+      </w:r>
+      <w:proofErr w:type="spellStart"/>
+      <w:r>
+        <w:rPr>
+          <w:lang w:val="en-US"/>
+        </w:rPr>
+        <w:t>signalling</w:t>
+      </w:r>
+      <w:proofErr w:type="spellEnd"/>
+      <w:r>
+        <w:rPr>
+          <w:lang w:val="en-US"/>
+        </w:rPr>
+        <w:t xml:space="preserve"> pathways, as sourced from the </w:t>
+      </w:r>
+      <w:proofErr w:type="spellStart"/>
+      <w:r>
+        <w:rPr>
+          <w:lang w:val="en-US"/>
+        </w:rPr>
+        <w:t>Reactome</w:t>
+      </w:r>
+      <w:proofErr w:type="spellEnd"/>
+      <w:r>
+        <w:rPr>
+          <w:lang w:val="en-US"/>
+        </w:rPr>
+        <w:t xml:space="preserve"> database’s Pathway Browser (</w:t>
       </w:r>
       <w:hyperlink r:id="rId6" w:history="1">
         <w:r>
@@ -724,7 +752,35 @@
           <w:lang w:val="en-US"/>
         </w:rPr>
         <w:lastRenderedPageBreak/>
-        <w:t xml:space="preserve">A search box labelled “Protein/Gene Name (as per UniProt Nomenclature)”, a drop-down menu labelled “Signalling Pathway (from Reactome)”, </w:t>
+        <w:t>A search box labelled “Protein/Gene Name (as per UniProt Nomenclature)”, a drop-down menu labelled “</w:t>
+      </w:r>
+      <w:proofErr w:type="spellStart"/>
+      <w:r>
+        <w:rPr>
+          <w:lang w:val="en-US"/>
+        </w:rPr>
+        <w:t>Signalling</w:t>
+      </w:r>
+      <w:proofErr w:type="spellEnd"/>
+      <w:r>
+        <w:rPr>
+          <w:lang w:val="en-US"/>
+        </w:rPr>
+        <w:t xml:space="preserve"> Pathway (from </w:t>
+      </w:r>
+      <w:proofErr w:type="spellStart"/>
+      <w:r>
+        <w:rPr>
+          <w:lang w:val="en-US"/>
+        </w:rPr>
+        <w:t>Reactome</w:t>
+      </w:r>
+      <w:proofErr w:type="spellEnd"/>
+      <w:r>
+        <w:rPr>
+          <w:lang w:val="en-US"/>
+        </w:rPr>
+        <w:t xml:space="preserve">)”, </w:t>
       </w:r>
       <w:r>
         <w:rPr>
@@ -749,7 +805,21 @@
         <w:rPr>
           <w:lang w:val="en-US"/>
         </w:rPr>
-        <w:t xml:space="preserve">The Signalling Pathway </w:t>
+        <w:t xml:space="preserve">The </w:t>
+      </w:r>
+      <w:proofErr w:type="spellStart"/>
+      <w:r>
+        <w:rPr>
+          <w:lang w:val="en-US"/>
+        </w:rPr>
+        <w:t>Signalling</w:t>
+      </w:r>
+      <w:proofErr w:type="spellEnd"/>
+      <w:r>
+        <w:rPr>
+          <w:lang w:val="en-US"/>
+        </w:rPr>
+        <w:t xml:space="preserve"> Pathway </w:t>
       </w:r>
       <w:r>
         <w:rPr>
@@ -769,11 +839,33 @@
           <w:lang w:val="en-US"/>
         </w:rPr>
       </w:pPr>
-      <w:r>
-        <w:rPr>
-          <w:lang w:val="en-US"/>
-        </w:rPr>
-        <w:t>Wnt Signalling Pathway</w:t>
+      <w:proofErr w:type="spellStart"/>
+      <w:r>
+        <w:rPr>
+          <w:lang w:val="en-US"/>
+        </w:rPr>
+        <w:t>Wnt</w:t>
+      </w:r>
+      <w:proofErr w:type="spellEnd"/>
+      <w:r>
+        <w:rPr>
+          <w:lang w:val="en-US"/>
+        </w:rPr>
+        <w:t xml:space="preserve"> </w:t>
+      </w:r>
+      <w:proofErr w:type="spellStart"/>
+      <w:r>
+        <w:rPr>
+          <w:lang w:val="en-US"/>
+        </w:rPr>
+        <w:t>Signalling</w:t>
+      </w:r>
+      <w:proofErr w:type="spellEnd"/>
+      <w:r>
+        <w:rPr>
+          <w:lang w:val="en-US"/>
+        </w:rPr>
+        <w:t xml:space="preserve"> Pathway</w:t>
       </w:r>
     </w:p>
     <w:p>
@@ -791,7 +883,21 @@
         <w:rPr>
           <w:lang w:val="en-US"/>
         </w:rPr>
-        <w:t>MTOR Signalling Pathway</w:t>
+        <w:t xml:space="preserve">MTOR </w:t>
+      </w:r>
+      <w:proofErr w:type="spellStart"/>
+      <w:r>
+        <w:rPr>
+          <w:lang w:val="en-US"/>
+        </w:rPr>
+        <w:t>Signalling</w:t>
+      </w:r>
+      <w:proofErr w:type="spellEnd"/>
+      <w:r>
+        <w:rPr>
+          <w:lang w:val="en-US"/>
+        </w:rPr>
+        <w:t xml:space="preserve"> Pathway</w:t>
       </w:r>
     </w:p>
     <w:p>
@@ -914,7 +1020,21 @@
         <w:rPr>
           <w:lang w:val="en-US"/>
         </w:rPr>
-        <w:t>To the top-right of the Subset of Proteins drop-down menu will be a small circular button bearing the label “i”, which will display text that reads “Select a subset of the displayed proteins of the selected signalling pathways” in a message box that is displayed as long as the user hovers the cursor over this “i” button.</w:t>
+        <w:t xml:space="preserve">To the top-right of the Subset of Proteins drop-down menu will be a small circular button bearing the label “i”, which will display text that reads “Select a subset of the displayed proteins of the selected </w:t>
+      </w:r>
+      <w:proofErr w:type="spellStart"/>
+      <w:r>
+        <w:rPr>
+          <w:lang w:val="en-US"/>
+        </w:rPr>
+        <w:t>signalling</w:t>
+      </w:r>
+      <w:proofErr w:type="spellEnd"/>
+      <w:r>
+        <w:rPr>
+          <w:lang w:val="en-US"/>
+        </w:rPr>
+        <w:t xml:space="preserve"> pathways” in a message box that is displayed as long as the user hovers the cursor over this “i” button.</w:t>
       </w:r>
     </w:p>
     <w:p>
@@ -1024,19 +1144,42 @@
         <w:rPr>
           <w:lang w:val="en-US"/>
         </w:rPr>
-        <w:t xml:space="preserve">In this folder, Database_Demo, there are two folders named </w:t>
-      </w:r>
+        <w:t xml:space="preserve">In this folder, </w:t>
+      </w:r>
+      <w:proofErr w:type="spellStart"/>
+      <w:r>
+        <w:rPr>
+          <w:lang w:val="en-US"/>
+        </w:rPr>
+        <w:t>Database_Demo</w:t>
+      </w:r>
+      <w:proofErr w:type="spellEnd"/>
+      <w:r>
+        <w:rPr>
+          <w:lang w:val="en-US"/>
+        </w:rPr>
+        <w:t xml:space="preserve">, there are two folders named </w:t>
+      </w:r>
+      <w:proofErr w:type="spellStart"/>
       <w:r>
         <w:rPr>
           <w:lang w:val="en-US"/>
         </w:rPr>
         <w:t>MTOR_signalling_proteins_differential_expression_in_cancer</w:t>
       </w:r>
-      <w:r>
-        <w:rPr>
-          <w:lang w:val="en-US"/>
-        </w:rPr>
-        <w:t xml:space="preserve"> and Wnt</w:t>
+      <w:proofErr w:type="spellEnd"/>
+      <w:r>
+        <w:rPr>
+          <w:lang w:val="en-US"/>
+        </w:rPr>
+        <w:t xml:space="preserve"> and </w:t>
+      </w:r>
+      <w:proofErr w:type="spellStart"/>
+      <w:r>
+        <w:rPr>
+          <w:lang w:val="en-US"/>
+        </w:rPr>
+        <w:t>Wnt</w:t>
       </w:r>
       <w:r>
         <w:rPr>
@@ -1044,6 +1187,7 @@
         </w:rPr>
         <w:t>_signalling_proteins_differential_expression_in_cancer</w:t>
       </w:r>
+      <w:proofErr w:type="spellEnd"/>
       <w:r>
         <w:rPr>
           <w:lang w:val="en-US"/>
@@ -1074,7 +1218,21 @@
         <w:rPr>
           <w:lang w:val="en-US"/>
         </w:rPr>
-        <w:t xml:space="preserve">Within the folder is a set of TSV files, all named in the format Protein Name_diffr_expr_cancer (e.g.: </w:t>
+        <w:t xml:space="preserve">Within the folder is a set of TSV files, all named in the format Protein </w:t>
+      </w:r>
+      <w:proofErr w:type="spellStart"/>
+      <w:r>
+        <w:rPr>
+          <w:lang w:val="en-US"/>
+        </w:rPr>
+        <w:t>Name_diffr_expr_cancer</w:t>
+      </w:r>
+      <w:proofErr w:type="spellEnd"/>
+      <w:r>
+        <w:rPr>
+          <w:lang w:val="en-US"/>
+        </w:rPr>
+        <w:t xml:space="preserve"> (e.g.: </w:t>
       </w:r>
       <w:r>
         <w:rPr>
@@ -1125,17 +1283,26 @@
         </w:rPr>
         <w:t xml:space="preserve">Create an SQL database from the CSV files in the sub-folders </w:t>
       </w:r>
+      <w:proofErr w:type="spellStart"/>
       <w:r>
         <w:rPr>
           <w:lang w:val="en-US"/>
         </w:rPr>
         <w:t>MTOR_signalling_proteins_differential_expression_in_cancer</w:t>
       </w:r>
-      <w:r>
-        <w:rPr>
-          <w:lang w:val="en-US"/>
-        </w:rPr>
-        <w:t xml:space="preserve"> and Wnt</w:t>
+      <w:proofErr w:type="spellEnd"/>
+      <w:r>
+        <w:rPr>
+          <w:lang w:val="en-US"/>
+        </w:rPr>
+        <w:t xml:space="preserve"> and </w:t>
+      </w:r>
+      <w:proofErr w:type="spellStart"/>
+      <w:r>
+        <w:rPr>
+          <w:lang w:val="en-US"/>
+        </w:rPr>
+        <w:t>Wnt</w:t>
       </w:r>
       <w:r>
         <w:rPr>
@@ -1143,6 +1310,7 @@
         </w:rPr>
         <w:t>_signalling_proteins_differential_expression_in_cancer</w:t>
       </w:r>
+      <w:proofErr w:type="spellEnd"/>
       <w:r>
         <w:rPr>
           <w:lang w:val="en-US"/>
@@ -1199,12 +1367,14 @@
         </w:rPr>
         <w:t xml:space="preserve"> in the </w:t>
       </w:r>
+      <w:proofErr w:type="spellStart"/>
       <w:r>
         <w:rPr>
           <w:lang w:val="en-US"/>
         </w:rPr>
         <w:t>Database_Demo</w:t>
       </w:r>
+      <w:proofErr w:type="spellEnd"/>
       <w:r>
         <w:rPr>
           <w:lang w:val="en-US"/>
@@ -1247,12 +1417,14 @@
         </w:rPr>
         <w:t xml:space="preserve">, in the </w:t>
       </w:r>
+      <w:proofErr w:type="spellStart"/>
       <w:r>
         <w:rPr>
           <w:lang w:val="en-US"/>
         </w:rPr>
         <w:t>Database_Demo</w:t>
       </w:r>
+      <w:proofErr w:type="spellEnd"/>
       <w:r>
         <w:rPr>
           <w:lang w:val="en-US"/>
@@ -1300,7 +1472,21 @@
         <w:rPr>
           <w:lang w:val="en-US"/>
         </w:rPr>
-        <w:t>Name the SQL database Cancer_Genomics_Differential_Expression_Data and l</w:t>
+        <w:t xml:space="preserve">Name the SQL database </w:t>
+      </w:r>
+      <w:proofErr w:type="spellStart"/>
+      <w:r>
+        <w:rPr>
+          <w:lang w:val="en-US"/>
+        </w:rPr>
+        <w:t>Cancer_Genomics_Differential_Expression_Data</w:t>
+      </w:r>
+      <w:proofErr w:type="spellEnd"/>
+      <w:r>
+        <w:rPr>
+          <w:lang w:val="en-US"/>
+        </w:rPr>
+        <w:t xml:space="preserve"> and l</w:t>
       </w:r>
       <w:r>
         <w:rPr>
@@ -1308,12 +1494,14 @@
         </w:rPr>
         <w:t>ink this SQL database to the content of the Cancer Genomics section of the website, whose website files are in this folder (</w:t>
       </w:r>
+      <w:proofErr w:type="spellStart"/>
       <w:r>
         <w:rPr>
           <w:lang w:val="en-US"/>
         </w:rPr>
         <w:t>Database_Demo</w:t>
       </w:r>
+      <w:proofErr w:type="spellEnd"/>
       <w:r>
         <w:rPr>
           <w:lang w:val="en-US"/>
@@ -1338,7 +1526,21 @@
         <w:rPr>
           <w:lang w:val="en-US"/>
         </w:rPr>
-        <w:t>Stop displaying the “Click successfully performed.” pop-up message box that appears whenever any button or clickable object in the Cancer Genomics section is clicked. Delete the code that causes this behaviour.</w:t>
+        <w:t xml:space="preserve">Stop displaying the “Click successfully performed.” pop-up message box that appears whenever any button or clickable object in the Cancer Genomics section is clicked. Delete the code that causes this </w:t>
+      </w:r>
+      <w:proofErr w:type="spellStart"/>
+      <w:r>
+        <w:rPr>
+          <w:lang w:val="en-US"/>
+        </w:rPr>
+        <w:t>behaviour</w:t>
+      </w:r>
+      <w:proofErr w:type="spellEnd"/>
+      <w:r>
+        <w:rPr>
+          <w:lang w:val="en-US"/>
+        </w:rPr>
+        <w:t>.</w:t>
       </w:r>
       <w:r>
         <w:rPr>
@@ -1393,7 +1595,77 @@
         <w:rPr>
           <w:lang w:val="en-US"/>
         </w:rPr>
-        <w:t>, verify whether the name entered is an exact string match for any of the Protein Name entries in the tables MTOR_signalling_proteins and Wnt_signalling_proteins. If there is no exact match for any of these names, look for an exact match in the entries within the Gene Name column of each table, by searching for an exact match within each entry (row) in each such column, wherein the entry may contain one or multiple gene names to be compared with the user-provided search string, separated by one or more spaces between consecutive gene names in each row of the Gene Name column. After performing this entire search of the sets of Protein Name and Gene Name columns in the MTOR_signalling_proteins and Wnt_signalling_proteins tables, if no exact match is found for the user-provided Protein/Gene name, then display an error message in a dismissable message box saying “The Protein/gene name provided is either not in the database, at present, or is misspelt. Please re-check the spelling and try again, if you altered it.</w:t>
+        <w:t xml:space="preserve">, verify whether the name entered is an exact string match for any of the Protein Name entries in the tables </w:t>
+      </w:r>
+      <w:proofErr w:type="spellStart"/>
+      <w:r>
+        <w:rPr>
+          <w:lang w:val="en-US"/>
+        </w:rPr>
+        <w:t>MTOR_signalling_proteins</w:t>
+      </w:r>
+      <w:proofErr w:type="spellEnd"/>
+      <w:r>
+        <w:rPr>
+          <w:lang w:val="en-US"/>
+        </w:rPr>
+        <w:t xml:space="preserve"> and </w:t>
+      </w:r>
+      <w:proofErr w:type="spellStart"/>
+      <w:r>
+        <w:rPr>
+          <w:lang w:val="en-US"/>
+        </w:rPr>
+        <w:t>Wnt_signalling_proteins</w:t>
+      </w:r>
+      <w:proofErr w:type="spellEnd"/>
+      <w:r>
+        <w:rPr>
+          <w:lang w:val="en-US"/>
+        </w:rPr>
+        <w:t xml:space="preserve">. If there is no exact match for any of these names, look for an exact match in the entries within the Gene Name column of each table, by searching for an exact match within each entry (row) in each such column, wherein the entry may contain one or multiple gene names to be compared with the user-provided search string, separated by one or more spaces between consecutive gene names in each row of the Gene Name column. After performing this entire search of the sets of Protein Name and Gene Name columns in the </w:t>
+      </w:r>
+      <w:proofErr w:type="spellStart"/>
+      <w:r>
+        <w:rPr>
+          <w:lang w:val="en-US"/>
+        </w:rPr>
+        <w:t>MTOR_signalling_proteins</w:t>
+      </w:r>
+      <w:proofErr w:type="spellEnd"/>
+      <w:r>
+        <w:rPr>
+          <w:lang w:val="en-US"/>
+        </w:rPr>
+        <w:t xml:space="preserve"> and </w:t>
+      </w:r>
+      <w:proofErr w:type="spellStart"/>
+      <w:r>
+        <w:rPr>
+          <w:lang w:val="en-US"/>
+        </w:rPr>
+        <w:t>Wnt_signalling_proteins</w:t>
+      </w:r>
+      <w:proofErr w:type="spellEnd"/>
+      <w:r>
+        <w:rPr>
+          <w:lang w:val="en-US"/>
+        </w:rPr>
+        <w:t xml:space="preserve"> tables, if no exact match is found for the user-provided Protein/Gene name, then display an error message in a </w:t>
+      </w:r>
+      <w:proofErr w:type="spellStart"/>
+      <w:r>
+        <w:rPr>
+          <w:lang w:val="en-US"/>
+        </w:rPr>
+        <w:t>dismissable</w:t>
+      </w:r>
+      <w:proofErr w:type="spellEnd"/>
+      <w:r>
+        <w:rPr>
+          <w:lang w:val="en-US"/>
+        </w:rPr>
+        <w:t xml:space="preserve"> message box saying “The Protein/gene name provided is either not in the database, at present, or is misspelt. Please re-check the spelling and try again, if you altered it.</w:t>
       </w:r>
       <w:r>
         <w:rPr>
@@ -1502,7 +1774,21 @@
         <w:rPr>
           <w:lang w:val="en-US"/>
         </w:rPr>
-        <w:t xml:space="preserve"> named in the format Protein Name_diffr_expr_cancer </w:t>
+        <w:t xml:space="preserve"> named in the format Protein </w:t>
+      </w:r>
+      <w:proofErr w:type="spellStart"/>
+      <w:r>
+        <w:rPr>
+          <w:lang w:val="en-US"/>
+        </w:rPr>
+        <w:t>Name_diffr_expr_cancer</w:t>
+      </w:r>
+      <w:proofErr w:type="spellEnd"/>
+      <w:r>
+        <w:rPr>
+          <w:lang w:val="en-US"/>
+        </w:rPr>
+        <w:t xml:space="preserve"> </w:t>
       </w:r>
       <w:r>
         <w:rPr>
@@ -1576,7 +1862,35 @@
         <w:rPr>
           <w:lang w:val="en-US"/>
         </w:rPr>
-        <w:t xml:space="preserve">options in the “Signalling Pathway (from Reactome)” drop-down menu, and then clicks on </w:t>
+        <w:t>options in the “</w:t>
+      </w:r>
+      <w:proofErr w:type="spellStart"/>
+      <w:r>
+        <w:rPr>
+          <w:lang w:val="en-US"/>
+        </w:rPr>
+        <w:t>Signalling</w:t>
+      </w:r>
+      <w:proofErr w:type="spellEnd"/>
+      <w:r>
+        <w:rPr>
+          <w:lang w:val="en-US"/>
+        </w:rPr>
+        <w:t xml:space="preserve"> Pathway (from </w:t>
+      </w:r>
+      <w:proofErr w:type="spellStart"/>
+      <w:r>
+        <w:rPr>
+          <w:lang w:val="en-US"/>
+        </w:rPr>
+        <w:t>Reactome</w:t>
+      </w:r>
+      <w:proofErr w:type="spellEnd"/>
+      <w:r>
+        <w:rPr>
+          <w:lang w:val="en-US"/>
+        </w:rPr>
+        <w:t xml:space="preserve">)” drop-down menu, and then clicks on </w:t>
       </w:r>
       <w:r>
         <w:rPr>
@@ -1594,26 +1908,124 @@
         <w:rPr>
           <w:lang w:val="en-US"/>
         </w:rPr>
-        <w:t>“Subsets of Proteins” drop-down menu, then display the entire set of Protein Name entries from the corresponding pathway’s table in the dataset (e.g.: if the user selects “Wnt Signalling Pathway” in the “Signalling Pathway (from Reactome)” drop-down menu, then display the set of Protein Name entries from the Wnt_</w:t>
-      </w:r>
-      <w:r>
-        <w:rPr>
-          <w:lang w:val="en-US"/>
-        </w:rPr>
-        <w:t>signalling_proteins table in the SQL database).</w:t>
-      </w:r>
-    </w:p>
-    <w:p>
-      <w:pPr>
-        <w:rPr>
-          <w:lang w:val="en-US"/>
-        </w:rPr>
-      </w:pPr>
-      <w:r>
-        <w:rPr>
-          <w:lang w:val="en-US"/>
-        </w:rPr>
-        <w:t>If a user selects only one option from the “Signalling Pathway (from Reactome)” drop-down menu, then keep the options within the “Subsets of Proteins” drop-down menu deselected and greyed/disabled.</w:t>
+        <w:t>“Subsets of Proteins” drop-down menu, then display the entire set of Protein Name entries from the corresponding pathway’s table in the dataset (e.g.: if the user selects “</w:t>
+      </w:r>
+      <w:proofErr w:type="spellStart"/>
+      <w:r>
+        <w:rPr>
+          <w:lang w:val="en-US"/>
+        </w:rPr>
+        <w:t>Wnt</w:t>
+      </w:r>
+      <w:proofErr w:type="spellEnd"/>
+      <w:r>
+        <w:rPr>
+          <w:lang w:val="en-US"/>
+        </w:rPr>
+        <w:t xml:space="preserve"> </w:t>
+      </w:r>
+      <w:proofErr w:type="spellStart"/>
+      <w:r>
+        <w:rPr>
+          <w:lang w:val="en-US"/>
+        </w:rPr>
+        <w:t>Signalling</w:t>
+      </w:r>
+      <w:proofErr w:type="spellEnd"/>
+      <w:r>
+        <w:rPr>
+          <w:lang w:val="en-US"/>
+        </w:rPr>
+        <w:t xml:space="preserve"> Pathway” in the “</w:t>
+      </w:r>
+      <w:proofErr w:type="spellStart"/>
+      <w:r>
+        <w:rPr>
+          <w:lang w:val="en-US"/>
+        </w:rPr>
+        <w:t>Signalling</w:t>
+      </w:r>
+      <w:proofErr w:type="spellEnd"/>
+      <w:r>
+        <w:rPr>
+          <w:lang w:val="en-US"/>
+        </w:rPr>
+        <w:t xml:space="preserve"> Pathway (from </w:t>
+      </w:r>
+      <w:proofErr w:type="spellStart"/>
+      <w:r>
+        <w:rPr>
+          <w:lang w:val="en-US"/>
+        </w:rPr>
+        <w:t>Reactome</w:t>
+      </w:r>
+      <w:proofErr w:type="spellEnd"/>
+      <w:r>
+        <w:rPr>
+          <w:lang w:val="en-US"/>
+        </w:rPr>
+        <w:t xml:space="preserve">)” drop-down menu, then display the set of Protein Name entries from the </w:t>
+      </w:r>
+      <w:proofErr w:type="spellStart"/>
+      <w:r>
+        <w:rPr>
+          <w:lang w:val="en-US"/>
+        </w:rPr>
+        <w:t>Wnt_</w:t>
+      </w:r>
+      <w:r>
+        <w:rPr>
+          <w:lang w:val="en-US"/>
+        </w:rPr>
+        <w:t>signalling_proteins</w:t>
+      </w:r>
+      <w:proofErr w:type="spellEnd"/>
+      <w:r>
+        <w:rPr>
+          <w:lang w:val="en-US"/>
+        </w:rPr>
+        <w:t xml:space="preserve"> table in the SQL database).</w:t>
+      </w:r>
+    </w:p>
+    <w:p>
+      <w:pPr>
+        <w:rPr>
+          <w:lang w:val="en-US"/>
+        </w:rPr>
+      </w:pPr>
+      <w:r>
+        <w:rPr>
+          <w:lang w:val="en-US"/>
+        </w:rPr>
+        <w:t>If a user selects only one option from the “</w:t>
+      </w:r>
+      <w:proofErr w:type="spellStart"/>
+      <w:r>
+        <w:rPr>
+          <w:lang w:val="en-US"/>
+        </w:rPr>
+        <w:t>Signalling</w:t>
+      </w:r>
+      <w:proofErr w:type="spellEnd"/>
+      <w:r>
+        <w:rPr>
+          <w:lang w:val="en-US"/>
+        </w:rPr>
+        <w:t xml:space="preserve"> Pathway (from </w:t>
+      </w:r>
+      <w:proofErr w:type="spellStart"/>
+      <w:r>
+        <w:rPr>
+          <w:lang w:val="en-US"/>
+        </w:rPr>
+        <w:t>Reactome</w:t>
+      </w:r>
+      <w:proofErr w:type="spellEnd"/>
+      <w:r>
+        <w:rPr>
+          <w:lang w:val="en-US"/>
+        </w:rPr>
+        <w:t>)” drop-down menu, then keep the options within the “Subsets of Proteins” drop-down menu deselected and greyed/disabled.</w:t>
       </w:r>
     </w:p>
     <w:p>
@@ -1632,7 +2044,35 @@
         <w:rPr>
           <w:lang w:val="en-US"/>
         </w:rPr>
-        <w:t>a user selects multiple options from the “Signalling Pathway (from Reactome)” drop-down menu, then reactivate the options in the “</w:t>
+        <w:t>a user selects multiple options from the “</w:t>
+      </w:r>
+      <w:proofErr w:type="spellStart"/>
+      <w:r>
+        <w:rPr>
+          <w:lang w:val="en-US"/>
+        </w:rPr>
+        <w:t>Signalling</w:t>
+      </w:r>
+      <w:proofErr w:type="spellEnd"/>
+      <w:r>
+        <w:rPr>
+          <w:lang w:val="en-US"/>
+        </w:rPr>
+        <w:t xml:space="preserve"> Pathway (from </w:t>
+      </w:r>
+      <w:proofErr w:type="spellStart"/>
+      <w:r>
+        <w:rPr>
+          <w:lang w:val="en-US"/>
+        </w:rPr>
+        <w:t>Reactome</w:t>
+      </w:r>
+      <w:proofErr w:type="spellEnd"/>
+      <w:r>
+        <w:rPr>
+          <w:lang w:val="en-US"/>
+        </w:rPr>
+        <w:t>)” drop-down menu, then reactivate the options in the “</w:t>
       </w:r>
       <w:r>
         <w:rPr>
@@ -1650,13 +2090,307 @@
         <w:rPr>
           <w:lang w:val="en-US"/>
         </w:rPr>
-        <w:t xml:space="preserve"> in the “Signalling Pathway (from Reactome)” drop-down menu, by matching the name of the signalling pathway from each of the selected options, wherein the options are named in the format “Name of Signalling Pathway” + “Signalling Pathway” (e.g.: the option “Wnt Signalling Pathway” corresponds to the signalling pathway name “Wnt”). The signalling pathway name thus extracted from each option selected in the “Signalling Pathway (from Reactome)” drop-down menu is to be compared to the signalling pathway name in each of the table names named in the format signalling pathway name_signalling_proteins. For each such exact match found, display the set of Protein Name entries from the corresponding table in the “Proteins” display panel. Remove the duplicated Protein Name entries from the set of Protein Name entries displayed</w:t>
-      </w:r>
-      <w:r>
-        <w:rPr>
-          <w:lang w:val="en-US"/>
-        </w:rPr>
-        <w:t xml:space="preserve">. If the user selects “Proteins in Common Only” from the “Subsets of Proteins” drop-down menu, then display the corresponding Protein Name entries in the “Proteins” display panel, wherein the only Protein Name entries displayed there are those that are common to the signalling pathway name_signalling_proteins format name-bearing tables corresponding to the options selected in the “Signalling Pathway (from Reactome)” drop-down menu. If there are no Protein Name entries in common in these tables, then display an error message in a dismissable message box saying “There are no proteins that are common to all of the selected signalling pathways.”, instead. If the user selects “Only Proteins Not in Common” from the “Subsets of Proteins” drop-down menu, then display only Protein Name entries that are not common across </w:t>
+        <w:t xml:space="preserve"> in the “</w:t>
+      </w:r>
+      <w:proofErr w:type="spellStart"/>
+      <w:r>
+        <w:rPr>
+          <w:lang w:val="en-US"/>
+        </w:rPr>
+        <w:t>Signalling</w:t>
+      </w:r>
+      <w:proofErr w:type="spellEnd"/>
+      <w:r>
+        <w:rPr>
+          <w:lang w:val="en-US"/>
+        </w:rPr>
+        <w:t xml:space="preserve"> Pathway (from </w:t>
+      </w:r>
+      <w:proofErr w:type="spellStart"/>
+      <w:r>
+        <w:rPr>
+          <w:lang w:val="en-US"/>
+        </w:rPr>
+        <w:t>Reactome</w:t>
+      </w:r>
+      <w:proofErr w:type="spellEnd"/>
+      <w:r>
+        <w:rPr>
+          <w:lang w:val="en-US"/>
+        </w:rPr>
+        <w:t xml:space="preserve">)” drop-down menu, by matching the name of the </w:t>
+      </w:r>
+      <w:proofErr w:type="spellStart"/>
+      <w:r>
+        <w:rPr>
+          <w:lang w:val="en-US"/>
+        </w:rPr>
+        <w:t>signalling</w:t>
+      </w:r>
+      <w:proofErr w:type="spellEnd"/>
+      <w:r>
+        <w:rPr>
+          <w:lang w:val="en-US"/>
+        </w:rPr>
+        <w:t xml:space="preserve"> pathway from each of the selected options, wherein the options are named in the format “Name of </w:t>
+      </w:r>
+      <w:proofErr w:type="spellStart"/>
+      <w:r>
+        <w:rPr>
+          <w:lang w:val="en-US"/>
+        </w:rPr>
+        <w:t>Signalling</w:t>
+      </w:r>
+      <w:proofErr w:type="spellEnd"/>
+      <w:r>
+        <w:rPr>
+          <w:lang w:val="en-US"/>
+        </w:rPr>
+        <w:t xml:space="preserve"> Pathway” + “</w:t>
+      </w:r>
+      <w:proofErr w:type="spellStart"/>
+      <w:r>
+        <w:rPr>
+          <w:lang w:val="en-US"/>
+        </w:rPr>
+        <w:t>Signalling</w:t>
+      </w:r>
+      <w:proofErr w:type="spellEnd"/>
+      <w:r>
+        <w:rPr>
+          <w:lang w:val="en-US"/>
+        </w:rPr>
+        <w:t xml:space="preserve"> Pathway” (e.g.: the option “</w:t>
+      </w:r>
+      <w:proofErr w:type="spellStart"/>
+      <w:r>
+        <w:rPr>
+          <w:lang w:val="en-US"/>
+        </w:rPr>
+        <w:t>Wnt</w:t>
+      </w:r>
+      <w:proofErr w:type="spellEnd"/>
+      <w:r>
+        <w:rPr>
+          <w:lang w:val="en-US"/>
+        </w:rPr>
+        <w:t xml:space="preserve"> </w:t>
+      </w:r>
+      <w:proofErr w:type="spellStart"/>
+      <w:r>
+        <w:rPr>
+          <w:lang w:val="en-US"/>
+        </w:rPr>
+        <w:t>Signalling</w:t>
+      </w:r>
+      <w:proofErr w:type="spellEnd"/>
+      <w:r>
+        <w:rPr>
+          <w:lang w:val="en-US"/>
+        </w:rPr>
+        <w:t xml:space="preserve"> Pathway” corresponds to the </w:t>
+      </w:r>
+      <w:proofErr w:type="spellStart"/>
+      <w:r>
+        <w:rPr>
+          <w:lang w:val="en-US"/>
+        </w:rPr>
+        <w:t>signalling</w:t>
+      </w:r>
+      <w:proofErr w:type="spellEnd"/>
+      <w:r>
+        <w:rPr>
+          <w:lang w:val="en-US"/>
+        </w:rPr>
+        <w:t xml:space="preserve"> pathway name “</w:t>
+      </w:r>
+      <w:proofErr w:type="spellStart"/>
+      <w:r>
+        <w:rPr>
+          <w:lang w:val="en-US"/>
+        </w:rPr>
+        <w:t>Wnt</w:t>
+      </w:r>
+      <w:proofErr w:type="spellEnd"/>
+      <w:r>
+        <w:rPr>
+          <w:lang w:val="en-US"/>
+        </w:rPr>
+        <w:t xml:space="preserve">”). The </w:t>
+      </w:r>
+      <w:proofErr w:type="spellStart"/>
+      <w:r>
+        <w:rPr>
+          <w:lang w:val="en-US"/>
+        </w:rPr>
+        <w:t>signalling</w:t>
+      </w:r>
+      <w:proofErr w:type="spellEnd"/>
+      <w:r>
+        <w:rPr>
+          <w:lang w:val="en-US"/>
+        </w:rPr>
+        <w:t xml:space="preserve"> pathway name thus extracted from each option selected in the “</w:t>
+      </w:r>
+      <w:proofErr w:type="spellStart"/>
+      <w:r>
+        <w:rPr>
+          <w:lang w:val="en-US"/>
+        </w:rPr>
+        <w:t>Signalling</w:t>
+      </w:r>
+      <w:proofErr w:type="spellEnd"/>
+      <w:r>
+        <w:rPr>
+          <w:lang w:val="en-US"/>
+        </w:rPr>
+        <w:t xml:space="preserve"> Pathway (from </w:t>
+      </w:r>
+      <w:proofErr w:type="spellStart"/>
+      <w:r>
+        <w:rPr>
+          <w:lang w:val="en-US"/>
+        </w:rPr>
+        <w:t>Reactome</w:t>
+      </w:r>
+      <w:proofErr w:type="spellEnd"/>
+      <w:r>
+        <w:rPr>
+          <w:lang w:val="en-US"/>
+        </w:rPr>
+        <w:t xml:space="preserve">)” drop-down menu is to be compared to the </w:t>
+      </w:r>
+      <w:proofErr w:type="spellStart"/>
+      <w:r>
+        <w:rPr>
+          <w:lang w:val="en-US"/>
+        </w:rPr>
+        <w:t>signalling</w:t>
+      </w:r>
+      <w:proofErr w:type="spellEnd"/>
+      <w:r>
+        <w:rPr>
+          <w:lang w:val="en-US"/>
+        </w:rPr>
+        <w:t xml:space="preserve"> pathway name in each of the table names named in the format </w:t>
+      </w:r>
+      <w:proofErr w:type="spellStart"/>
+      <w:r>
+        <w:rPr>
+          <w:lang w:val="en-US"/>
+        </w:rPr>
+        <w:t>signalling</w:t>
+      </w:r>
+      <w:proofErr w:type="spellEnd"/>
+      <w:r>
+        <w:rPr>
+          <w:lang w:val="en-US"/>
+        </w:rPr>
+        <w:t xml:space="preserve"> pathway </w:t>
+      </w:r>
+      <w:proofErr w:type="spellStart"/>
+      <w:r>
+        <w:rPr>
+          <w:lang w:val="en-US"/>
+        </w:rPr>
+        <w:t>name_signalling_proteins</w:t>
+      </w:r>
+      <w:proofErr w:type="spellEnd"/>
+      <w:r>
+        <w:rPr>
+          <w:lang w:val="en-US"/>
+        </w:rPr>
+        <w:t>. For each such exact match found, display the set of Protein Name entries from the corresponding table in the “Proteins” display panel. Remove the duplicated Protein Name entries from the set of Protein Name entries displayed</w:t>
+      </w:r>
+      <w:r>
+        <w:rPr>
+          <w:lang w:val="en-US"/>
+        </w:rPr>
+        <w:t xml:space="preserve">. If the user selects “Proteins in Common Only” from the “Subsets of Proteins” drop-down menu, then display the corresponding Protein Name entries in the “Proteins” display panel, wherein the only Protein Name entries displayed there are those that are common to the </w:t>
+      </w:r>
+      <w:proofErr w:type="spellStart"/>
+      <w:r>
+        <w:rPr>
+          <w:lang w:val="en-US"/>
+        </w:rPr>
+        <w:t>signalling</w:t>
+      </w:r>
+      <w:proofErr w:type="spellEnd"/>
+      <w:r>
+        <w:rPr>
+          <w:lang w:val="en-US"/>
+        </w:rPr>
+        <w:t xml:space="preserve"> pathway </w:t>
+      </w:r>
+      <w:proofErr w:type="spellStart"/>
+      <w:r>
+        <w:rPr>
+          <w:lang w:val="en-US"/>
+        </w:rPr>
+        <w:t>name_signalling_proteins</w:t>
+      </w:r>
+      <w:proofErr w:type="spellEnd"/>
+      <w:r>
+        <w:rPr>
+          <w:lang w:val="en-US"/>
+        </w:rPr>
+        <w:t xml:space="preserve"> format name-bearing tables corresponding to the options selected in the “</w:t>
+      </w:r>
+      <w:proofErr w:type="spellStart"/>
+      <w:r>
+        <w:rPr>
+          <w:lang w:val="en-US"/>
+        </w:rPr>
+        <w:t>Signalling</w:t>
+      </w:r>
+      <w:proofErr w:type="spellEnd"/>
+      <w:r>
+        <w:rPr>
+          <w:lang w:val="en-US"/>
+        </w:rPr>
+        <w:t xml:space="preserve"> Pathway (from </w:t>
+      </w:r>
+      <w:proofErr w:type="spellStart"/>
+      <w:r>
+        <w:rPr>
+          <w:lang w:val="en-US"/>
+        </w:rPr>
+        <w:t>Reactome</w:t>
+      </w:r>
+      <w:proofErr w:type="spellEnd"/>
+      <w:r>
+        <w:rPr>
+          <w:lang w:val="en-US"/>
+        </w:rPr>
+        <w:t xml:space="preserve">)” drop-down menu. If there are no Protein Name entries in common in these tables, then display an error message in a </w:t>
+      </w:r>
+      <w:proofErr w:type="spellStart"/>
+      <w:r>
+        <w:rPr>
+          <w:lang w:val="en-US"/>
+        </w:rPr>
+        <w:t>dismissable</w:t>
+      </w:r>
+      <w:proofErr w:type="spellEnd"/>
+      <w:r>
+        <w:rPr>
+          <w:lang w:val="en-US"/>
+        </w:rPr>
+        <w:t xml:space="preserve"> message box saying “There are no proteins that are common to all of the selected </w:t>
+      </w:r>
+      <w:proofErr w:type="spellStart"/>
+      <w:r>
+        <w:rPr>
+          <w:lang w:val="en-US"/>
+        </w:rPr>
+        <w:t>signalling</w:t>
+      </w:r>
+      <w:proofErr w:type="spellEnd"/>
+      <w:r>
+        <w:rPr>
+          <w:lang w:val="en-US"/>
+        </w:rPr>
+        <w:t xml:space="preserve"> pathways.”, instead. If the user selects “Only Proteins Not in Common” from the “Subsets of Proteins” drop-down menu, then display only Protein Name entries that are not common across </w:t>
       </w:r>
       <w:r>
         <w:rPr>
@@ -1668,19 +2402,75 @@
         <w:rPr>
           <w:lang w:val="en-US"/>
         </w:rPr>
-        <w:t>the tables corresponding to the selected signalling pathway option</w:t>
-      </w:r>
-      <w:r>
-        <w:rPr>
-          <w:lang w:val="en-US"/>
-        </w:rPr>
-        <w:t xml:space="preserve">s in the “Signalling Pathway (from Reactome)” drop-down menu. In all of the cases, for each Protein Name entry finally chosen for display in the “Proteins” display panel, show a radio button immediately to its left, for selecting this option, and a button immediately to its right, bearing the label “URL”. The radio buttons ought to allow for multiple selections. Each “URL” button displayed to the right of a Protein Name entry displayed in the “Proteins” display panel, once clicked, ought to lead to the corresponding URL to the </w:t>
-      </w:r>
-      <w:r>
-        <w:rPr>
-          <w:lang w:val="en-US"/>
-        </w:rPr>
-        <w:t xml:space="preserve">Protein Name entry it belongs to, in the URLs table, by opening the URL in another tab of the internet browser. For each Protein Name entry whose corresponding radio button is selected in the “Proteins” display panel, the set of data in the table corresponding to the Protein Name entry, matched by searching for the table named in the format Protein Name_diffr_expr_cancer in the database, is displayed in the “Differential Gene Expression with Biological Fold Change” display panel, after keeping a single set of column headers at the top and only leaving the contents (without the column headers) in the display for all tables after the first one displayed at the top of the panel. If a Protein Name entry is deselected (via its radio button) in the </w:t>
+        <w:t xml:space="preserve">the tables corresponding to the selected </w:t>
+      </w:r>
+      <w:proofErr w:type="spellStart"/>
+      <w:r>
+        <w:rPr>
+          <w:lang w:val="en-US"/>
+        </w:rPr>
+        <w:t>signalling</w:t>
+      </w:r>
+      <w:proofErr w:type="spellEnd"/>
+      <w:r>
+        <w:rPr>
+          <w:lang w:val="en-US"/>
+        </w:rPr>
+        <w:t xml:space="preserve"> pathway option</w:t>
+      </w:r>
+      <w:r>
+        <w:rPr>
+          <w:lang w:val="en-US"/>
+        </w:rPr>
+        <w:t>s in the “</w:t>
+      </w:r>
+      <w:proofErr w:type="spellStart"/>
+      <w:r>
+        <w:rPr>
+          <w:lang w:val="en-US"/>
+        </w:rPr>
+        <w:t>Signalling</w:t>
+      </w:r>
+      <w:proofErr w:type="spellEnd"/>
+      <w:r>
+        <w:rPr>
+          <w:lang w:val="en-US"/>
+        </w:rPr>
+        <w:t xml:space="preserve"> Pathway (from </w:t>
+      </w:r>
+      <w:proofErr w:type="spellStart"/>
+      <w:r>
+        <w:rPr>
+          <w:lang w:val="en-US"/>
+        </w:rPr>
+        <w:t>Reactome</w:t>
+      </w:r>
+      <w:proofErr w:type="spellEnd"/>
+      <w:r>
+        <w:rPr>
+          <w:lang w:val="en-US"/>
+        </w:rPr>
+        <w:t xml:space="preserve">)” drop-down menu. In all of the cases, for each Protein Name entry finally chosen for display in the “Proteins” display panel, show a radio button immediately to its left, for selecting this option, and a button immediately to its right, bearing the label “URL”. The radio buttons ought to allow for multiple selections. Each “URL” button displayed to the right of a Protein Name entry displayed in the “Proteins” display panel, once clicked, ought to lead to the corresponding URL to the </w:t>
+      </w:r>
+      <w:r>
+        <w:rPr>
+          <w:lang w:val="en-US"/>
+        </w:rPr>
+        <w:t xml:space="preserve">Protein Name entry it belongs to, in the URLs table, by opening the URL in another tab of the internet browser. For each Protein Name entry whose corresponding radio button is selected in the “Proteins” display panel, the set of data in the table corresponding to the Protein Name entry, matched by searching for the table named in the format Protein </w:t>
+      </w:r>
+      <w:proofErr w:type="spellStart"/>
+      <w:r>
+        <w:rPr>
+          <w:lang w:val="en-US"/>
+        </w:rPr>
+        <w:t>Name_diffr_expr_cancer</w:t>
+      </w:r>
+      <w:proofErr w:type="spellEnd"/>
+      <w:r>
+        <w:rPr>
+          <w:lang w:val="en-US"/>
+        </w:rPr>
+        <w:t xml:space="preserve"> in the database, is displayed in the “Differential Gene Expression with Biological Fold Change” display panel, after keeping a single set of column headers at the top and only leaving the contents (without the column headers) in the display for all tables after the first one displayed at the top of the panel. If a Protein Name entry is deselected (via its radio button) in the </w:t>
       </w:r>
       <w:r>
         <w:rPr>
@@ -1707,7 +2497,35 @@
         <w:rPr>
           <w:lang w:val="en-US"/>
         </w:rPr>
-        <w:t>Add a button just above the “Search” button and label it “Clear”. Upon clicking on it, all the displayed data should be removed from the “Differential Gene Expression with Biological Fold Change” and “Proteins” display panels, all the options in the “Signalling Pathway (from Reactome)” and “Subsets of Proteins” drop-down menus should be deselected, and then, the Protein/Gene Name search box should be emptied.</w:t>
+        <w:t>Add a button just above the “Search” button and label it “Clear”. Upon clicking on it, all the displayed data should be removed from the “Differential Gene Expression with Biological Fold Change” and “Proteins” display panels, all the options in the “</w:t>
+      </w:r>
+      <w:proofErr w:type="spellStart"/>
+      <w:r>
+        <w:rPr>
+          <w:lang w:val="en-US"/>
+        </w:rPr>
+        <w:t>Signalling</w:t>
+      </w:r>
+      <w:proofErr w:type="spellEnd"/>
+      <w:r>
+        <w:rPr>
+          <w:lang w:val="en-US"/>
+        </w:rPr>
+        <w:t xml:space="preserve"> Pathway (from </w:t>
+      </w:r>
+      <w:proofErr w:type="spellStart"/>
+      <w:r>
+        <w:rPr>
+          <w:lang w:val="en-US"/>
+        </w:rPr>
+        <w:t>Reactome</w:t>
+      </w:r>
+      <w:proofErr w:type="spellEnd"/>
+      <w:r>
+        <w:rPr>
+          <w:lang w:val="en-US"/>
+        </w:rPr>
+        <w:t>)” and “Subsets of Proteins” drop-down menus should be deselected, and then, the Protein/Gene Name search box should be emptied.</w:t>
       </w:r>
     </w:p>
     <w:p>
@@ -1796,7 +2614,77 @@
         <w:rPr>
           <w:lang w:val="en-US"/>
         </w:rPr>
-        <w:t>Furthermore, when I selected either the Wnt Signalling Pathway or the MTOR Signalling Pathway option of the Signalling Pathway (from Reactome) drop-down menu, and then selected each of the three options in the Subsets of Proteins drop-down menu, in turn, clicking on the Search button after each selection</w:t>
+        <w:t xml:space="preserve">Furthermore, when I selected either the </w:t>
+      </w:r>
+      <w:proofErr w:type="spellStart"/>
+      <w:r>
+        <w:rPr>
+          <w:lang w:val="en-US"/>
+        </w:rPr>
+        <w:t>Wnt</w:t>
+      </w:r>
+      <w:proofErr w:type="spellEnd"/>
+      <w:r>
+        <w:rPr>
+          <w:lang w:val="en-US"/>
+        </w:rPr>
+        <w:t xml:space="preserve"> </w:t>
+      </w:r>
+      <w:proofErr w:type="spellStart"/>
+      <w:r>
+        <w:rPr>
+          <w:lang w:val="en-US"/>
+        </w:rPr>
+        <w:t>Signalling</w:t>
+      </w:r>
+      <w:proofErr w:type="spellEnd"/>
+      <w:r>
+        <w:rPr>
+          <w:lang w:val="en-US"/>
+        </w:rPr>
+        <w:t xml:space="preserve"> Pathway or the MTOR </w:t>
+      </w:r>
+      <w:proofErr w:type="spellStart"/>
+      <w:r>
+        <w:rPr>
+          <w:lang w:val="en-US"/>
+        </w:rPr>
+        <w:t>Signalling</w:t>
+      </w:r>
+      <w:proofErr w:type="spellEnd"/>
+      <w:r>
+        <w:rPr>
+          <w:lang w:val="en-US"/>
+        </w:rPr>
+        <w:t xml:space="preserve"> Pathway option of the </w:t>
+      </w:r>
+      <w:proofErr w:type="spellStart"/>
+      <w:r>
+        <w:rPr>
+          <w:lang w:val="en-US"/>
+        </w:rPr>
+        <w:t>Signalling</w:t>
+      </w:r>
+      <w:proofErr w:type="spellEnd"/>
+      <w:r>
+        <w:rPr>
+          <w:lang w:val="en-US"/>
+        </w:rPr>
+        <w:t xml:space="preserve"> Pathway (from </w:t>
+      </w:r>
+      <w:proofErr w:type="spellStart"/>
+      <w:r>
+        <w:rPr>
+          <w:lang w:val="en-US"/>
+        </w:rPr>
+        <w:t>Reactome</w:t>
+      </w:r>
+      <w:proofErr w:type="spellEnd"/>
+      <w:r>
+        <w:rPr>
+          <w:lang w:val="en-US"/>
+        </w:rPr>
+        <w:t>) drop-down menu, and then selected each of the three options in the Subsets of Proteins drop-down menu, in turn, clicking on the Search button after each selection</w:t>
       </w:r>
       <w:r>
         <w:rPr>
@@ -1848,7 +2736,63 @@
         <w:rPr>
           <w:lang w:val="en-US"/>
         </w:rPr>
-        <w:t xml:space="preserve">I want the searches performed from the search box and from the Signalling Pathway (from Reactome) drop-down menu to be mutually exclusive, so that entering a value in the search box resets the signalling pathway-related menu and display panels to their initial/default values (along with the corresponding variables used to store the values selected therein. I also want the selection of any option in the drop-down menus associated with the signalling pathway method of searching </w:t>
+        <w:t xml:space="preserve">I want the searches performed from the search box and from the </w:t>
+      </w:r>
+      <w:proofErr w:type="spellStart"/>
+      <w:r>
+        <w:rPr>
+          <w:lang w:val="en-US"/>
+        </w:rPr>
+        <w:t>Signalling</w:t>
+      </w:r>
+      <w:proofErr w:type="spellEnd"/>
+      <w:r>
+        <w:rPr>
+          <w:lang w:val="en-US"/>
+        </w:rPr>
+        <w:t xml:space="preserve"> Pathway (from </w:t>
+      </w:r>
+      <w:proofErr w:type="spellStart"/>
+      <w:r>
+        <w:rPr>
+          <w:lang w:val="en-US"/>
+        </w:rPr>
+        <w:t>Reactome</w:t>
+      </w:r>
+      <w:proofErr w:type="spellEnd"/>
+      <w:r>
+        <w:rPr>
+          <w:lang w:val="en-US"/>
+        </w:rPr>
+        <w:t xml:space="preserve">) drop-down menu to be mutually exclusive, so that entering a value in the search box resets the </w:t>
+      </w:r>
+      <w:proofErr w:type="spellStart"/>
+      <w:r>
+        <w:rPr>
+          <w:lang w:val="en-US"/>
+        </w:rPr>
+        <w:t>signalling</w:t>
+      </w:r>
+      <w:proofErr w:type="spellEnd"/>
+      <w:r>
+        <w:rPr>
+          <w:lang w:val="en-US"/>
+        </w:rPr>
+        <w:t xml:space="preserve"> pathway-related menu and display panels to their initial/default values (along with the corresponding variables used to store the values selected therein. I also want the selection of any option in the drop-down menus associated with the </w:t>
+      </w:r>
+      <w:proofErr w:type="spellStart"/>
+      <w:r>
+        <w:rPr>
+          <w:lang w:val="en-US"/>
+        </w:rPr>
+        <w:t>signalling</w:t>
+      </w:r>
+      <w:proofErr w:type="spellEnd"/>
+      <w:r>
+        <w:rPr>
+          <w:lang w:val="en-US"/>
+        </w:rPr>
+        <w:t xml:space="preserve"> pathway method of searching </w:t>
       </w:r>
       <w:r>
         <w:rPr>
@@ -1874,7 +2818,49 @@
         <w:rPr>
           <w:lang w:val="en-US"/>
         </w:rPr>
-        <w:t>When using the signalling pathway method of searching, I want the selection of any option in the Subsets of Proteins drop-down menu to clear the Proteins and Differential Gene Expression with Biological Fold Change display panels, and to set their associated variables back to their initial/default values, except for those directly storing the data from the selection made using the Signalling Pathway (from Reactome) drop-down menu.</w:t>
+        <w:t xml:space="preserve">When using the </w:t>
+      </w:r>
+      <w:proofErr w:type="spellStart"/>
+      <w:r>
+        <w:rPr>
+          <w:lang w:val="en-US"/>
+        </w:rPr>
+        <w:t>signalling</w:t>
+      </w:r>
+      <w:proofErr w:type="spellEnd"/>
+      <w:r>
+        <w:rPr>
+          <w:lang w:val="en-US"/>
+        </w:rPr>
+        <w:t xml:space="preserve"> pathway method of searching, I want the selection of any option in the Subsets of Proteins drop-down menu to clear the Proteins and Differential Gene Expression with Biological Fold Change display panels, and to set their associated variables back to their initial/default values, except for those directly storing the data from the selection made using the </w:t>
+      </w:r>
+      <w:proofErr w:type="spellStart"/>
+      <w:r>
+        <w:rPr>
+          <w:lang w:val="en-US"/>
+        </w:rPr>
+        <w:t>Signalling</w:t>
+      </w:r>
+      <w:proofErr w:type="spellEnd"/>
+      <w:r>
+        <w:rPr>
+          <w:lang w:val="en-US"/>
+        </w:rPr>
+        <w:t xml:space="preserve"> Pathway (from </w:t>
+      </w:r>
+      <w:proofErr w:type="spellStart"/>
+      <w:r>
+        <w:rPr>
+          <w:lang w:val="en-US"/>
+        </w:rPr>
+        <w:t>Reactome</w:t>
+      </w:r>
+      <w:proofErr w:type="spellEnd"/>
+      <w:r>
+        <w:rPr>
+          <w:lang w:val="en-US"/>
+        </w:rPr>
+        <w:t>) drop-down menu.</w:t>
       </w:r>
     </w:p>
     <w:p>
@@ -1937,7 +2923,77 @@
         <w:rPr>
           <w:lang w:val="en-US"/>
         </w:rPr>
-        <w:t xml:space="preserve">Currently, the Protein Name entries displayed in the Proteins display panel have clickable/enabled check boxes, irrespective of whether each of the Protein Names displayed has a corresponding Protein Name_diffr_expr_cancer table for it in the database or not. I want the choice of Protein Name entries to be displayed in the Proteins display box to be made based on the sets of Protein Names in the Signalling Pathway Name_signalling_proteins format named tables and the inclusion/exclusion logic based on common Protein Names or unique Protein Names in these tables, displayed in the Proteins display panel to be deselected and greyed/disabled if the corresponding Protein Name has no table in the database named in the format Protein Name_diffr_expr_cancer. Moreover, if the user attempts to click on such a disabled check box in the Proteins display panel, I want a dismissable message box bearing the message “There is no differential gene expression data in the EMBL-EBI </w:t>
+        <w:t xml:space="preserve">Currently, the Protein Name entries displayed in the Proteins display panel have clickable/enabled check boxes, irrespective of whether each of the Protein Names displayed has a corresponding Protein </w:t>
+      </w:r>
+      <w:proofErr w:type="spellStart"/>
+      <w:r>
+        <w:rPr>
+          <w:lang w:val="en-US"/>
+        </w:rPr>
+        <w:t>Name_diffr_expr_cancer</w:t>
+      </w:r>
+      <w:proofErr w:type="spellEnd"/>
+      <w:r>
+        <w:rPr>
+          <w:lang w:val="en-US"/>
+        </w:rPr>
+        <w:t xml:space="preserve"> table for it in the database or not. I want the choice of Protein Name entries to be displayed in the Proteins display box to be made based on the sets of Protein Names in the </w:t>
+      </w:r>
+      <w:proofErr w:type="spellStart"/>
+      <w:r>
+        <w:rPr>
+          <w:lang w:val="en-US"/>
+        </w:rPr>
+        <w:t>Signalling</w:t>
+      </w:r>
+      <w:proofErr w:type="spellEnd"/>
+      <w:r>
+        <w:rPr>
+          <w:lang w:val="en-US"/>
+        </w:rPr>
+        <w:t xml:space="preserve"> Pathway </w:t>
+      </w:r>
+      <w:proofErr w:type="spellStart"/>
+      <w:r>
+        <w:rPr>
+          <w:lang w:val="en-US"/>
+        </w:rPr>
+        <w:t>Name_signalling_proteins</w:t>
+      </w:r>
+      <w:proofErr w:type="spellEnd"/>
+      <w:r>
+        <w:rPr>
+          <w:lang w:val="en-US"/>
+        </w:rPr>
+        <w:t xml:space="preserve"> format named tables and the inclusion/exclusion logic based on common Protein Names or unique Protein Names in these tables, displayed in the Proteins display panel to be deselected and greyed/disabled if the corresponding Protein Name has no table in the database named in the format Protein </w:t>
+      </w:r>
+      <w:proofErr w:type="spellStart"/>
+      <w:r>
+        <w:rPr>
+          <w:lang w:val="en-US"/>
+        </w:rPr>
+        <w:t>Name_diffr_expr_cancer</w:t>
+      </w:r>
+      <w:proofErr w:type="spellEnd"/>
+      <w:r>
+        <w:rPr>
+          <w:lang w:val="en-US"/>
+        </w:rPr>
+        <w:t xml:space="preserve">. Moreover, if the user attempts to click on such a disabled check box in the Proteins display panel, I want a </w:t>
+      </w:r>
+      <w:proofErr w:type="spellStart"/>
+      <w:r>
+        <w:rPr>
+          <w:lang w:val="en-US"/>
+        </w:rPr>
+        <w:t>dismissable</w:t>
+      </w:r>
+      <w:proofErr w:type="spellEnd"/>
+      <w:r>
+        <w:rPr>
+          <w:lang w:val="en-US"/>
+        </w:rPr>
+        <w:t xml:space="preserve"> message box bearing the message “There is no differential gene expression data in the EMBL-EBI </w:t>
       </w:r>
       <w:r>
         <w:rPr>
@@ -1955,7 +3011,21 @@
         <w:rPr>
           <w:lang w:val="en-US"/>
         </w:rPr>
-        <w:t xml:space="preserve"> The URL buttons remain functional, irrespective of whether the associated Protein Name has an associated Protein Name_diffr_expr_cancer format-named table in the database or not.</w:t>
+        <w:t xml:space="preserve"> The URL buttons remain functional, irrespective of whether the associated Protein Name has an associated Protein </w:t>
+      </w:r>
+      <w:proofErr w:type="spellStart"/>
+      <w:r>
+        <w:rPr>
+          <w:lang w:val="en-US"/>
+        </w:rPr>
+        <w:t>Name_diffr_expr_cancer</w:t>
+      </w:r>
+      <w:proofErr w:type="spellEnd"/>
+      <w:r>
+        <w:rPr>
+          <w:lang w:val="en-US"/>
+        </w:rPr>
+        <w:t xml:space="preserve"> format-named table in the database or not.</w:t>
       </w:r>
     </w:p>
     <w:p>
@@ -2101,7 +3171,63 @@
           <w:lang w:val="en-US"/>
         </w:rPr>
         <w:lastRenderedPageBreak/>
-        <w:t>Please adjust the positions of the search box and the drop down menus and Search and Clear buttons, along with those of their respective labels, to accommodate the word “OR” in Calibri Body font, font size 25, in bold, placed between the search box and the “Signalling Pathway (from Reactome)” drop down menu, and also slightly above them. Right beside this word “OR”, place a circular “i” button which should display the message “Either enter a single Protein/Gene Name in the search box or select an entire set of proteins associated with a signalling pathway or more than one such set by selecting one or more Signalling Pathway options from the menu immediately to the right.” in a tooltip box that appears as long as the user hovers the mouse cursor over this “i” button.</w:t>
+        <w:t>Please adjust the positions of the search box and the drop down menus and Search and Clear buttons, along with those of their respective labels, to accommodate the word “OR” in Calibri Body font, font size 25, in bold, placed between the search box and the “</w:t>
+      </w:r>
+      <w:proofErr w:type="spellStart"/>
+      <w:r>
+        <w:rPr>
+          <w:lang w:val="en-US"/>
+        </w:rPr>
+        <w:t>Signalling</w:t>
+      </w:r>
+      <w:proofErr w:type="spellEnd"/>
+      <w:r>
+        <w:rPr>
+          <w:lang w:val="en-US"/>
+        </w:rPr>
+        <w:t xml:space="preserve"> Pathway (from </w:t>
+      </w:r>
+      <w:proofErr w:type="spellStart"/>
+      <w:r>
+        <w:rPr>
+          <w:lang w:val="en-US"/>
+        </w:rPr>
+        <w:t>Reactome</w:t>
+      </w:r>
+      <w:proofErr w:type="spellEnd"/>
+      <w:r>
+        <w:rPr>
+          <w:lang w:val="en-US"/>
+        </w:rPr>
+        <w:t xml:space="preserve">)” drop down menu, and also slightly above them. Right beside this word “OR”, place a circular “i” button which should display the message “Either enter a single Protein/Gene Name in the search box or select an entire set of proteins associated with a </w:t>
+      </w:r>
+      <w:proofErr w:type="spellStart"/>
+      <w:r>
+        <w:rPr>
+          <w:lang w:val="en-US"/>
+        </w:rPr>
+        <w:t>signalling</w:t>
+      </w:r>
+      <w:proofErr w:type="spellEnd"/>
+      <w:r>
+        <w:rPr>
+          <w:lang w:val="en-US"/>
+        </w:rPr>
+        <w:t xml:space="preserve"> pathway or more than one such set by selecting one or more </w:t>
+      </w:r>
+      <w:proofErr w:type="spellStart"/>
+      <w:r>
+        <w:rPr>
+          <w:lang w:val="en-US"/>
+        </w:rPr>
+        <w:t>Signalling</w:t>
+      </w:r>
+      <w:proofErr w:type="spellEnd"/>
+      <w:r>
+        <w:rPr>
+          <w:lang w:val="en-US"/>
+        </w:rPr>
+        <w:t xml:space="preserve"> Pathway options from the menu immediately to the right.” in a tooltip box that appears as long as the user hovers the mouse cursor over this “i” button.</w:t>
       </w:r>
     </w:p>
     <w:p>
@@ -2212,26 +3338,124 @@
         <w:rPr>
           <w:lang w:val="en-US"/>
         </w:rPr>
-        <w:t>Please update the website, the website files of which are in this current folder (Database_Demo), to include the gene name beside the displayed Protein Name in the “Proteins” display panel, as and when it has Protein Names displayed in it. The Protein Name and Gene Name are to be displayed in the format Protein Name/Gene Name in the “Proteins” display panel, whenever it displays Protein Name entries. Moreover, it must only do so when the user enters a Gene Name in the search box, wherein the Gene Name is different from the corresponding Protein name in the same row in the table named with the naming format Signalling Pathway Name_signalling_proteins in which the user-supplied Gene Name is first detected, via exact matching.</w:t>
-      </w:r>
-    </w:p>
-    <w:p>
-      <w:pPr>
-        <w:rPr>
-          <w:lang w:val="en-US"/>
-        </w:rPr>
-      </w:pPr>
-      <w:r>
-        <w:rPr>
-          <w:lang w:val="en-US"/>
-        </w:rPr>
-        <w:t>Update all the CSV files in the subfolders, wherein the CSV files are named in the format Protein Name_diffr_expr_cancer, to include an additional column inserted just to the right of the Protein Name column</w:t>
-      </w:r>
-      <w:r>
-        <w:rPr>
-          <w:lang w:val="en-US"/>
-        </w:rPr>
-        <w:t>. The title of this inserted column should be “Gene Name(s)” and each row in this column should be populated by the contents of the corresponding cell matching the column title “Gene Name” and the same row as that containing the corresponding Protein Name, in any of the tables named with the naming format Signalling Pathway Name_signalling_proteins (e.g.: Wnt_signalling_proteins). If the contents of the cell that was filled thus, in the CSV file currently being processed, for every such Protein Name_diffr_expr_cancer.csv naming format CSV file processed, edit it to make sure that there is only a single space between consecutive Gene Names and there are no leading or trailing spaces, in the cases of cells containing more than one Gene Name.</w:t>
+        <w:t>Please update the website, the website files of which are in this current folder (</w:t>
+      </w:r>
+      <w:proofErr w:type="spellStart"/>
+      <w:r>
+        <w:rPr>
+          <w:lang w:val="en-US"/>
+        </w:rPr>
+        <w:t>Database_Demo</w:t>
+      </w:r>
+      <w:proofErr w:type="spellEnd"/>
+      <w:r>
+        <w:rPr>
+          <w:lang w:val="en-US"/>
+        </w:rPr>
+        <w:t xml:space="preserve">), to include the gene name beside the displayed Protein Name in the “Proteins” display panel, as and when it has Protein Names displayed in it. The Protein Name and Gene Name are to be displayed in the format Protein Name/Gene Name in the “Proteins” display panel, whenever it displays Protein Name entries. Moreover, it must only do so when the user enters a Gene Name in the search box, wherein the Gene Name is different from the corresponding Protein name in the same row in the table named with the naming format </w:t>
+      </w:r>
+      <w:proofErr w:type="spellStart"/>
+      <w:r>
+        <w:rPr>
+          <w:lang w:val="en-US"/>
+        </w:rPr>
+        <w:t>Signalling</w:t>
+      </w:r>
+      <w:proofErr w:type="spellEnd"/>
+      <w:r>
+        <w:rPr>
+          <w:lang w:val="en-US"/>
+        </w:rPr>
+        <w:t xml:space="preserve"> Pathway </w:t>
+      </w:r>
+      <w:proofErr w:type="spellStart"/>
+      <w:r>
+        <w:rPr>
+          <w:lang w:val="en-US"/>
+        </w:rPr>
+        <w:t>Name_signalling_proteins</w:t>
+      </w:r>
+      <w:proofErr w:type="spellEnd"/>
+      <w:r>
+        <w:rPr>
+          <w:lang w:val="en-US"/>
+        </w:rPr>
+        <w:t xml:space="preserve"> in which the user-supplied Gene Name is first detected, via exact matching.</w:t>
+      </w:r>
+    </w:p>
+    <w:p>
+      <w:pPr>
+        <w:rPr>
+          <w:lang w:val="en-US"/>
+        </w:rPr>
+      </w:pPr>
+      <w:r>
+        <w:rPr>
+          <w:lang w:val="en-US"/>
+        </w:rPr>
+        <w:t xml:space="preserve">Update all the CSV files in the subfolders, wherein the CSV files are named in the format Protein </w:t>
+      </w:r>
+      <w:proofErr w:type="spellStart"/>
+      <w:r>
+        <w:rPr>
+          <w:lang w:val="en-US"/>
+        </w:rPr>
+        <w:t>Name_diffr_expr_cancer</w:t>
+      </w:r>
+      <w:proofErr w:type="spellEnd"/>
+      <w:r>
+        <w:rPr>
+          <w:lang w:val="en-US"/>
+        </w:rPr>
+        <w:t>, to include an additional column inserted just to the right of the Protein Name column</w:t>
+      </w:r>
+      <w:r>
+        <w:rPr>
+          <w:lang w:val="en-US"/>
+        </w:rPr>
+        <w:t xml:space="preserve">. The title of this inserted column should be “Gene Name(s)” and each row in this column should be populated by the contents of the corresponding cell matching the column title “Gene Name” and the same row as that containing the corresponding Protein Name, in any of the tables named with the naming format </w:t>
+      </w:r>
+      <w:proofErr w:type="spellStart"/>
+      <w:r>
+        <w:rPr>
+          <w:lang w:val="en-US"/>
+        </w:rPr>
+        <w:t>Signalling</w:t>
+      </w:r>
+      <w:proofErr w:type="spellEnd"/>
+      <w:r>
+        <w:rPr>
+          <w:lang w:val="en-US"/>
+        </w:rPr>
+        <w:t xml:space="preserve"> Pathway </w:t>
+      </w:r>
+      <w:proofErr w:type="spellStart"/>
+      <w:r>
+        <w:rPr>
+          <w:lang w:val="en-US"/>
+        </w:rPr>
+        <w:t>Name_signalling_proteins</w:t>
+      </w:r>
+      <w:proofErr w:type="spellEnd"/>
+      <w:r>
+        <w:rPr>
+          <w:lang w:val="en-US"/>
+        </w:rPr>
+        <w:t xml:space="preserve"> (e.g.: </w:t>
+      </w:r>
+      <w:proofErr w:type="spellStart"/>
+      <w:r>
+        <w:rPr>
+          <w:lang w:val="en-US"/>
+        </w:rPr>
+        <w:t>Wnt_signalling_proteins</w:t>
+      </w:r>
+      <w:proofErr w:type="spellEnd"/>
+      <w:r>
+        <w:rPr>
+          <w:lang w:val="en-US"/>
+        </w:rPr>
+        <w:t>). If the contents of the cell that was filled thus, in the CSV file currently being processed, for every such Protein Name_diffr_expr_cancer.csv naming format CSV file processed, edit it to make sure that there is only a single space between consecutive Gene Names and there are no leading or trailing spaces, in the cases of cells containing more than one Gene Name.</w:t>
       </w:r>
     </w:p>
     <w:p>
@@ -2374,7 +3598,21 @@
         <w:rPr>
           <w:lang w:val="en-US"/>
         </w:rPr>
-        <w:t xml:space="preserve"> you will also find a CSV file called articles_metadata.csv, which contains the titles of these articles, the journal, the year, and the name of the PDF file, if present in the record. In cases in which the PDF_Filename column contains a PDF file name (e.g.: </w:t>
+        <w:t xml:space="preserve"> you will also find a CSV file called articles_metadata.csv, which contains the titles of these articles, the journal, the year, and the name of the PDF file, if present in the record. In cases in which the </w:t>
+      </w:r>
+      <w:proofErr w:type="spellStart"/>
+      <w:r>
+        <w:rPr>
+          <w:lang w:val="en-US"/>
+        </w:rPr>
+        <w:t>PDF_Filename</w:t>
+      </w:r>
+      <w:proofErr w:type="spellEnd"/>
+      <w:r>
+        <w:rPr>
+          <w:lang w:val="en-US"/>
+        </w:rPr>
+        <w:t xml:space="preserve"> column contains a PDF file name (e.g.: </w:t>
       </w:r>
       <w:r>
         <w:rPr>
@@ -2396,7 +3634,21 @@
         <w:rPr>
           <w:lang w:val="en-US"/>
         </w:rPr>
-        <w:t>, rename the corresponding PDF file in the Articles_Differential_Expression folder to conform to the file name format Title_Authors_Journal_Year.pdf, by sourcing the components of this name directly from the correspondingly named column in the CSV file, at the appropriate row number. Before incorporating the author names from the “Authors” column directly, extract the individual names, wherein consecutive authors’ names are separated by “; ” or by a “;” immediately followed by an unspecified number of spaces. Then, string the author names together in the original sequence in which they were listed in the entry, separating consecutive authors’ names with an underscore (_) in between them (e.g.: “</w:t>
+        <w:t>, rename the corresponding PDF file in the Articles_Differential_Expression folder to conform to the file name format Title_Authors_Journal_Year.pdf, by sourcing the components of this name directly from the correspondingly named column in the CSV file, at the appropriate row number. Before incorporating the author names from the “Authors” column directly, extract the individual names, wherein consecutive authors’ names are separated by “</w:t>
+      </w:r>
+      <w:proofErr w:type="gramStart"/>
+      <w:r>
+        <w:rPr>
+          <w:lang w:val="en-US"/>
+        </w:rPr>
+        <w:t>; ”</w:t>
+      </w:r>
+      <w:proofErr w:type="gramEnd"/>
+      <w:r>
+        <w:rPr>
+          <w:lang w:val="en-US"/>
+        </w:rPr>
+        <w:t xml:space="preserve"> or by a “;” immediately followed by an unspecified number of spaces. Then, string the author names together in the original sequence in which they were listed in the entry, separating consecutive authors’ names with an underscore (_) in between them (e.g.: “</w:t>
       </w:r>
       <w:r>
         <w:rPr>
@@ -2422,7 +3674,18 @@
           <w:lang w:val="en-IN" w:eastAsia="en-IN"/>
           <w14:ligatures w14:val="none"/>
         </w:rPr>
-        <w:t>Abdul NS</w:t>
+        <w:t xml:space="preserve">Abdul </w:t>
+      </w:r>
+      <w:proofErr w:type="spellStart"/>
+      <w:r>
+        <w:rPr>
+          <w:rFonts w:ascii="Calibri" w:eastAsia="Times New Roman" w:hAnsi="Calibri" w:cs="Calibri"/>
+          <w:color w:val="000000"/>
+          <w:kern w:val="0"/>
+          <w:lang w:val="en-IN" w:eastAsia="en-IN"/>
+          <w14:ligatures w14:val="none"/>
+        </w:rPr>
+        <w:t>NS</w:t>
       </w:r>
       <w:r>
         <w:rPr>
@@ -2442,7 +3705,29 @@
           <w:lang w:val="en-IN" w:eastAsia="en-IN"/>
           <w14:ligatures w14:val="none"/>
         </w:rPr>
-        <w:t>Shenoy M</w:t>
+        <w:t>Shenoy</w:t>
+      </w:r>
+      <w:proofErr w:type="spellEnd"/>
+      <w:r>
+        <w:rPr>
+          <w:rFonts w:ascii="Calibri" w:eastAsia="Times New Roman" w:hAnsi="Calibri" w:cs="Calibri"/>
+          <w:color w:val="000000"/>
+          <w:kern w:val="0"/>
+          <w:lang w:val="en-IN" w:eastAsia="en-IN"/>
+          <w14:ligatures w14:val="none"/>
+        </w:rPr>
+        <w:t xml:space="preserve"> </w:t>
+      </w:r>
+      <w:proofErr w:type="spellStart"/>
+      <w:r>
+        <w:rPr>
+          <w:rFonts w:ascii="Calibri" w:eastAsia="Times New Roman" w:hAnsi="Calibri" w:cs="Calibri"/>
+          <w:color w:val="000000"/>
+          <w:kern w:val="0"/>
+          <w:lang w:val="en-IN" w:eastAsia="en-IN"/>
+          <w14:ligatures w14:val="none"/>
+        </w:rPr>
+        <w:t>M</w:t>
       </w:r>
       <w:r>
         <w:rPr>
@@ -2462,7 +3747,29 @@
           <w:lang w:val="en-IN" w:eastAsia="en-IN"/>
           <w14:ligatures w14:val="none"/>
         </w:rPr>
-        <w:t>Shivakumar GC</w:t>
+        <w:t>Shivakumar</w:t>
+      </w:r>
+      <w:proofErr w:type="spellEnd"/>
+      <w:r>
+        <w:rPr>
+          <w:rFonts w:ascii="Calibri" w:eastAsia="Times New Roman" w:hAnsi="Calibri" w:cs="Calibri"/>
+          <w:color w:val="000000"/>
+          <w:kern w:val="0"/>
+          <w:lang w:val="en-IN" w:eastAsia="en-IN"/>
+          <w14:ligatures w14:val="none"/>
+        </w:rPr>
+        <w:t xml:space="preserve"> </w:t>
+      </w:r>
+      <w:proofErr w:type="spellStart"/>
+      <w:r>
+        <w:rPr>
+          <w:rFonts w:ascii="Calibri" w:eastAsia="Times New Roman" w:hAnsi="Calibri" w:cs="Calibri"/>
+          <w:color w:val="000000"/>
+          <w:kern w:val="0"/>
+          <w:lang w:val="en-IN" w:eastAsia="en-IN"/>
+          <w14:ligatures w14:val="none"/>
+        </w:rPr>
+        <w:t>GC</w:t>
       </w:r>
       <w:r>
         <w:rPr>
@@ -2482,7 +3789,29 @@
           <w:lang w:val="en-IN" w:eastAsia="en-IN"/>
           <w14:ligatures w14:val="none"/>
         </w:rPr>
-        <w:t>Patel S</w:t>
+        <w:t>Patel</w:t>
+      </w:r>
+      <w:proofErr w:type="spellEnd"/>
+      <w:r>
+        <w:rPr>
+          <w:rFonts w:ascii="Calibri" w:eastAsia="Times New Roman" w:hAnsi="Calibri" w:cs="Calibri"/>
+          <w:color w:val="000000"/>
+          <w:kern w:val="0"/>
+          <w:lang w:val="en-IN" w:eastAsia="en-IN"/>
+          <w14:ligatures w14:val="none"/>
+        </w:rPr>
+        <w:t xml:space="preserve"> </w:t>
+      </w:r>
+      <w:proofErr w:type="spellStart"/>
+      <w:r>
+        <w:rPr>
+          <w:rFonts w:ascii="Calibri" w:eastAsia="Times New Roman" w:hAnsi="Calibri" w:cs="Calibri"/>
+          <w:color w:val="000000"/>
+          <w:kern w:val="0"/>
+          <w:lang w:val="en-IN" w:eastAsia="en-IN"/>
+          <w14:ligatures w14:val="none"/>
+        </w:rPr>
+        <w:t>S</w:t>
       </w:r>
       <w:r>
         <w:rPr>
@@ -2502,7 +3831,29 @@
           <w:lang w:val="en-IN" w:eastAsia="en-IN"/>
           <w14:ligatures w14:val="none"/>
         </w:rPr>
-        <w:t>Jyoti B</w:t>
+        <w:t>Jyoti</w:t>
+      </w:r>
+      <w:proofErr w:type="spellEnd"/>
+      <w:r>
+        <w:rPr>
+          <w:rFonts w:ascii="Calibri" w:eastAsia="Times New Roman" w:hAnsi="Calibri" w:cs="Calibri"/>
+          <w:color w:val="000000"/>
+          <w:kern w:val="0"/>
+          <w:lang w:val="en-IN" w:eastAsia="en-IN"/>
+          <w14:ligatures w14:val="none"/>
+        </w:rPr>
+        <w:t xml:space="preserve"> </w:t>
+      </w:r>
+      <w:proofErr w:type="spellStart"/>
+      <w:r>
+        <w:rPr>
+          <w:rFonts w:ascii="Calibri" w:eastAsia="Times New Roman" w:hAnsi="Calibri" w:cs="Calibri"/>
+          <w:color w:val="000000"/>
+          <w:kern w:val="0"/>
+          <w:lang w:val="en-IN" w:eastAsia="en-IN"/>
+          <w14:ligatures w14:val="none"/>
+        </w:rPr>
+        <w:t>B</w:t>
       </w:r>
       <w:r>
         <w:rPr>
@@ -2522,7 +3873,18 @@
           <w:lang w:val="en-IN" w:eastAsia="en-IN"/>
           <w14:ligatures w14:val="none"/>
         </w:rPr>
-        <w:t>Shivakumar S</w:t>
+        <w:t>Shivakumar</w:t>
+      </w:r>
+      <w:proofErr w:type="spellEnd"/>
+      <w:r>
+        <w:rPr>
+          <w:rFonts w:ascii="Calibri" w:eastAsia="Times New Roman" w:hAnsi="Calibri" w:cs="Calibri"/>
+          <w:color w:val="000000"/>
+          <w:kern w:val="0"/>
+          <w:lang w:val="en-IN" w:eastAsia="en-IN"/>
+          <w14:ligatures w14:val="none"/>
+        </w:rPr>
+        <w:t xml:space="preserve"> S</w:t>
       </w:r>
       <w:r>
         <w:rPr>
@@ -2693,7 +4055,21 @@
         <w:rPr>
           <w:lang w:val="en-US"/>
         </w:rPr>
-        <w:t>Attempts to open the PDF files in Adobe are met with error messages of the format “Adobe Acrobat Reader could not open ‘PDF_File_Name’ because it is either not a supported file type or because the file has been damaged (for example, it was sent as an email attachment and wasn’t correctly decoded).” Please analyse why this could have happened and try to repair the files or re-attempt their downloading, this time ensuring that the files are openable in Adobe Acrobat Reader and are human-readable.</w:t>
+        <w:t>Attempts to open the PDF files in Adobe are met with error messages of the format “Adobe Acrobat Reader could not open ‘</w:t>
+      </w:r>
+      <w:proofErr w:type="spellStart"/>
+      <w:r>
+        <w:rPr>
+          <w:lang w:val="en-US"/>
+        </w:rPr>
+        <w:t>PDF_File_Name</w:t>
+      </w:r>
+      <w:proofErr w:type="spellEnd"/>
+      <w:r>
+        <w:rPr>
+          <w:lang w:val="en-US"/>
+        </w:rPr>
+        <w:t>’ because it is either not a supported file type or because the file has been damaged (for example, it was sent as an email attachment and wasn’t correctly decoded).” Please analyse why this could have happened and try to repair the files or re-attempt their downloading, this time ensuring that the files are openable in Adobe Acrobat Reader and are human-readable.</w:t>
       </w:r>
     </w:p>
     <w:p>
@@ -2774,7 +4150,91 @@
         <w:rPr>
           <w:lang w:val="en-US"/>
         </w:rPr>
-        <w:t xml:space="preserve">This folder (Database_Demo) has a sub-folder called Differential_Expression_Data_From_Literature, which contains two sub-folders called Differential_Gene_Expression_Data and Differential_Protein_Expression_Data. Each of these sub-folders contains two CSV files of the name-formats Differential_Gene or Protein_Expression_Data_From_Literature.csv and Differential_Gene or Protein_Expression_Data_From_Literature_Direct_Quote.csv. </w:t>
+        <w:t>This folder (</w:t>
+      </w:r>
+      <w:proofErr w:type="spellStart"/>
+      <w:r>
+        <w:rPr>
+          <w:lang w:val="en-US"/>
+        </w:rPr>
+        <w:t>Database_Demo</w:t>
+      </w:r>
+      <w:proofErr w:type="spellEnd"/>
+      <w:r>
+        <w:rPr>
+          <w:lang w:val="en-US"/>
+        </w:rPr>
+        <w:t xml:space="preserve">) has a sub-folder called </w:t>
+      </w:r>
+      <w:proofErr w:type="spellStart"/>
+      <w:r>
+        <w:rPr>
+          <w:lang w:val="en-US"/>
+        </w:rPr>
+        <w:t>Differential_Expression_Data_From_Literature</w:t>
+      </w:r>
+      <w:proofErr w:type="spellEnd"/>
+      <w:r>
+        <w:rPr>
+          <w:lang w:val="en-US"/>
+        </w:rPr>
+        <w:t xml:space="preserve">, which contains two sub-folders called </w:t>
+      </w:r>
+      <w:proofErr w:type="spellStart"/>
+      <w:r>
+        <w:rPr>
+          <w:lang w:val="en-US"/>
+        </w:rPr>
+        <w:t>Differential_Gene_Expression_Data</w:t>
+      </w:r>
+      <w:proofErr w:type="spellEnd"/>
+      <w:r>
+        <w:rPr>
+          <w:lang w:val="en-US"/>
+        </w:rPr>
+        <w:t xml:space="preserve"> and </w:t>
+      </w:r>
+      <w:proofErr w:type="spellStart"/>
+      <w:r>
+        <w:rPr>
+          <w:lang w:val="en-US"/>
+        </w:rPr>
+        <w:t>Differential_Protein_Expression_Data</w:t>
+      </w:r>
+      <w:proofErr w:type="spellEnd"/>
+      <w:r>
+        <w:rPr>
+          <w:lang w:val="en-US"/>
+        </w:rPr>
+        <w:t xml:space="preserve">. Each of these sub-folders contains two CSV files of the name-formats </w:t>
+      </w:r>
+      <w:proofErr w:type="spellStart"/>
+      <w:r>
+        <w:rPr>
+          <w:lang w:val="en-US"/>
+        </w:rPr>
+        <w:t>Differential_Gene</w:t>
+      </w:r>
+      <w:proofErr w:type="spellEnd"/>
+      <w:r>
+        <w:rPr>
+          <w:lang w:val="en-US"/>
+        </w:rPr>
+        <w:t xml:space="preserve"> or Protein_Expression_Data_From_Literature.csv and </w:t>
+      </w:r>
+      <w:proofErr w:type="spellStart"/>
+      <w:r>
+        <w:rPr>
+          <w:lang w:val="en-US"/>
+        </w:rPr>
+        <w:t>Differential_Gene</w:t>
+      </w:r>
+      <w:proofErr w:type="spellEnd"/>
+      <w:r>
+        <w:rPr>
+          <w:lang w:val="en-US"/>
+        </w:rPr>
+        <w:t xml:space="preserve"> or Protein_Expression_Data_From_Literature_Direct_Quote.csv. </w:t>
       </w:r>
       <w:r>
         <w:rPr>
@@ -2907,7 +4367,21 @@
         <w:rPr>
           <w:lang w:val="en-US"/>
         </w:rPr>
-        <w:t xml:space="preserve"> expression in a cancer vs normal or cancer vs paratumoral or test-condition for cancer vs control-condition for cancer context. Next, on these filtered results, apply another filter to identify those research papers in which the fold change or biological fold change is reported either in result tables in the papers or somewhere in the main text. Tabulate these fold changes (which may have been reported in their source research papers directly or as a logarithm of the fold change) in one column, followed by the type of fold change reported (direct,</w:t>
+        <w:t xml:space="preserve"> expression in a cancer vs normal or cancer vs </w:t>
+      </w:r>
+      <w:proofErr w:type="spellStart"/>
+      <w:r>
+        <w:rPr>
+          <w:lang w:val="en-US"/>
+        </w:rPr>
+        <w:t>paratumoral</w:t>
+      </w:r>
+      <w:proofErr w:type="spellEnd"/>
+      <w:r>
+        <w:rPr>
+          <w:lang w:val="en-US"/>
+        </w:rPr>
+        <w:t xml:space="preserve"> or test-condition for cancer vs control-condition for cancer context. Next, on these filtered results, apply another filter to identify those research papers in which the fold change or biological fold change is reported either in result tables in the papers or somewhere in the main text. Tabulate these fold changes (which may have been reported in their source research papers directly or as a logarithm of the fold change) in one column, followed by the type of fold change reported (direct,</w:t>
       </w:r>
       <w:r>
         <w:rPr>
@@ -2938,7 +4412,21 @@
         <w:rPr>
           <w:lang w:val="en-US"/>
         </w:rPr>
-        <w:t xml:space="preserve">, followed by the type of cancer for which the fold change was reported, followed by the category of comparison (e.g. tumor/cancer vs normal, tumor/cancer vs paratumoral, tumor/cancer with test condition (e.g.: drug being tested) vs tumor/cancer with control/vector control, etc...). </w:t>
+        <w:t xml:space="preserve">, followed by the type of cancer for which the fold change was reported, followed by the category of comparison (e.g. tumor/cancer vs normal, tumor/cancer vs </w:t>
+      </w:r>
+      <w:proofErr w:type="spellStart"/>
+      <w:r>
+        <w:rPr>
+          <w:lang w:val="en-US"/>
+        </w:rPr>
+        <w:t>paratumoral</w:t>
+      </w:r>
+      <w:proofErr w:type="spellEnd"/>
+      <w:r>
+        <w:rPr>
+          <w:lang w:val="en-US"/>
+        </w:rPr>
+        <w:t xml:space="preserve">, tumor/cancer with test condition (e.g.: drug being tested) vs tumor/cancer with control/vector control, etc...). </w:t>
       </w:r>
       <w:r>
         <w:rPr>
@@ -3201,7 +4689,49 @@
         <w:rPr>
           <w:lang w:val="en-US"/>
         </w:rPr>
-        <w:t>Adjust the code for the Cancer Genomics section to include a clickable button labelled “Load Differential Expression Data From Cancer Literature” above the Differential Gene Expression with Biological Fold Change display panel, just to the right of the label for this panel. Clicking on this button clears all the display panels and the search box, and deselects all the options in the drop-down menus. Then, it loads two options in the Proteins display panel- (1) Differential Gene Expression From Literature and (2) Differential Gene Expression From Literature</w:t>
+        <w:t xml:space="preserve">Adjust the code for the Cancer Genomics section to include a clickable button labelled “Load Differential Expression Data </w:t>
+      </w:r>
+      <w:proofErr w:type="gramStart"/>
+      <w:r>
+        <w:rPr>
+          <w:lang w:val="en-US"/>
+        </w:rPr>
+        <w:t>From</w:t>
+      </w:r>
+      <w:proofErr w:type="gramEnd"/>
+      <w:r>
+        <w:rPr>
+          <w:lang w:val="en-US"/>
+        </w:rPr>
+        <w:t xml:space="preserve"> Cancer Literature” above the Differential Gene Expression with Biological Fold Change display panel, just to the right of the label for this panel. Clicking on this button clears all the display panels and the search box, and deselects all the options in the drop-down menus. Then, it loads two options in the Proteins display panel- (1) Differential Gene Expression </w:t>
+      </w:r>
+      <w:proofErr w:type="gramStart"/>
+      <w:r>
+        <w:rPr>
+          <w:lang w:val="en-US"/>
+        </w:rPr>
+        <w:t>From</w:t>
+      </w:r>
+      <w:proofErr w:type="gramEnd"/>
+      <w:r>
+        <w:rPr>
+          <w:lang w:val="en-US"/>
+        </w:rPr>
+        <w:t xml:space="preserve"> Literature and (2) Differential Gene Expression </w:t>
+      </w:r>
+      <w:proofErr w:type="gramStart"/>
+      <w:r>
+        <w:rPr>
+          <w:lang w:val="en-US"/>
+        </w:rPr>
+        <w:t>From</w:t>
+      </w:r>
+      <w:proofErr w:type="gramEnd"/>
+      <w:r>
+        <w:rPr>
+          <w:lang w:val="en-US"/>
+        </w:rPr>
+        <w:t xml:space="preserve"> Literature</w:t>
       </w:r>
       <w:r>
         <w:rPr>
@@ -3374,7 +4904,35 @@
         <w:rPr>
           <w:lang w:val="en-US"/>
         </w:rPr>
-        <w:t xml:space="preserve">The Proteins panel in this section of the website has two options displayed in it- (1) Differential Protein Expression From Literature and (2) Differential Protein Expression From Literature- Directly Quoted Data. Each option has a check box to its left. Clicking on either option’s check box loads the corresponding data </w:t>
+        <w:t xml:space="preserve">The Proteins panel in this section of the website has two options displayed in it- (1) Differential Protein Expression </w:t>
+      </w:r>
+      <w:proofErr w:type="gramStart"/>
+      <w:r>
+        <w:rPr>
+          <w:lang w:val="en-US"/>
+        </w:rPr>
+        <w:t>From</w:t>
+      </w:r>
+      <w:proofErr w:type="gramEnd"/>
+      <w:r>
+        <w:rPr>
+          <w:lang w:val="en-US"/>
+        </w:rPr>
+        <w:t xml:space="preserve"> Literature and (2) Differential Protein Expression </w:t>
+      </w:r>
+      <w:proofErr w:type="gramStart"/>
+      <w:r>
+        <w:rPr>
+          <w:lang w:val="en-US"/>
+        </w:rPr>
+        <w:t>From</w:t>
+      </w:r>
+      <w:proofErr w:type="gramEnd"/>
+      <w:r>
+        <w:rPr>
+          <w:lang w:val="en-US"/>
+        </w:rPr>
+        <w:t xml:space="preserve"> Literature- Directly Quoted Data. Each option has a check box to its left. Clicking on either option’s check box loads the corresponding data </w:t>
       </w:r>
       <w:r>
         <w:rPr>
@@ -3418,7 +4976,35 @@
         <w:rPr>
           <w:lang w:val="en-US"/>
         </w:rPr>
-        <w:t>Please adjust the font sizes of the text displayed in the central Differential Gene/Protein Expression with Biological Fold Change panels, in the Cancer Genomics and Cancer Proteomics sections, drawn from the SQL database tables that derive their data from the CSV files of the name-formats Differential_Gene or Protein_Expression_Data_From_Literature.csv and Differential_Gene or Protein_Expression_Data_From_Literature_Direct_Quote.csv, so that the text of these tables displayed in the display panels can be comfortably read, no matter the screen size (laptop, mobile phone, etc…) used to display the website.</w:t>
+        <w:t xml:space="preserve">Please adjust the font sizes of the text displayed in the central Differential Gene/Protein Expression with Biological Fold Change panels, in the Cancer Genomics and Cancer Proteomics sections, drawn from the SQL database tables that derive their data from the CSV files of the name-formats </w:t>
+      </w:r>
+      <w:proofErr w:type="spellStart"/>
+      <w:r>
+        <w:rPr>
+          <w:lang w:val="en-US"/>
+        </w:rPr>
+        <w:t>Differential_Gene</w:t>
+      </w:r>
+      <w:proofErr w:type="spellEnd"/>
+      <w:r>
+        <w:rPr>
+          <w:lang w:val="en-US"/>
+        </w:rPr>
+        <w:t xml:space="preserve"> or Protein_Expression_Data_From_Literature.csv and </w:t>
+      </w:r>
+      <w:proofErr w:type="spellStart"/>
+      <w:r>
+        <w:rPr>
+          <w:lang w:val="en-US"/>
+        </w:rPr>
+        <w:t>Differential_Gene</w:t>
+      </w:r>
+      <w:proofErr w:type="spellEnd"/>
+      <w:r>
+        <w:rPr>
+          <w:lang w:val="en-US"/>
+        </w:rPr>
+        <w:t xml:space="preserve"> or Protein_Expression_Data_From_Literature_Direct_Quote.csv, so that the text of these tables displayed in the display panels can be comfortably read, no matter the screen size (laptop, mobile phone, etc…) used to display the website.</w:t>
       </w:r>
     </w:p>
     <w:p>
@@ -3458,145 +5044,413 @@
           <w:bCs/>
         </w:rPr>
       </w:pPr>
+      <w:proofErr w:type="spellStart"/>
       <w:r>
         <w:rPr>
           <w:b/>
           <w:bCs/>
         </w:rPr>
-        <w:t>Installment 20:</w:t>
-      </w:r>
-    </w:p>
-    <w:p>
-      <w:r>
-        <w:t>Please make all text messages displayed, either against the main white background of the website in all its sections or in pop-up messages, justified (text body justification, as opposed to left-aligned, right-aligned, or centre-aligned text bodies of each such body of text).</w:t>
-      </w:r>
-    </w:p>
-    <w:p/>
-    <w:p>
-      <w:pPr>
+        <w:t>Installment</w:t>
+      </w:r>
+      <w:proofErr w:type="spellEnd"/>
+      <w:r>
         <w:rPr>
           <w:b/>
           <w:bCs/>
         </w:rPr>
-      </w:pPr>
-      <w:r>
+        <w:t xml:space="preserve"> 20:</w:t>
+      </w:r>
+    </w:p>
+    <w:p>
+      <w:r>
+        <w:t>Please make all text messages displayed, either against the main white background of the website in all its sections or in pop-up messages, justified (text body justification, as opposed to left-aligned, right-aligned, or centre-aligned text bodies of each such body of text).</w:t>
+      </w:r>
+    </w:p>
+    <w:p/>
+    <w:p>
+      <w:pPr>
         <w:rPr>
           <w:b/>
           <w:bCs/>
         </w:rPr>
-        <w:t>Installment 21:</w:t>
-      </w:r>
-    </w:p>
-    <w:p/>
-    <w:p>
-      <w:pPr>
-        <w:rPr>
-          <w:rFonts w:ascii="Calibri" w:eastAsia="Times New Roman" w:hAnsi="Calibri" w:cs="Calibri"/>
-          <w:color w:val="000000"/>
-          <w:kern w:val="0"/>
-          <w:lang w:val="en-IN" w:eastAsia="en-IN"/>
-          <w14:ligatures w14:val="none"/>
-        </w:rPr>
-      </w:pPr>
-      <w:r>
-        <w:rPr>
-          <w:rFonts w:ascii="Calibri" w:eastAsia="Times New Roman" w:hAnsi="Calibri" w:cs="Calibri"/>
-          <w:color w:val="000000"/>
-          <w:kern w:val="0"/>
-          <w:lang w:val="en-IN" w:eastAsia="en-IN"/>
-          <w14:ligatures w14:val="none"/>
-        </w:rPr>
-        <w:t>In the sub-folder named Biomarker_Prospective_Study_Cancer, you will find PDFs. In the same sub-folder, you will also find a CSV file called articles_metadata.csv, which contains the titles of these articles, the journal, the year, and the name of the PDF file, if present in the record. In cases in which the PDF_Filename column contains a PDF file name (e.g.: PMID_41262295.pdf), rename the corresponding PDF file in the Biomarker_Prospective_Study_Cancer folder to conform to the file name format Title_Authors_Journal_Year.pdf, by sourcing the components of this name directly from the correspondingly named column in the CSV file, at the appropriate row number. Before incorporating the author names from the “Authors” column directly, extract the individual names, wherein consecutive authors’ names are separated by “; ” or by a “;” immediately followed by an unspecified number of spaces. Then, string the author names together in the original sequence in which they were listed in the entry, separating consecutive authors’ names with an underscore (_) in between them (e.g.: “Abdul NS; Shenoy M; Shivakumar GC; Patel S; Jyoti B; Shivakumar S” gets replaced by “Abdul NS_Shenoy M_Shivakumar GC_Patel S_Jyoti B_Shivakumar S” at the “Authors” section in the PDF file name format Title_Authors_Journal_Year.pdf)</w:t>
-      </w:r>
-    </w:p>
-    <w:p>
-      <w:pPr>
-        <w:rPr>
-          <w:rFonts w:ascii="Calibri" w:eastAsia="Times New Roman" w:hAnsi="Calibri" w:cs="Calibri"/>
-          <w:color w:val="000000"/>
-          <w:kern w:val="0"/>
-          <w:lang w:val="en-IN" w:eastAsia="en-IN"/>
-          <w14:ligatures w14:val="none"/>
-        </w:rPr>
-      </w:pPr>
-      <w:r>
-        <w:rPr>
-          <w:rFonts w:ascii="Calibri" w:eastAsia="Times New Roman" w:hAnsi="Calibri" w:cs="Calibri"/>
-          <w:color w:val="000000"/>
-          <w:kern w:val="0"/>
-          <w:lang w:val="en-IN" w:eastAsia="en-IN"/>
-          <w14:ligatures w14:val="none"/>
-        </w:rPr>
-        <w:lastRenderedPageBreak/>
-        <w:t>After this, create sub-folders within Biomarker_Prospective_Study_Cancer that are named with the year of publication (e.g.: folder names “2025” and “2026” for the publication years 2025 and 2026, respectively). Move all the PDF files of articles published within the same year to the subfolder named with the same year. Create only as many year-named sub-folders as there are publication years in which articles with PDF files are present in the Biomarker_Prospective_Study_Cancer folder.</w:t>
-      </w:r>
-    </w:p>
-    <w:p>
-      <w:pPr>
-        <w:rPr>
-          <w:rFonts w:ascii="Calibri" w:eastAsia="Times New Roman" w:hAnsi="Calibri" w:cs="Calibri"/>
-          <w:color w:val="000000"/>
-          <w:kern w:val="0"/>
-          <w:lang w:val="en-IN" w:eastAsia="en-IN"/>
-          <w14:ligatures w14:val="none"/>
-        </w:rPr>
-      </w:pPr>
-    </w:p>
-    <w:p>
-      <w:pPr>
-        <w:rPr>
-          <w:rFonts w:ascii="Calibri" w:eastAsia="Times New Roman" w:hAnsi="Calibri" w:cs="Calibri"/>
+      </w:pPr>
+      <w:proofErr w:type="spellStart"/>
+      <w:r>
+        <w:rPr>
           <w:b/>
           <w:bCs/>
-          <w:color w:val="000000"/>
-          <w:kern w:val="0"/>
-          <w:lang w:val="en-IN" w:eastAsia="en-IN"/>
-          <w14:ligatures w14:val="none"/>
-        </w:rPr>
-      </w:pPr>
-      <w:r>
-        <w:rPr>
-          <w:rFonts w:ascii="Calibri" w:eastAsia="Times New Roman" w:hAnsi="Calibri" w:cs="Calibri"/>
+        </w:rPr>
+        <w:t>Installment</w:t>
+      </w:r>
+      <w:proofErr w:type="spellEnd"/>
+      <w:r>
+        <w:rPr>
           <w:b/>
           <w:bCs/>
-          <w:color w:val="000000"/>
-          <w:kern w:val="0"/>
-          <w:lang w:val="en-IN" w:eastAsia="en-IN"/>
-          <w14:ligatures w14:val="none"/>
-        </w:rPr>
-        <w:t>Installment 22:</w:t>
-      </w:r>
-    </w:p>
-    <w:p>
-      <w:pPr>
-        <w:rPr>
-          <w:rFonts w:ascii="Calibri" w:eastAsia="Times New Roman" w:hAnsi="Calibri" w:cs="Calibri"/>
-          <w:color w:val="000000"/>
-          <w:kern w:val="0"/>
-          <w:lang w:val="en-IN" w:eastAsia="en-IN"/>
-          <w14:ligatures w14:val="none"/>
-        </w:rPr>
-      </w:pPr>
-    </w:p>
-    <w:p>
-      <w:r>
-        <w:t>I tried opening a few of the PDFs in Adobe Acrobat Reader, but got an error message saying "There was an error opening this document. Access denied". Please investigate and fix the problem to make full-text PDFs accessible via the Adobe Acrobat PDF reader.</w:t>
+        </w:rPr>
+        <w:t xml:space="preserve"> 21:</w:t>
       </w:r>
     </w:p>
     <w:p/>
     <w:p>
       <w:pPr>
         <w:rPr>
+          <w:rFonts w:ascii="Calibri" w:eastAsia="Times New Roman" w:hAnsi="Calibri" w:cs="Calibri"/>
+          <w:color w:val="000000"/>
+          <w:kern w:val="0"/>
+          <w:lang w:val="en-IN" w:eastAsia="en-IN"/>
+          <w14:ligatures w14:val="none"/>
+        </w:rPr>
+      </w:pPr>
+      <w:r>
+        <w:rPr>
+          <w:rFonts w:ascii="Calibri" w:eastAsia="Times New Roman" w:hAnsi="Calibri" w:cs="Calibri"/>
+          <w:color w:val="000000"/>
+          <w:kern w:val="0"/>
+          <w:lang w:val="en-IN" w:eastAsia="en-IN"/>
+          <w14:ligatures w14:val="none"/>
+        </w:rPr>
+        <w:t xml:space="preserve">In the sub-folder named </w:t>
+      </w:r>
+      <w:proofErr w:type="spellStart"/>
+      <w:r>
+        <w:rPr>
+          <w:rFonts w:ascii="Calibri" w:eastAsia="Times New Roman" w:hAnsi="Calibri" w:cs="Calibri"/>
+          <w:color w:val="000000"/>
+          <w:kern w:val="0"/>
+          <w:lang w:val="en-IN" w:eastAsia="en-IN"/>
+          <w14:ligatures w14:val="none"/>
+        </w:rPr>
+        <w:t>Biomarker_Prospective_Study_Cancer</w:t>
+      </w:r>
+      <w:proofErr w:type="spellEnd"/>
+      <w:r>
+        <w:rPr>
+          <w:rFonts w:ascii="Calibri" w:eastAsia="Times New Roman" w:hAnsi="Calibri" w:cs="Calibri"/>
+          <w:color w:val="000000"/>
+          <w:kern w:val="0"/>
+          <w:lang w:val="en-IN" w:eastAsia="en-IN"/>
+          <w14:ligatures w14:val="none"/>
+        </w:rPr>
+        <w:t xml:space="preserve">, you will find PDFs. In the same sub-folder, you will also find a CSV file called articles_metadata.csv, which contains the titles of these articles, the journal, the year, and the name of the PDF file, if present in the record. In cases in which the </w:t>
+      </w:r>
+      <w:proofErr w:type="spellStart"/>
+      <w:r>
+        <w:rPr>
+          <w:rFonts w:ascii="Calibri" w:eastAsia="Times New Roman" w:hAnsi="Calibri" w:cs="Calibri"/>
+          <w:color w:val="000000"/>
+          <w:kern w:val="0"/>
+          <w:lang w:val="en-IN" w:eastAsia="en-IN"/>
+          <w14:ligatures w14:val="none"/>
+        </w:rPr>
+        <w:t>PDF_Filename</w:t>
+      </w:r>
+      <w:proofErr w:type="spellEnd"/>
+      <w:r>
+        <w:rPr>
+          <w:rFonts w:ascii="Calibri" w:eastAsia="Times New Roman" w:hAnsi="Calibri" w:cs="Calibri"/>
+          <w:color w:val="000000"/>
+          <w:kern w:val="0"/>
+          <w:lang w:val="en-IN" w:eastAsia="en-IN"/>
+          <w14:ligatures w14:val="none"/>
+        </w:rPr>
+        <w:t xml:space="preserve"> column contains a PDF file name (e.g.: PMID_41262295.pdf), rename the corresponding PDF file in the </w:t>
+      </w:r>
+      <w:proofErr w:type="spellStart"/>
+      <w:r>
+        <w:rPr>
+          <w:rFonts w:ascii="Calibri" w:eastAsia="Times New Roman" w:hAnsi="Calibri" w:cs="Calibri"/>
+          <w:color w:val="000000"/>
+          <w:kern w:val="0"/>
+          <w:lang w:val="en-IN" w:eastAsia="en-IN"/>
+          <w14:ligatures w14:val="none"/>
+        </w:rPr>
+        <w:t>Biomarker_Prospective_Study_Cancer</w:t>
+      </w:r>
+      <w:proofErr w:type="spellEnd"/>
+      <w:r>
+        <w:rPr>
+          <w:rFonts w:ascii="Calibri" w:eastAsia="Times New Roman" w:hAnsi="Calibri" w:cs="Calibri"/>
+          <w:color w:val="000000"/>
+          <w:kern w:val="0"/>
+          <w:lang w:val="en-IN" w:eastAsia="en-IN"/>
+          <w14:ligatures w14:val="none"/>
+        </w:rPr>
+        <w:t xml:space="preserve"> folder to conform to the file name format Title_Authors_Journal_Year.pdf, by sourcing the components of this name directly from the correspondingly named column in the CSV file, at the appropriate row number. Before incorporating the author names from the “Authors” column directly, extract the individual names, wherein consecutive authors’ names are separated by “; ” or by a “;” immediately followed by an unspecified number of spaces. Then, string the author names together in the original sequence in which they were listed in the entry, separating consecutive authors’ names with an underscore (_) in between them (e.g.: “Abdul NS; Shenoy M; Shivakumar GC; Patel S; Jyoti B; Shivakumar S” gets replaced by “Abdul </w:t>
+      </w:r>
+      <w:proofErr w:type="spellStart"/>
+      <w:r>
+        <w:rPr>
+          <w:rFonts w:ascii="Calibri" w:eastAsia="Times New Roman" w:hAnsi="Calibri" w:cs="Calibri"/>
+          <w:color w:val="000000"/>
+          <w:kern w:val="0"/>
+          <w:lang w:val="en-IN" w:eastAsia="en-IN"/>
+          <w14:ligatures w14:val="none"/>
+        </w:rPr>
+        <w:t>NS_Shenoy</w:t>
+      </w:r>
+      <w:proofErr w:type="spellEnd"/>
+      <w:r>
+        <w:rPr>
+          <w:rFonts w:ascii="Calibri" w:eastAsia="Times New Roman" w:hAnsi="Calibri" w:cs="Calibri"/>
+          <w:color w:val="000000"/>
+          <w:kern w:val="0"/>
+          <w:lang w:val="en-IN" w:eastAsia="en-IN"/>
+          <w14:ligatures w14:val="none"/>
+        </w:rPr>
+        <w:t xml:space="preserve"> </w:t>
+      </w:r>
+      <w:proofErr w:type="spellStart"/>
+      <w:r>
+        <w:rPr>
+          <w:rFonts w:ascii="Calibri" w:eastAsia="Times New Roman" w:hAnsi="Calibri" w:cs="Calibri"/>
+          <w:color w:val="000000"/>
+          <w:kern w:val="0"/>
+          <w:lang w:val="en-IN" w:eastAsia="en-IN"/>
+          <w14:ligatures w14:val="none"/>
+        </w:rPr>
+        <w:t>M_Shivakumar</w:t>
+      </w:r>
+      <w:proofErr w:type="spellEnd"/>
+      <w:r>
+        <w:rPr>
+          <w:rFonts w:ascii="Calibri" w:eastAsia="Times New Roman" w:hAnsi="Calibri" w:cs="Calibri"/>
+          <w:color w:val="000000"/>
+          <w:kern w:val="0"/>
+          <w:lang w:val="en-IN" w:eastAsia="en-IN"/>
+          <w14:ligatures w14:val="none"/>
+        </w:rPr>
+        <w:t xml:space="preserve"> </w:t>
+      </w:r>
+      <w:proofErr w:type="spellStart"/>
+      <w:r>
+        <w:rPr>
+          <w:rFonts w:ascii="Calibri" w:eastAsia="Times New Roman" w:hAnsi="Calibri" w:cs="Calibri"/>
+          <w:color w:val="000000"/>
+          <w:kern w:val="0"/>
+          <w:lang w:val="en-IN" w:eastAsia="en-IN"/>
+          <w14:ligatures w14:val="none"/>
+        </w:rPr>
+        <w:t>GC_Patel</w:t>
+      </w:r>
+      <w:proofErr w:type="spellEnd"/>
+      <w:r>
+        <w:rPr>
+          <w:rFonts w:ascii="Calibri" w:eastAsia="Times New Roman" w:hAnsi="Calibri" w:cs="Calibri"/>
+          <w:color w:val="000000"/>
+          <w:kern w:val="0"/>
+          <w:lang w:val="en-IN" w:eastAsia="en-IN"/>
+          <w14:ligatures w14:val="none"/>
+        </w:rPr>
+        <w:t xml:space="preserve"> </w:t>
+      </w:r>
+      <w:proofErr w:type="spellStart"/>
+      <w:r>
+        <w:rPr>
+          <w:rFonts w:ascii="Calibri" w:eastAsia="Times New Roman" w:hAnsi="Calibri" w:cs="Calibri"/>
+          <w:color w:val="000000"/>
+          <w:kern w:val="0"/>
+          <w:lang w:val="en-IN" w:eastAsia="en-IN"/>
+          <w14:ligatures w14:val="none"/>
+        </w:rPr>
+        <w:t>S_Jyoti</w:t>
+      </w:r>
+      <w:proofErr w:type="spellEnd"/>
+      <w:r>
+        <w:rPr>
+          <w:rFonts w:ascii="Calibri" w:eastAsia="Times New Roman" w:hAnsi="Calibri" w:cs="Calibri"/>
+          <w:color w:val="000000"/>
+          <w:kern w:val="0"/>
+          <w:lang w:val="en-IN" w:eastAsia="en-IN"/>
+          <w14:ligatures w14:val="none"/>
+        </w:rPr>
+        <w:t xml:space="preserve"> </w:t>
+      </w:r>
+      <w:proofErr w:type="spellStart"/>
+      <w:r>
+        <w:rPr>
+          <w:rFonts w:ascii="Calibri" w:eastAsia="Times New Roman" w:hAnsi="Calibri" w:cs="Calibri"/>
+          <w:color w:val="000000"/>
+          <w:kern w:val="0"/>
+          <w:lang w:val="en-IN" w:eastAsia="en-IN"/>
+          <w14:ligatures w14:val="none"/>
+        </w:rPr>
+        <w:t>B_Shivakumar</w:t>
+      </w:r>
+      <w:proofErr w:type="spellEnd"/>
+      <w:r>
+        <w:rPr>
+          <w:rFonts w:ascii="Calibri" w:eastAsia="Times New Roman" w:hAnsi="Calibri" w:cs="Calibri"/>
+          <w:color w:val="000000"/>
+          <w:kern w:val="0"/>
+          <w:lang w:val="en-IN" w:eastAsia="en-IN"/>
+          <w14:ligatures w14:val="none"/>
+        </w:rPr>
+        <w:t xml:space="preserve"> S” at the “Authors” section in the PDF file name format Title_Authors_Journal_Year.pdf)</w:t>
+      </w:r>
+    </w:p>
+    <w:p>
+      <w:pPr>
+        <w:rPr>
+          <w:rFonts w:ascii="Calibri" w:eastAsia="Times New Roman" w:hAnsi="Calibri" w:cs="Calibri"/>
+          <w:color w:val="000000"/>
+          <w:kern w:val="0"/>
+          <w:lang w:val="en-IN" w:eastAsia="en-IN"/>
+          <w14:ligatures w14:val="none"/>
+        </w:rPr>
+      </w:pPr>
+      <w:r>
+        <w:rPr>
+          <w:rFonts w:ascii="Calibri" w:eastAsia="Times New Roman" w:hAnsi="Calibri" w:cs="Calibri"/>
+          <w:color w:val="000000"/>
+          <w:kern w:val="0"/>
+          <w:lang w:val="en-IN" w:eastAsia="en-IN"/>
+          <w14:ligatures w14:val="none"/>
+        </w:rPr>
+        <w:lastRenderedPageBreak/>
+        <w:t xml:space="preserve">After this, create sub-folders within </w:t>
+      </w:r>
+      <w:proofErr w:type="spellStart"/>
+      <w:r>
+        <w:rPr>
+          <w:rFonts w:ascii="Calibri" w:eastAsia="Times New Roman" w:hAnsi="Calibri" w:cs="Calibri"/>
+          <w:color w:val="000000"/>
+          <w:kern w:val="0"/>
+          <w:lang w:val="en-IN" w:eastAsia="en-IN"/>
+          <w14:ligatures w14:val="none"/>
+        </w:rPr>
+        <w:t>Biomarker_Prospective_Study_Cancer</w:t>
+      </w:r>
+      <w:proofErr w:type="spellEnd"/>
+      <w:r>
+        <w:rPr>
+          <w:rFonts w:ascii="Calibri" w:eastAsia="Times New Roman" w:hAnsi="Calibri" w:cs="Calibri"/>
+          <w:color w:val="000000"/>
+          <w:kern w:val="0"/>
+          <w:lang w:val="en-IN" w:eastAsia="en-IN"/>
+          <w14:ligatures w14:val="none"/>
+        </w:rPr>
+        <w:t xml:space="preserve"> that are named with the year of publication (e.g.: folder names “2025” and “2026” for the publication years 2025 and 2026, respectively). Move all the PDF files of articles published within the same year to the subfolder named with the same year. Create only as many year-named sub-folders as there are publication years in which articles with PDF files are present in the </w:t>
+      </w:r>
+      <w:proofErr w:type="spellStart"/>
+      <w:r>
+        <w:rPr>
+          <w:rFonts w:ascii="Calibri" w:eastAsia="Times New Roman" w:hAnsi="Calibri" w:cs="Calibri"/>
+          <w:color w:val="000000"/>
+          <w:kern w:val="0"/>
+          <w:lang w:val="en-IN" w:eastAsia="en-IN"/>
+          <w14:ligatures w14:val="none"/>
+        </w:rPr>
+        <w:t>Biomarker_Prospective_Study_Cancer</w:t>
+      </w:r>
+      <w:proofErr w:type="spellEnd"/>
+      <w:r>
+        <w:rPr>
+          <w:rFonts w:ascii="Calibri" w:eastAsia="Times New Roman" w:hAnsi="Calibri" w:cs="Calibri"/>
+          <w:color w:val="000000"/>
+          <w:kern w:val="0"/>
+          <w:lang w:val="en-IN" w:eastAsia="en-IN"/>
+          <w14:ligatures w14:val="none"/>
+        </w:rPr>
+        <w:t xml:space="preserve"> folder.</w:t>
+      </w:r>
+    </w:p>
+    <w:p>
+      <w:pPr>
+        <w:rPr>
+          <w:rFonts w:ascii="Calibri" w:eastAsia="Times New Roman" w:hAnsi="Calibri" w:cs="Calibri"/>
+          <w:color w:val="000000"/>
+          <w:kern w:val="0"/>
+          <w:lang w:val="en-IN" w:eastAsia="en-IN"/>
+          <w14:ligatures w14:val="none"/>
+        </w:rPr>
+      </w:pPr>
+    </w:p>
+    <w:p>
+      <w:pPr>
+        <w:rPr>
+          <w:rFonts w:ascii="Calibri" w:eastAsia="Times New Roman" w:hAnsi="Calibri" w:cs="Calibri"/>
           <w:b/>
           <w:bCs/>
-        </w:rPr>
-      </w:pPr>
-      <w:r>
-        <w:rPr>
+          <w:color w:val="000000"/>
+          <w:kern w:val="0"/>
+          <w:lang w:val="en-IN" w:eastAsia="en-IN"/>
+          <w14:ligatures w14:val="none"/>
+        </w:rPr>
+      </w:pPr>
+      <w:proofErr w:type="spellStart"/>
+      <w:r>
+        <w:rPr>
+          <w:rFonts w:ascii="Calibri" w:eastAsia="Times New Roman" w:hAnsi="Calibri" w:cs="Calibri"/>
           <w:b/>
           <w:bCs/>
-        </w:rPr>
-        <w:t>Its reply to prompt Installment 22:</w:t>
+          <w:color w:val="000000"/>
+          <w:kern w:val="0"/>
+          <w:lang w:val="en-IN" w:eastAsia="en-IN"/>
+          <w14:ligatures w14:val="none"/>
+        </w:rPr>
+        <w:t>Installment</w:t>
+      </w:r>
+      <w:proofErr w:type="spellEnd"/>
+      <w:r>
+        <w:rPr>
+          <w:rFonts w:ascii="Calibri" w:eastAsia="Times New Roman" w:hAnsi="Calibri" w:cs="Calibri"/>
+          <w:b/>
+          <w:bCs/>
+          <w:color w:val="000000"/>
+          <w:kern w:val="0"/>
+          <w:lang w:val="en-IN" w:eastAsia="en-IN"/>
+          <w14:ligatures w14:val="none"/>
+        </w:rPr>
+        <w:t xml:space="preserve"> 22:</w:t>
+      </w:r>
+    </w:p>
+    <w:p>
+      <w:pPr>
+        <w:rPr>
+          <w:rFonts w:ascii="Calibri" w:eastAsia="Times New Roman" w:hAnsi="Calibri" w:cs="Calibri"/>
+          <w:color w:val="000000"/>
+          <w:kern w:val="0"/>
+          <w:lang w:val="en-IN" w:eastAsia="en-IN"/>
+          <w14:ligatures w14:val="none"/>
+        </w:rPr>
+      </w:pPr>
+    </w:p>
+    <w:p>
+      <w:r>
+        <w:t>I tried opening a few of the PDFs in Adobe Acrobat Reader, but got an error message saying "There was an error opening this document. Access denied". Please investigate and fix the problem to make full-text PDFs accessible via the Adobe Acrobat PDF reader.</w:t>
+      </w:r>
+    </w:p>
+    <w:p/>
+    <w:p>
+      <w:pPr>
+        <w:rPr>
+          <w:b/>
+          <w:bCs/>
+        </w:rPr>
+      </w:pPr>
+      <w:r>
+        <w:rPr>
+          <w:b/>
+          <w:bCs/>
+        </w:rPr>
+        <w:t xml:space="preserve">Its reply to prompt </w:t>
+      </w:r>
+      <w:proofErr w:type="spellStart"/>
+      <w:r>
+        <w:rPr>
+          <w:b/>
+          <w:bCs/>
+        </w:rPr>
+        <w:t>Installment</w:t>
+      </w:r>
+      <w:proofErr w:type="spellEnd"/>
+      <w:r>
+        <w:rPr>
+          <w:b/>
+          <w:bCs/>
+        </w:rPr>
+        <w:t xml:space="preserve"> 22:</w:t>
       </w:r>
     </w:p>
     <w:p>
@@ -3631,7 +5485,19 @@
           <w:lang w:val="en-IN" w:eastAsia="en-IN"/>
           <w14:ligatures w14:val="none"/>
         </w:rPr>
-        <w:t>The problem is now fixed. Here's what happened:</w:t>
+        <w:t>The problem is now fixed. Here's what </w:t>
+      </w:r>
+      <w:proofErr w:type="spellStart"/>
+      <w:r>
+        <w:rPr>
+          <w:rFonts w:ascii="Times New Roman" w:eastAsia="Times New Roman" w:hAnsi="Times New Roman" w:cs="Times New Roman"/>
+          <w:kern w:val="0"/>
+          <w:sz w:val="24"/>
+          <w:szCs w:val="24"/>
+          <w:lang w:val="en-IN" w:eastAsia="en-IN"/>
+          <w14:ligatures w14:val="none"/>
+        </w:rPr>
+        <w:t>happened:</w:t>
       </w:r>
       <w:r>
         <w:rPr>
@@ -3644,19 +5510,9 @@
           <w:lang w:val="en-IN" w:eastAsia="en-IN"/>
           <w14:ligatures w14:val="none"/>
         </w:rPr>
-        <w:t>Root cause:</w:t>
-      </w:r>
-      <w:r>
-        <w:rPr>
-          <w:rFonts w:ascii="Times New Roman" w:eastAsia="Times New Roman" w:hAnsi="Times New Roman" w:cs="Times New Roman"/>
-          <w:kern w:val="0"/>
-          <w:sz w:val="24"/>
-          <w:szCs w:val="24"/>
-          <w:lang w:val="en-IN" w:eastAsia="en-IN"/>
-          <w14:ligatures w14:val="none"/>
-        </w:rPr>
-        <w:t> The full file paths (directory + filename) exceeded Windows' </w:t>
-      </w:r>
+        <w:t>Root</w:t>
+      </w:r>
+      <w:proofErr w:type="spellEnd"/>
       <w:r>
         <w:rPr>
           <w:rFonts w:ascii="Times New Roman" w:eastAsia="Times New Roman" w:hAnsi="Times New Roman" w:cs="Times New Roman"/>
@@ -3668,7 +5524,7 @@
           <w:lang w:val="en-IN" w:eastAsia="en-IN"/>
           <w14:ligatures w14:val="none"/>
         </w:rPr>
-        <w:t>260-character MAX_PATH limit</w:t>
+        <w:t> cause:</w:t>
       </w:r>
       <w:r>
         <w:rPr>
@@ -3679,27 +5535,7 @@
           <w:lang w:val="en-IN" w:eastAsia="en-IN"/>
           <w14:ligatures w14:val="none"/>
         </w:rPr>
-        <w:t>. While Python could create these files using the </w:t>
-      </w:r>
-      <w:r>
-        <w:rPr>
-          <w:rFonts w:ascii="Consolas" w:eastAsia="Times New Roman" w:hAnsi="Consolas" w:cs="Times New Roman"/>
-          <w:kern w:val="0"/>
-          <w:lang w:val="en-IN" w:eastAsia="en-IN"/>
-          <w14:ligatures w14:val="none"/>
-        </w:rPr>
-        <w:t>\\?\</w:t>
-      </w:r>
-      <w:r>
-        <w:rPr>
-          <w:rFonts w:ascii="Times New Roman" w:eastAsia="Times New Roman" w:hAnsi="Times New Roman" w:cs="Times New Roman"/>
-          <w:kern w:val="0"/>
-          <w:sz w:val="24"/>
-          <w:szCs w:val="24"/>
-          <w:lang w:val="en-IN" w:eastAsia="en-IN"/>
-          <w14:ligatures w14:val="none"/>
-        </w:rPr>
-        <w:t> extended-length path prefix, standard Windows applications like Adobe Acrobat Reader use the normal Win32 API and cannot access paths longer than 260 characters — producing the "Access denied" error.</w:t>
+        <w:t> The full file paths (directory + filename) exceeded Windows' </w:t>
       </w:r>
       <w:r>
         <w:rPr>
@@ -3712,7 +5548,7 @@
           <w:lang w:val="en-IN" w:eastAsia="en-IN"/>
           <w14:ligatures w14:val="none"/>
         </w:rPr>
-        <w:t>The fix:</w:t>
+        <w:t>260-character MAX_PATH limit</w:t>
       </w:r>
       <w:r>
         <w:rPr>
@@ -3723,7 +5559,7 @@
           <w:lang w:val="en-IN" w:eastAsia="en-IN"/>
           <w14:ligatures w14:val="none"/>
         </w:rPr>
-        <w:t> All 555 over-long filenames were shortened so that every full path is now 259 characters or fewer. The truncation strategy preserves the </w:t>
+        <w:t>. While Python could create these files using the </w:t>
       </w:r>
       <w:r>
         <w:rPr>
@@ -3732,7 +5568,7 @@
           <w:lang w:val="en-IN" w:eastAsia="en-IN"/>
           <w14:ligatures w14:val="none"/>
         </w:rPr>
-        <w:t>Journal_Year.pdf</w:t>
+        <w:t>\\?\</w:t>
       </w:r>
       <w:r>
         <w:rPr>
@@ -3743,7 +5579,19 @@
           <w:lang w:val="en-IN" w:eastAsia="en-IN"/>
           <w14:ligatures w14:val="none"/>
         </w:rPr>
-        <w:t> tail and shortens the authors list first, then the title if needed.</w:t>
+        <w:t xml:space="preserve"> extended-length path prefix, standard Windows applications like Adobe Acrobat Reader use the normal Win32 API and cannot access paths longer than 260 characters — producing the "Access denied" </w:t>
+      </w:r>
+      <w:proofErr w:type="spellStart"/>
+      <w:r>
+        <w:rPr>
+          <w:rFonts w:ascii="Times New Roman" w:eastAsia="Times New Roman" w:hAnsi="Times New Roman" w:cs="Times New Roman"/>
+          <w:kern w:val="0"/>
+          <w:sz w:val="24"/>
+          <w:szCs w:val="24"/>
+          <w:lang w:val="en-IN" w:eastAsia="en-IN"/>
+          <w14:ligatures w14:val="none"/>
+        </w:rPr>
+        <w:t>error.</w:t>
       </w:r>
       <w:r>
         <w:rPr>
@@ -3756,7 +5604,91 @@
           <w:lang w:val="en-IN" w:eastAsia="en-IN"/>
           <w14:ligatures w14:val="none"/>
         </w:rPr>
-        <w:t>Verification:</w:t>
+        <w:t>The</w:t>
+      </w:r>
+      <w:proofErr w:type="spellEnd"/>
+      <w:r>
+        <w:rPr>
+          <w:rFonts w:ascii="Times New Roman" w:eastAsia="Times New Roman" w:hAnsi="Times New Roman" w:cs="Times New Roman"/>
+          <w:b/>
+          <w:bCs/>
+          <w:kern w:val="0"/>
+          <w:sz w:val="24"/>
+          <w:szCs w:val="24"/>
+          <w:lang w:val="en-IN" w:eastAsia="en-IN"/>
+          <w14:ligatures w14:val="none"/>
+        </w:rPr>
+        <w:t> fix:</w:t>
+      </w:r>
+      <w:r>
+        <w:rPr>
+          <w:rFonts w:ascii="Times New Roman" w:eastAsia="Times New Roman" w:hAnsi="Times New Roman" w:cs="Times New Roman"/>
+          <w:kern w:val="0"/>
+          <w:sz w:val="24"/>
+          <w:szCs w:val="24"/>
+          <w:lang w:val="en-IN" w:eastAsia="en-IN"/>
+          <w14:ligatures w14:val="none"/>
+        </w:rPr>
+        <w:t> All 555 over-long filenames were shortened so that every full path is now 259 characters or fewer. The truncation strategy preserves the </w:t>
+      </w:r>
+      <w:r>
+        <w:rPr>
+          <w:rFonts w:ascii="Consolas" w:eastAsia="Times New Roman" w:hAnsi="Consolas" w:cs="Times New Roman"/>
+          <w:kern w:val="0"/>
+          <w:lang w:val="en-IN" w:eastAsia="en-IN"/>
+          <w14:ligatures w14:val="none"/>
+        </w:rPr>
+        <w:t>Journal_Year.pdf</w:t>
+      </w:r>
+      <w:r>
+        <w:rPr>
+          <w:rFonts w:ascii="Times New Roman" w:eastAsia="Times New Roman" w:hAnsi="Times New Roman" w:cs="Times New Roman"/>
+          <w:kern w:val="0"/>
+          <w:sz w:val="24"/>
+          <w:szCs w:val="24"/>
+          <w:lang w:val="en-IN" w:eastAsia="en-IN"/>
+          <w14:ligatures w14:val="none"/>
+        </w:rPr>
+        <w:t> tail and shortens the authors list first, then the title if </w:t>
+      </w:r>
+      <w:proofErr w:type="spellStart"/>
+      <w:r>
+        <w:rPr>
+          <w:rFonts w:ascii="Times New Roman" w:eastAsia="Times New Roman" w:hAnsi="Times New Roman" w:cs="Times New Roman"/>
+          <w:kern w:val="0"/>
+          <w:sz w:val="24"/>
+          <w:szCs w:val="24"/>
+          <w:lang w:val="en-IN" w:eastAsia="en-IN"/>
+          <w14:ligatures w14:val="none"/>
+        </w:rPr>
+        <w:t>needed.</w:t>
+      </w:r>
+      <w:r>
+        <w:rPr>
+          <w:rFonts w:ascii="Times New Roman" w:eastAsia="Times New Roman" w:hAnsi="Times New Roman" w:cs="Times New Roman"/>
+          <w:b/>
+          <w:bCs/>
+          <w:kern w:val="0"/>
+          <w:sz w:val="24"/>
+          <w:szCs w:val="24"/>
+          <w:lang w:val="en-IN" w:eastAsia="en-IN"/>
+          <w14:ligatures w14:val="none"/>
+        </w:rPr>
+        <w:t>Verification</w:t>
+      </w:r>
+      <w:proofErr w:type="spellEnd"/>
+      <w:r>
+        <w:rPr>
+          <w:rFonts w:ascii="Times New Roman" w:eastAsia="Times New Roman" w:hAnsi="Times New Roman" w:cs="Times New Roman"/>
+          <w:b/>
+          <w:bCs/>
+          <w:kern w:val="0"/>
+          <w:sz w:val="24"/>
+          <w:szCs w:val="24"/>
+          <w:lang w:val="en-IN" w:eastAsia="en-IN"/>
+          <w14:ligatures w14:val="none"/>
+        </w:rPr>
+        <w:t>:</w:t>
       </w:r>
     </w:p>
     <w:p>
@@ -3818,8 +5750,19 @@
           <w:lang w:val="en-IN" w:eastAsia="en-IN"/>
           <w14:ligatures w14:val="none"/>
         </w:rPr>
-        <w:t>Get-ChildItem</w:t>
-      </w:r>
+        <w:t>Get-</w:t>
+      </w:r>
+      <w:proofErr w:type="spellStart"/>
+      <w:r>
+        <w:rPr>
+          <w:rFonts w:ascii="Consolas" w:eastAsia="Times New Roman" w:hAnsi="Consolas" w:cs="Times New Roman"/>
+          <w:kern w:val="0"/>
+          <w:lang w:val="en-IN" w:eastAsia="en-IN"/>
+          <w14:ligatures w14:val="none"/>
+        </w:rPr>
+        <w:t>ChildItem</w:t>
+      </w:r>
+      <w:proofErr w:type="spellEnd"/>
       <w:r>
         <w:rPr>
           <w:rFonts w:ascii="Times New Roman" w:eastAsia="Times New Roman" w:hAnsi="Times New Roman" w:cs="Times New Roman"/>
@@ -3885,8 +5828,19 @@
           <w:lang w:val="en-IN" w:eastAsia="en-IN"/>
           <w14:ligatures w14:val="none"/>
         </w:rPr>
-        <w:t>Get-Acl</w:t>
-      </w:r>
+        <w:t>Get-</w:t>
+      </w:r>
+      <w:proofErr w:type="spellStart"/>
+      <w:r>
+        <w:rPr>
+          <w:rFonts w:ascii="Consolas" w:eastAsia="Times New Roman" w:hAnsi="Consolas" w:cs="Times New Roman"/>
+          <w:kern w:val="0"/>
+          <w:lang w:val="en-IN" w:eastAsia="en-IN"/>
+          <w14:ligatures w14:val="none"/>
+        </w:rPr>
+        <w:t>Acl</w:t>
+      </w:r>
+      <w:proofErr w:type="spellEnd"/>
       <w:r>
         <w:rPr>
           <w:rFonts w:ascii="Times New Roman" w:eastAsia="Times New Roman" w:hAnsi="Times New Roman" w:cs="Times New Roman"/>
@@ -3995,6 +5949,7 @@
           <w14:ligatures w14:val="none"/>
         </w:rPr>
       </w:pPr>
+      <w:proofErr w:type="spellStart"/>
       <w:r>
         <w:rPr>
           <w:rFonts w:ascii="Calibri" w:eastAsia="Times New Roman" w:hAnsi="Calibri" w:cs="Calibri"/>
@@ -4005,49 +5960,150 @@
           <w:lang w:val="en-IN" w:eastAsia="en-IN"/>
           <w14:ligatures w14:val="none"/>
         </w:rPr>
-        <w:t>Installment 23:</w:t>
-      </w:r>
-    </w:p>
-    <w:p>
-      <w:pPr>
-        <w:rPr>
-          <w:rFonts w:ascii="Calibri" w:eastAsia="Times New Roman" w:hAnsi="Calibri" w:cs="Calibri"/>
-          <w:color w:val="000000"/>
-          <w:kern w:val="0"/>
-          <w:lang w:val="en-IN" w:eastAsia="en-IN"/>
-          <w14:ligatures w14:val="none"/>
-        </w:rPr>
-      </w:pPr>
-      <w:r>
-        <w:rPr>
-          <w:rFonts w:ascii="Calibri" w:eastAsia="Times New Roman" w:hAnsi="Calibri" w:cs="Calibri"/>
-          <w:color w:val="000000"/>
-          <w:kern w:val="0"/>
-          <w:lang w:val="en-IN" w:eastAsia="en-IN"/>
-          <w14:ligatures w14:val="none"/>
-        </w:rPr>
-        <w:t>In the two sub-folders, within the Differential_Expression_Data_From_Literature sub-folder, there are 4 CSV files that act as the source of the data for the 2 possible tables that can be displayed after clicking on the “Load Differential Expression Data From Cancer Literature” button, in the Cancer Genomics section, and selecting one of 2 options from the Proteins display panel, or the 2 tables that could be displayed by selecting the options in the Proteins display panel, in the Cancer Proteomics section. These CSV files have been updated to include a column called “Year_of_Publication” in between the “Citation” and “Cancer_Type” columns. Please update the corresponding SQL database tables accordingly, to reflect the changes in the source CSV tables.</w:t>
-      </w:r>
-    </w:p>
-    <w:p>
-      <w:pPr>
-        <w:rPr>
-          <w:rFonts w:ascii="Calibri" w:eastAsia="Times New Roman" w:hAnsi="Calibri" w:cs="Calibri"/>
-          <w:color w:val="000000"/>
-          <w:kern w:val="0"/>
-          <w:lang w:val="en-IN" w:eastAsia="en-IN"/>
-          <w14:ligatures w14:val="none"/>
-        </w:rPr>
-      </w:pPr>
-      <w:r>
-        <w:rPr>
-          <w:rFonts w:ascii="Calibri" w:eastAsia="Times New Roman" w:hAnsi="Calibri" w:cs="Calibri"/>
-          <w:color w:val="000000"/>
-          <w:kern w:val="0"/>
-          <w:lang w:val="en-IN" w:eastAsia="en-IN"/>
-          <w14:ligatures w14:val="none"/>
-        </w:rPr>
-        <w:t>Moreover, please make it so that the “Year_of_Publication” column</w:t>
+        <w:t>Installment</w:t>
+      </w:r>
+      <w:proofErr w:type="spellEnd"/>
+      <w:r>
+        <w:rPr>
+          <w:rFonts w:ascii="Calibri" w:eastAsia="Times New Roman" w:hAnsi="Calibri" w:cs="Calibri"/>
+          <w:b/>
+          <w:bCs/>
+          <w:color w:val="000000"/>
+          <w:kern w:val="0"/>
+          <w:lang w:val="en-IN" w:eastAsia="en-IN"/>
+          <w14:ligatures w14:val="none"/>
+        </w:rPr>
+        <w:t xml:space="preserve"> 23:</w:t>
+      </w:r>
+    </w:p>
+    <w:p>
+      <w:pPr>
+        <w:rPr>
+          <w:rFonts w:ascii="Calibri" w:eastAsia="Times New Roman" w:hAnsi="Calibri" w:cs="Calibri"/>
+          <w:color w:val="000000"/>
+          <w:kern w:val="0"/>
+          <w:lang w:val="en-IN" w:eastAsia="en-IN"/>
+          <w14:ligatures w14:val="none"/>
+        </w:rPr>
+      </w:pPr>
+      <w:r>
+        <w:rPr>
+          <w:rFonts w:ascii="Calibri" w:eastAsia="Times New Roman" w:hAnsi="Calibri" w:cs="Calibri"/>
+          <w:color w:val="000000"/>
+          <w:kern w:val="0"/>
+          <w:lang w:val="en-IN" w:eastAsia="en-IN"/>
+          <w14:ligatures w14:val="none"/>
+        </w:rPr>
+        <w:t xml:space="preserve">In the two sub-folders, within the </w:t>
+      </w:r>
+      <w:proofErr w:type="spellStart"/>
+      <w:r>
+        <w:rPr>
+          <w:rFonts w:ascii="Calibri" w:eastAsia="Times New Roman" w:hAnsi="Calibri" w:cs="Calibri"/>
+          <w:color w:val="000000"/>
+          <w:kern w:val="0"/>
+          <w:lang w:val="en-IN" w:eastAsia="en-IN"/>
+          <w14:ligatures w14:val="none"/>
+        </w:rPr>
+        <w:t>Differential_Expression_Data_From_Literature</w:t>
+      </w:r>
+      <w:proofErr w:type="spellEnd"/>
+      <w:r>
+        <w:rPr>
+          <w:rFonts w:ascii="Calibri" w:eastAsia="Times New Roman" w:hAnsi="Calibri" w:cs="Calibri"/>
+          <w:color w:val="000000"/>
+          <w:kern w:val="0"/>
+          <w:lang w:val="en-IN" w:eastAsia="en-IN"/>
+          <w14:ligatures w14:val="none"/>
+        </w:rPr>
+        <w:t xml:space="preserve"> sub-folder, there are 4 CSV files that act as the source of the data for the 2 possible tables that can be displayed after clicking on the “Load Differential Expression Data From Cancer Literature” button, in the Cancer Genomics section, and selecting one of 2 options from the Proteins display panel, or the 2 tables that could be displayed by selecting the options in the Proteins display panel, in the Cancer Proteomics section. These CSV files have been updated to include a column called “</w:t>
+      </w:r>
+      <w:proofErr w:type="spellStart"/>
+      <w:r>
+        <w:rPr>
+          <w:rFonts w:ascii="Calibri" w:eastAsia="Times New Roman" w:hAnsi="Calibri" w:cs="Calibri"/>
+          <w:color w:val="000000"/>
+          <w:kern w:val="0"/>
+          <w:lang w:val="en-IN" w:eastAsia="en-IN"/>
+          <w14:ligatures w14:val="none"/>
+        </w:rPr>
+        <w:t>Year_of_Publication</w:t>
+      </w:r>
+      <w:proofErr w:type="spellEnd"/>
+      <w:r>
+        <w:rPr>
+          <w:rFonts w:ascii="Calibri" w:eastAsia="Times New Roman" w:hAnsi="Calibri" w:cs="Calibri"/>
+          <w:color w:val="000000"/>
+          <w:kern w:val="0"/>
+          <w:lang w:val="en-IN" w:eastAsia="en-IN"/>
+          <w14:ligatures w14:val="none"/>
+        </w:rPr>
+        <w:t>” in between the “Citation” and “</w:t>
+      </w:r>
+      <w:proofErr w:type="spellStart"/>
+      <w:r>
+        <w:rPr>
+          <w:rFonts w:ascii="Calibri" w:eastAsia="Times New Roman" w:hAnsi="Calibri" w:cs="Calibri"/>
+          <w:color w:val="000000"/>
+          <w:kern w:val="0"/>
+          <w:lang w:val="en-IN" w:eastAsia="en-IN"/>
+          <w14:ligatures w14:val="none"/>
+        </w:rPr>
+        <w:t>Cancer_Type</w:t>
+      </w:r>
+      <w:proofErr w:type="spellEnd"/>
+      <w:r>
+        <w:rPr>
+          <w:rFonts w:ascii="Calibri" w:eastAsia="Times New Roman" w:hAnsi="Calibri" w:cs="Calibri"/>
+          <w:color w:val="000000"/>
+          <w:kern w:val="0"/>
+          <w:lang w:val="en-IN" w:eastAsia="en-IN"/>
+          <w14:ligatures w14:val="none"/>
+        </w:rPr>
+        <w:t>” columns. Please update the corresponding SQL database tables accordingly, to reflect the changes in the source CSV tables.</w:t>
+      </w:r>
+    </w:p>
+    <w:p>
+      <w:pPr>
+        <w:rPr>
+          <w:rFonts w:ascii="Calibri" w:eastAsia="Times New Roman" w:hAnsi="Calibri" w:cs="Calibri"/>
+          <w:color w:val="000000"/>
+          <w:kern w:val="0"/>
+          <w:lang w:val="en-IN" w:eastAsia="en-IN"/>
+          <w14:ligatures w14:val="none"/>
+        </w:rPr>
+      </w:pPr>
+      <w:r>
+        <w:rPr>
+          <w:rFonts w:ascii="Calibri" w:eastAsia="Times New Roman" w:hAnsi="Calibri" w:cs="Calibri"/>
+          <w:color w:val="000000"/>
+          <w:kern w:val="0"/>
+          <w:lang w:val="en-IN" w:eastAsia="en-IN"/>
+          <w14:ligatures w14:val="none"/>
+        </w:rPr>
+        <w:t>Moreover, please make it so that the “</w:t>
+      </w:r>
+      <w:proofErr w:type="spellStart"/>
+      <w:r>
+        <w:rPr>
+          <w:rFonts w:ascii="Calibri" w:eastAsia="Times New Roman" w:hAnsi="Calibri" w:cs="Calibri"/>
+          <w:color w:val="000000"/>
+          <w:kern w:val="0"/>
+          <w:lang w:val="en-IN" w:eastAsia="en-IN"/>
+          <w14:ligatures w14:val="none"/>
+        </w:rPr>
+        <w:t>Year_of_Publication</w:t>
+      </w:r>
+      <w:proofErr w:type="spellEnd"/>
+      <w:r>
+        <w:rPr>
+          <w:rFonts w:ascii="Calibri" w:eastAsia="Times New Roman" w:hAnsi="Calibri" w:cs="Calibri"/>
+          <w:color w:val="000000"/>
+          <w:kern w:val="0"/>
+          <w:lang w:val="en-IN" w:eastAsia="en-IN"/>
+          <w14:ligatures w14:val="none"/>
+        </w:rPr>
+        <w:t>” column</w:t>
       </w:r>
       <w:r>
         <w:rPr>
@@ -4108,7 +6164,29 @@
           <w:lang w:val="en-IN" w:eastAsia="en-IN"/>
           <w14:ligatures w14:val="none"/>
         </w:rPr>
-        <w:t>sets the table display to show all the original rows, while clicking on any of the other options filters the rows to only display rows that bear the selected option as the value in the “Year_of_Publication” column.</w:t>
+        <w:t>sets the table display to show all the original rows, while clicking on any of the other options filters the rows to only display rows that bear the selected option as the value in the “</w:t>
+      </w:r>
+      <w:proofErr w:type="spellStart"/>
+      <w:r>
+        <w:rPr>
+          <w:rFonts w:ascii="Calibri" w:eastAsia="Times New Roman" w:hAnsi="Calibri" w:cs="Calibri"/>
+          <w:color w:val="000000"/>
+          <w:kern w:val="0"/>
+          <w:lang w:val="en-IN" w:eastAsia="en-IN"/>
+          <w14:ligatures w14:val="none"/>
+        </w:rPr>
+        <w:t>Year_of_Publication</w:t>
+      </w:r>
+      <w:proofErr w:type="spellEnd"/>
+      <w:r>
+        <w:rPr>
+          <w:rFonts w:ascii="Calibri" w:eastAsia="Times New Roman" w:hAnsi="Calibri" w:cs="Calibri"/>
+          <w:color w:val="000000"/>
+          <w:kern w:val="0"/>
+          <w:lang w:val="en-IN" w:eastAsia="en-IN"/>
+          <w14:ligatures w14:val="none"/>
+        </w:rPr>
+        <w:t>” column.</w:t>
       </w:r>
     </w:p>
     <w:p>
@@ -4134,6 +6212,7 @@
           <w14:ligatures w14:val="none"/>
         </w:rPr>
       </w:pPr>
+      <w:proofErr w:type="spellStart"/>
       <w:r>
         <w:rPr>
           <w:rFonts w:ascii="Calibri" w:eastAsia="Times New Roman" w:hAnsi="Calibri" w:cs="Calibri"/>
@@ -4144,28 +6223,63 @@
           <w:lang w:val="en-IN" w:eastAsia="en-IN"/>
           <w14:ligatures w14:val="none"/>
         </w:rPr>
-        <w:t>Installment 24:</w:t>
-      </w:r>
-    </w:p>
-    <w:p>
-      <w:pPr>
-        <w:rPr>
-          <w:rFonts w:ascii="Calibri" w:eastAsia="Times New Roman" w:hAnsi="Calibri" w:cs="Calibri"/>
-          <w:color w:val="000000"/>
-          <w:kern w:val="0"/>
-          <w:lang w:val="en-IN" w:eastAsia="en-IN"/>
-          <w14:ligatures w14:val="none"/>
-        </w:rPr>
-      </w:pPr>
-      <w:r>
-        <w:rPr>
-          <w:rFonts w:ascii="Calibri" w:eastAsia="Times New Roman" w:hAnsi="Calibri" w:cs="Calibri"/>
-          <w:color w:val="000000"/>
-          <w:kern w:val="0"/>
-          <w:lang w:val="en-IN" w:eastAsia="en-IN"/>
-          <w14:ligatures w14:val="none"/>
-        </w:rPr>
-        <w:t>In the Biomarker_Prospective_Study_Cancer sub-folder, there is a CSV file called “</w:t>
+        <w:t>Installment</w:t>
+      </w:r>
+      <w:proofErr w:type="spellEnd"/>
+      <w:r>
+        <w:rPr>
+          <w:rFonts w:ascii="Calibri" w:eastAsia="Times New Roman" w:hAnsi="Calibri" w:cs="Calibri"/>
+          <w:b/>
+          <w:bCs/>
+          <w:color w:val="000000"/>
+          <w:kern w:val="0"/>
+          <w:lang w:val="en-IN" w:eastAsia="en-IN"/>
+          <w14:ligatures w14:val="none"/>
+        </w:rPr>
+        <w:t xml:space="preserve"> 24:</w:t>
+      </w:r>
+    </w:p>
+    <w:p>
+      <w:pPr>
+        <w:rPr>
+          <w:rFonts w:ascii="Calibri" w:eastAsia="Times New Roman" w:hAnsi="Calibri" w:cs="Calibri"/>
+          <w:color w:val="000000"/>
+          <w:kern w:val="0"/>
+          <w:lang w:val="en-IN" w:eastAsia="en-IN"/>
+          <w14:ligatures w14:val="none"/>
+        </w:rPr>
+      </w:pPr>
+      <w:r>
+        <w:rPr>
+          <w:rFonts w:ascii="Calibri" w:eastAsia="Times New Roman" w:hAnsi="Calibri" w:cs="Calibri"/>
+          <w:color w:val="000000"/>
+          <w:kern w:val="0"/>
+          <w:lang w:val="en-IN" w:eastAsia="en-IN"/>
+          <w14:ligatures w14:val="none"/>
+        </w:rPr>
+        <w:t xml:space="preserve">In the </w:t>
+      </w:r>
+      <w:proofErr w:type="spellStart"/>
+      <w:r>
+        <w:rPr>
+          <w:rFonts w:ascii="Calibri" w:eastAsia="Times New Roman" w:hAnsi="Calibri" w:cs="Calibri"/>
+          <w:color w:val="000000"/>
+          <w:kern w:val="0"/>
+          <w:lang w:val="en-IN" w:eastAsia="en-IN"/>
+          <w14:ligatures w14:val="none"/>
+        </w:rPr>
+        <w:t>Biomarker_Prospective_Study_Cancer</w:t>
+      </w:r>
+      <w:proofErr w:type="spellEnd"/>
+      <w:r>
+        <w:rPr>
+          <w:rFonts w:ascii="Calibri" w:eastAsia="Times New Roman" w:hAnsi="Calibri" w:cs="Calibri"/>
+          <w:color w:val="000000"/>
+          <w:kern w:val="0"/>
+          <w:lang w:val="en-IN" w:eastAsia="en-IN"/>
+          <w14:ligatures w14:val="none"/>
+        </w:rPr>
+        <w:t xml:space="preserve"> sub-folder, there is a CSV file called “</w:t>
       </w:r>
       <w:r>
         <w:rPr>
@@ -4269,6 +6383,7 @@
         </w:rPr>
         <w:t xml:space="preserve"> Below this message will be a large rectangular display panel (wider than it is tall) that will display the contents of the </w:t>
       </w:r>
+      <w:proofErr w:type="spellStart"/>
       <w:r>
         <w:rPr>
           <w:rFonts w:ascii="Calibri" w:eastAsia="Times New Roman" w:hAnsi="Calibri" w:cs="Calibri"/>
@@ -4279,6 +6394,7 @@
         </w:rPr>
         <w:t>Biomarkers_in_Cancer_Prospective_Studies_Data_Table</w:t>
       </w:r>
+      <w:proofErr w:type="spellEnd"/>
       <w:r>
         <w:rPr>
           <w:rFonts w:ascii="Calibri" w:eastAsia="Times New Roman" w:hAnsi="Calibri" w:cs="Calibri"/>
@@ -4297,37 +6413,213 @@
           <w:lang w:val="en-IN" w:eastAsia="en-IN"/>
           <w14:ligatures w14:val="none"/>
         </w:rPr>
-        <w:t xml:space="preserve">The panel will bear a label just above it, and left-aligned, that will read “Biomarker Data From Literature”. </w:t>
-      </w:r>
-      <w:r>
-        <w:rPr>
-          <w:rFonts w:ascii="Calibri" w:eastAsia="Times New Roman" w:hAnsi="Calibri" w:cs="Calibri"/>
-          <w:color w:val="000000"/>
-          <w:kern w:val="0"/>
-          <w:lang w:val="en-IN" w:eastAsia="en-IN"/>
-          <w14:ligatures w14:val="none"/>
-        </w:rPr>
-        <w:t xml:space="preserve">The Protein_Gene_or_Other, Predictive_Prognostic_or_Diagnostic, Type_of_Cancer_or_Disease, Year_of_Publication, and Country_of_Participants fields of the displayed table in the display panel </w:t>
-      </w:r>
-      <w:r>
-        <w:rPr>
-          <w:rFonts w:ascii="Calibri" w:eastAsia="Times New Roman" w:hAnsi="Calibri" w:cs="Calibri"/>
-          <w:color w:val="000000"/>
-          <w:kern w:val="0"/>
-          <w:lang w:val="en-IN" w:eastAsia="en-IN"/>
-          <w14:ligatures w14:val="none"/>
-        </w:rPr>
-        <w:t xml:space="preserve">will each have a drop-down menu-indicating downward arrow, like the one for the Year_of_Publication field in the tabular display panel in the Cancer Proteomics section. The drop-down menus that are displayed by clicking on these field titles/headers bearing the drop-down menu downward arrow icon will display a non-redundant list of values from the corresponding column, arranged in descending alphabetical order for all these drop-down menu-bearing fields, except for Year_of_Publication, which will have its drop-down menu options arranged in a top-to-bottom descending order of values. All of these drop-down menus will also display an option called “All” at the top of the menu. Clicking on the “All” option of one of these drop-down menus resets the table to display all </w:t>
-      </w:r>
-      <w:r>
-        <w:rPr>
-          <w:rFonts w:ascii="Calibri" w:eastAsia="Times New Roman" w:hAnsi="Calibri" w:cs="Calibri"/>
-          <w:color w:val="000000"/>
-          <w:kern w:val="0"/>
-          <w:lang w:val="en-IN" w:eastAsia="en-IN"/>
-          <w14:ligatures w14:val="none"/>
-        </w:rPr>
-        <w:t>the rows, showing all the available values of the same column, except those rows currently hidden by the filtering logic of the other drop-down menus in the table. Clicking on any other option- besides “All”- in any of these drop-down menus causes the rows to be filtered to only display rows that contain exactly the same value, in the same column, as the option of the drop-down menu that was clicked. Add a button labelled “Download Displayed Biomarker Data From Literature” just below the display panel. Clicking on the button triggers a download of any currently displayed tabular data in the panel, as an output CSV file named “Biomarker_Data_From_Literature.csv”.</w:t>
+        <w:t xml:space="preserve">The panel will bear a label just above it, and left-aligned, that will read “Biomarker Data </w:t>
+      </w:r>
+      <w:proofErr w:type="gramStart"/>
+      <w:r>
+        <w:rPr>
+          <w:rFonts w:ascii="Calibri" w:eastAsia="Times New Roman" w:hAnsi="Calibri" w:cs="Calibri"/>
+          <w:color w:val="000000"/>
+          <w:kern w:val="0"/>
+          <w:lang w:val="en-IN" w:eastAsia="en-IN"/>
+          <w14:ligatures w14:val="none"/>
+        </w:rPr>
+        <w:t>From</w:t>
+      </w:r>
+      <w:proofErr w:type="gramEnd"/>
+      <w:r>
+        <w:rPr>
+          <w:rFonts w:ascii="Calibri" w:eastAsia="Times New Roman" w:hAnsi="Calibri" w:cs="Calibri"/>
+          <w:color w:val="000000"/>
+          <w:kern w:val="0"/>
+          <w:lang w:val="en-IN" w:eastAsia="en-IN"/>
+          <w14:ligatures w14:val="none"/>
+        </w:rPr>
+        <w:t xml:space="preserve"> Literature”. </w:t>
+      </w:r>
+      <w:r>
+        <w:rPr>
+          <w:rFonts w:ascii="Calibri" w:eastAsia="Times New Roman" w:hAnsi="Calibri" w:cs="Calibri"/>
+          <w:color w:val="000000"/>
+          <w:kern w:val="0"/>
+          <w:lang w:val="en-IN" w:eastAsia="en-IN"/>
+          <w14:ligatures w14:val="none"/>
+        </w:rPr>
+        <w:t xml:space="preserve">The Protein_Gene_or_Other, </w:t>
+      </w:r>
+      <w:proofErr w:type="spellStart"/>
+      <w:r>
+        <w:rPr>
+          <w:rFonts w:ascii="Calibri" w:eastAsia="Times New Roman" w:hAnsi="Calibri" w:cs="Calibri"/>
+          <w:color w:val="000000"/>
+          <w:kern w:val="0"/>
+          <w:lang w:val="en-IN" w:eastAsia="en-IN"/>
+          <w14:ligatures w14:val="none"/>
+        </w:rPr>
+        <w:t>Predictive_Prognostic_or_Diagnostic</w:t>
+      </w:r>
+      <w:proofErr w:type="spellEnd"/>
+      <w:r>
+        <w:rPr>
+          <w:rFonts w:ascii="Calibri" w:eastAsia="Times New Roman" w:hAnsi="Calibri" w:cs="Calibri"/>
+          <w:color w:val="000000"/>
+          <w:kern w:val="0"/>
+          <w:lang w:val="en-IN" w:eastAsia="en-IN"/>
+          <w14:ligatures w14:val="none"/>
+        </w:rPr>
+        <w:t xml:space="preserve">, </w:t>
+      </w:r>
+      <w:proofErr w:type="spellStart"/>
+      <w:r>
+        <w:rPr>
+          <w:rFonts w:ascii="Calibri" w:eastAsia="Times New Roman" w:hAnsi="Calibri" w:cs="Calibri"/>
+          <w:color w:val="000000"/>
+          <w:kern w:val="0"/>
+          <w:lang w:val="en-IN" w:eastAsia="en-IN"/>
+          <w14:ligatures w14:val="none"/>
+        </w:rPr>
+        <w:t>Type_of_Cancer_or_Disease</w:t>
+      </w:r>
+      <w:proofErr w:type="spellEnd"/>
+      <w:r>
+        <w:rPr>
+          <w:rFonts w:ascii="Calibri" w:eastAsia="Times New Roman" w:hAnsi="Calibri" w:cs="Calibri"/>
+          <w:color w:val="000000"/>
+          <w:kern w:val="0"/>
+          <w:lang w:val="en-IN" w:eastAsia="en-IN"/>
+          <w14:ligatures w14:val="none"/>
+        </w:rPr>
+        <w:t xml:space="preserve">, </w:t>
+      </w:r>
+      <w:proofErr w:type="spellStart"/>
+      <w:r>
+        <w:rPr>
+          <w:rFonts w:ascii="Calibri" w:eastAsia="Times New Roman" w:hAnsi="Calibri" w:cs="Calibri"/>
+          <w:color w:val="000000"/>
+          <w:kern w:val="0"/>
+          <w:lang w:val="en-IN" w:eastAsia="en-IN"/>
+          <w14:ligatures w14:val="none"/>
+        </w:rPr>
+        <w:t>Year_of_Publication</w:t>
+      </w:r>
+      <w:proofErr w:type="spellEnd"/>
+      <w:r>
+        <w:rPr>
+          <w:rFonts w:ascii="Calibri" w:eastAsia="Times New Roman" w:hAnsi="Calibri" w:cs="Calibri"/>
+          <w:color w:val="000000"/>
+          <w:kern w:val="0"/>
+          <w:lang w:val="en-IN" w:eastAsia="en-IN"/>
+          <w14:ligatures w14:val="none"/>
+        </w:rPr>
+        <w:t xml:space="preserve">, and </w:t>
+      </w:r>
+      <w:proofErr w:type="spellStart"/>
+      <w:r>
+        <w:rPr>
+          <w:rFonts w:ascii="Calibri" w:eastAsia="Times New Roman" w:hAnsi="Calibri" w:cs="Calibri"/>
+          <w:color w:val="000000"/>
+          <w:kern w:val="0"/>
+          <w:lang w:val="en-IN" w:eastAsia="en-IN"/>
+          <w14:ligatures w14:val="none"/>
+        </w:rPr>
+        <w:t>Country_of_Participants</w:t>
+      </w:r>
+      <w:proofErr w:type="spellEnd"/>
+      <w:r>
+        <w:rPr>
+          <w:rFonts w:ascii="Calibri" w:eastAsia="Times New Roman" w:hAnsi="Calibri" w:cs="Calibri"/>
+          <w:color w:val="000000"/>
+          <w:kern w:val="0"/>
+          <w:lang w:val="en-IN" w:eastAsia="en-IN"/>
+          <w14:ligatures w14:val="none"/>
+        </w:rPr>
+        <w:t xml:space="preserve"> fields of the displayed table in the display panel </w:t>
+      </w:r>
+      <w:r>
+        <w:rPr>
+          <w:rFonts w:ascii="Calibri" w:eastAsia="Times New Roman" w:hAnsi="Calibri" w:cs="Calibri"/>
+          <w:color w:val="000000"/>
+          <w:kern w:val="0"/>
+          <w:lang w:val="en-IN" w:eastAsia="en-IN"/>
+          <w14:ligatures w14:val="none"/>
+        </w:rPr>
+        <w:t xml:space="preserve">will each have a drop-down menu-indicating downward arrow, like the one for the </w:t>
+      </w:r>
+      <w:proofErr w:type="spellStart"/>
+      <w:r>
+        <w:rPr>
+          <w:rFonts w:ascii="Calibri" w:eastAsia="Times New Roman" w:hAnsi="Calibri" w:cs="Calibri"/>
+          <w:color w:val="000000"/>
+          <w:kern w:val="0"/>
+          <w:lang w:val="en-IN" w:eastAsia="en-IN"/>
+          <w14:ligatures w14:val="none"/>
+        </w:rPr>
+        <w:t>Year_of_Publication</w:t>
+      </w:r>
+      <w:proofErr w:type="spellEnd"/>
+      <w:r>
+        <w:rPr>
+          <w:rFonts w:ascii="Calibri" w:eastAsia="Times New Roman" w:hAnsi="Calibri" w:cs="Calibri"/>
+          <w:color w:val="000000"/>
+          <w:kern w:val="0"/>
+          <w:lang w:val="en-IN" w:eastAsia="en-IN"/>
+          <w14:ligatures w14:val="none"/>
+        </w:rPr>
+        <w:t xml:space="preserve"> field in the tabular display panel in the Cancer Proteomics section. The drop-down menus that are displayed by clicking on these field titles/headers bearing the drop-down menu downward arrow icon will display a non-redundant list of values from the corresponding column, arranged in descending alphabetical order for all these drop-down menu-bearing fields, except for </w:t>
+      </w:r>
+      <w:proofErr w:type="spellStart"/>
+      <w:r>
+        <w:rPr>
+          <w:rFonts w:ascii="Calibri" w:eastAsia="Times New Roman" w:hAnsi="Calibri" w:cs="Calibri"/>
+          <w:color w:val="000000"/>
+          <w:kern w:val="0"/>
+          <w:lang w:val="en-IN" w:eastAsia="en-IN"/>
+          <w14:ligatures w14:val="none"/>
+        </w:rPr>
+        <w:t>Year_of_Publication</w:t>
+      </w:r>
+      <w:proofErr w:type="spellEnd"/>
+      <w:r>
+        <w:rPr>
+          <w:rFonts w:ascii="Calibri" w:eastAsia="Times New Roman" w:hAnsi="Calibri" w:cs="Calibri"/>
+          <w:color w:val="000000"/>
+          <w:kern w:val="0"/>
+          <w:lang w:val="en-IN" w:eastAsia="en-IN"/>
+          <w14:ligatures w14:val="none"/>
+        </w:rPr>
+        <w:t xml:space="preserve">, which will have its drop-down menu options arranged in a top-to-bottom descending order of values. All of these drop-down menus will also display an option called “All” at the top of the menu. Clicking on the “All” option of one of these drop-down menus resets the table to display all </w:t>
+      </w:r>
+      <w:r>
+        <w:rPr>
+          <w:rFonts w:ascii="Calibri" w:eastAsia="Times New Roman" w:hAnsi="Calibri" w:cs="Calibri"/>
+          <w:color w:val="000000"/>
+          <w:kern w:val="0"/>
+          <w:lang w:val="en-IN" w:eastAsia="en-IN"/>
+          <w14:ligatures w14:val="none"/>
+        </w:rPr>
+        <w:t xml:space="preserve">the rows, showing all the available values of the same column, except those rows currently hidden by the filtering logic of the other drop-down menus in the table. Clicking on any other option- besides “All”- in any of these drop-down menus causes the rows to be filtered to only display rows that contain exactly the same value, in the same column, as the option of the drop-down menu that was clicked. Add a button labelled “Download Displayed Biomarker Data </w:t>
+      </w:r>
+      <w:proofErr w:type="gramStart"/>
+      <w:r>
+        <w:rPr>
+          <w:rFonts w:ascii="Calibri" w:eastAsia="Times New Roman" w:hAnsi="Calibri" w:cs="Calibri"/>
+          <w:color w:val="000000"/>
+          <w:kern w:val="0"/>
+          <w:lang w:val="en-IN" w:eastAsia="en-IN"/>
+          <w14:ligatures w14:val="none"/>
+        </w:rPr>
+        <w:t>From</w:t>
+      </w:r>
+      <w:proofErr w:type="gramEnd"/>
+      <w:r>
+        <w:rPr>
+          <w:rFonts w:ascii="Calibri" w:eastAsia="Times New Roman" w:hAnsi="Calibri" w:cs="Calibri"/>
+          <w:color w:val="000000"/>
+          <w:kern w:val="0"/>
+          <w:lang w:val="en-IN" w:eastAsia="en-IN"/>
+          <w14:ligatures w14:val="none"/>
+        </w:rPr>
+        <w:t xml:space="preserve"> Literature” just below the display panel. Clicking on the button triggers a download of any currently displayed tabular data in the panel, as an output CSV file named “Biomarker_Data_From_Literature.csv”.</w:t>
       </w:r>
     </w:p>
     <w:p>
@@ -4361,6 +6653,7 @@
         </w:rPr>
         <w:t xml:space="preserve">From the </w:t>
       </w:r>
+      <w:proofErr w:type="spellStart"/>
       <w:r>
         <w:rPr>
           <w:rFonts w:ascii="Calibri" w:eastAsia="Times New Roman" w:hAnsi="Calibri" w:cs="Calibri"/>
@@ -4371,15 +6664,27 @@
         </w:rPr>
         <w:t>Biomarkers_in_Cancer_Prospective_Studies_Data_Table</w:t>
       </w:r>
-      <w:r>
-        <w:rPr>
-          <w:rFonts w:ascii="Calibri" w:eastAsia="Times New Roman" w:hAnsi="Calibri" w:cs="Calibri"/>
-          <w:color w:val="000000"/>
-          <w:kern w:val="0"/>
-          <w:lang w:val="en-IN" w:eastAsia="en-IN"/>
-          <w14:ligatures w14:val="none"/>
-        </w:rPr>
-        <w:t xml:space="preserve"> table in the SQL database, make two derivative tables in the database called Gene_</w:t>
+      <w:proofErr w:type="spellEnd"/>
+      <w:r>
+        <w:rPr>
+          <w:rFonts w:ascii="Calibri" w:eastAsia="Times New Roman" w:hAnsi="Calibri" w:cs="Calibri"/>
+          <w:color w:val="000000"/>
+          <w:kern w:val="0"/>
+          <w:lang w:val="en-IN" w:eastAsia="en-IN"/>
+          <w14:ligatures w14:val="none"/>
+        </w:rPr>
+        <w:t xml:space="preserve"> table in the SQL database, make two derivative tables in the database called </w:t>
+      </w:r>
+      <w:proofErr w:type="spellStart"/>
+      <w:r>
+        <w:rPr>
+          <w:rFonts w:ascii="Calibri" w:eastAsia="Times New Roman" w:hAnsi="Calibri" w:cs="Calibri"/>
+          <w:color w:val="000000"/>
+          <w:kern w:val="0"/>
+          <w:lang w:val="en-IN" w:eastAsia="en-IN"/>
+          <w14:ligatures w14:val="none"/>
+        </w:rPr>
+        <w:t>Gene_</w:t>
       </w:r>
       <w:r>
         <w:rPr>
@@ -4391,15 +6696,27 @@
         </w:rPr>
         <w:t>Biomarkers_in_Cancer_Prospective_Studies_Data_Table</w:t>
       </w:r>
-      <w:r>
-        <w:rPr>
-          <w:rFonts w:ascii="Calibri" w:eastAsia="Times New Roman" w:hAnsi="Calibri" w:cs="Calibri"/>
-          <w:color w:val="000000"/>
-          <w:kern w:val="0"/>
-          <w:lang w:val="en-IN" w:eastAsia="en-IN"/>
-          <w14:ligatures w14:val="none"/>
-        </w:rPr>
-        <w:t xml:space="preserve"> and Protein_</w:t>
+      <w:proofErr w:type="spellEnd"/>
+      <w:r>
+        <w:rPr>
+          <w:rFonts w:ascii="Calibri" w:eastAsia="Times New Roman" w:hAnsi="Calibri" w:cs="Calibri"/>
+          <w:color w:val="000000"/>
+          <w:kern w:val="0"/>
+          <w:lang w:val="en-IN" w:eastAsia="en-IN"/>
+          <w14:ligatures w14:val="none"/>
+        </w:rPr>
+        <w:t xml:space="preserve"> and </w:t>
+      </w:r>
+      <w:proofErr w:type="spellStart"/>
+      <w:r>
+        <w:rPr>
+          <w:rFonts w:ascii="Calibri" w:eastAsia="Times New Roman" w:hAnsi="Calibri" w:cs="Calibri"/>
+          <w:color w:val="000000"/>
+          <w:kern w:val="0"/>
+          <w:lang w:val="en-IN" w:eastAsia="en-IN"/>
+          <w14:ligatures w14:val="none"/>
+        </w:rPr>
+        <w:t>Protein_</w:t>
       </w:r>
       <w:r>
         <w:rPr>
@@ -4411,6 +6728,7 @@
         </w:rPr>
         <w:t>Biomarkers_in_Cancer_Prospective_Studies_Data_Table</w:t>
       </w:r>
+      <w:proofErr w:type="spellEnd"/>
       <w:r>
         <w:rPr>
           <w:rFonts w:ascii="Calibri" w:eastAsia="Times New Roman" w:hAnsi="Calibri" w:cs="Calibri"/>
@@ -4440,7 +6758,51 @@
           <w:lang w:val="en-IN" w:eastAsia="en-IN"/>
           <w14:ligatures w14:val="none"/>
         </w:rPr>
-        <w:t>Gene Biomarker Data From Literature”, while the “Cancer Proteomics” drop-down menu will offer the options “Differential Protein Expression” and “Protein Biomarker Data From Literature”. Clicking on the respective ‘Gene/Protein Differential Expression’ options of these two top-level options’ drop-down menus leads to a section below the top-</w:t>
+        <w:t xml:space="preserve">Gene Biomarker Data </w:t>
+      </w:r>
+      <w:proofErr w:type="gramStart"/>
+      <w:r>
+        <w:rPr>
+          <w:rFonts w:ascii="Calibri" w:eastAsia="Times New Roman" w:hAnsi="Calibri" w:cs="Calibri"/>
+          <w:color w:val="000000"/>
+          <w:kern w:val="0"/>
+          <w:lang w:val="en-IN" w:eastAsia="en-IN"/>
+          <w14:ligatures w14:val="none"/>
+        </w:rPr>
+        <w:t>From</w:t>
+      </w:r>
+      <w:proofErr w:type="gramEnd"/>
+      <w:r>
+        <w:rPr>
+          <w:rFonts w:ascii="Calibri" w:eastAsia="Times New Roman" w:hAnsi="Calibri" w:cs="Calibri"/>
+          <w:color w:val="000000"/>
+          <w:kern w:val="0"/>
+          <w:lang w:val="en-IN" w:eastAsia="en-IN"/>
+          <w14:ligatures w14:val="none"/>
+        </w:rPr>
+        <w:t xml:space="preserve"> Literature”, while the “Cancer Proteomics” drop-down menu will offer the options “Differential Protein Expression” and “Protein Biomarker Data </w:t>
+      </w:r>
+      <w:proofErr w:type="gramStart"/>
+      <w:r>
+        <w:rPr>
+          <w:rFonts w:ascii="Calibri" w:eastAsia="Times New Roman" w:hAnsi="Calibri" w:cs="Calibri"/>
+          <w:color w:val="000000"/>
+          <w:kern w:val="0"/>
+          <w:lang w:val="en-IN" w:eastAsia="en-IN"/>
+          <w14:ligatures w14:val="none"/>
+        </w:rPr>
+        <w:t>From</w:t>
+      </w:r>
+      <w:proofErr w:type="gramEnd"/>
+      <w:r>
+        <w:rPr>
+          <w:rFonts w:ascii="Calibri" w:eastAsia="Times New Roman" w:hAnsi="Calibri" w:cs="Calibri"/>
+          <w:color w:val="000000"/>
+          <w:kern w:val="0"/>
+          <w:lang w:val="en-IN" w:eastAsia="en-IN"/>
+          <w14:ligatures w14:val="none"/>
+        </w:rPr>
+        <w:t xml:space="preserve"> Literature”. Clicking on the respective ‘Gene/Protein Differential Expression’ options of these two top-level options’ drop-down menus leads to a section below the top-</w:t>
       </w:r>
       <w:r>
         <w:rPr>
@@ -4480,28 +6842,9 @@
           <w:lang w:val="en-IN" w:eastAsia="en-IN"/>
           <w14:ligatures w14:val="none"/>
         </w:rPr>
-        <w:t xml:space="preserve">. Clicking on the respective ‘Gene/Protein Biomarker Data From Literature’ options causes the screen below the top-level menu to be replaced by the same one as that configured for the Diagnostics section, but with the large </w:t>
-      </w:r>
-      <w:r>
-        <w:rPr>
-          <w:rFonts w:ascii="Calibri" w:eastAsia="Times New Roman" w:hAnsi="Calibri" w:cs="Calibri"/>
-          <w:color w:val="000000"/>
-          <w:kern w:val="0"/>
-          <w:lang w:val="en-IN" w:eastAsia="en-IN"/>
-          <w14:ligatures w14:val="none"/>
-        </w:rPr>
-        <w:t>“Biomarker Data From Literature”</w:t>
-      </w:r>
-      <w:r>
-        <w:rPr>
-          <w:rFonts w:ascii="Calibri" w:eastAsia="Times New Roman" w:hAnsi="Calibri" w:cs="Calibri"/>
-          <w:color w:val="000000"/>
-          <w:kern w:val="0"/>
-          <w:lang w:val="en-IN" w:eastAsia="en-IN"/>
-          <w14:ligatures w14:val="none"/>
-        </w:rPr>
-        <w:t xml:space="preserve"> display panel displaying the data from the </w:t>
-      </w:r>
+        <w:t xml:space="preserve">. Clicking on the respective ‘Gene/Protein Biomarker Data From Literature’ options causes the screen below the top-level menu to be replaced by the same one as that configured for the Diagnostics section, but with the large “Biomarker Data From Literature” display panel displaying the data from the </w:t>
+      </w:r>
+      <w:proofErr w:type="spellStart"/>
       <w:r>
         <w:rPr>
           <w:rFonts w:ascii="Calibri" w:eastAsia="Times New Roman" w:hAnsi="Calibri" w:cs="Calibri"/>
@@ -4522,15 +6865,27 @@
         </w:rPr>
         <w:t>Biomarkers_in_Cancer_Prospective_Studies_Data_Table</w:t>
       </w:r>
-      <w:r>
-        <w:rPr>
-          <w:rFonts w:ascii="Calibri" w:eastAsia="Times New Roman" w:hAnsi="Calibri" w:cs="Calibri"/>
-          <w:color w:val="000000"/>
-          <w:kern w:val="0"/>
-          <w:lang w:val="en-IN" w:eastAsia="en-IN"/>
-          <w14:ligatures w14:val="none"/>
-        </w:rPr>
-        <w:t xml:space="preserve"> and Protein_</w:t>
+      <w:proofErr w:type="spellEnd"/>
+      <w:r>
+        <w:rPr>
+          <w:rFonts w:ascii="Calibri" w:eastAsia="Times New Roman" w:hAnsi="Calibri" w:cs="Calibri"/>
+          <w:color w:val="000000"/>
+          <w:kern w:val="0"/>
+          <w:lang w:val="en-IN" w:eastAsia="en-IN"/>
+          <w14:ligatures w14:val="none"/>
+        </w:rPr>
+        <w:t xml:space="preserve"> and </w:t>
+      </w:r>
+      <w:proofErr w:type="spellStart"/>
+      <w:r>
+        <w:rPr>
+          <w:rFonts w:ascii="Calibri" w:eastAsia="Times New Roman" w:hAnsi="Calibri" w:cs="Calibri"/>
+          <w:color w:val="000000"/>
+          <w:kern w:val="0"/>
+          <w:lang w:val="en-IN" w:eastAsia="en-IN"/>
+          <w14:ligatures w14:val="none"/>
+        </w:rPr>
+        <w:t>Protein_</w:t>
       </w:r>
       <w:r>
         <w:rPr>
@@ -4542,6 +6897,7 @@
         </w:rPr>
         <w:t>Biomarkers_in_Cancer_Prospective_Studies_Data_Table</w:t>
       </w:r>
+      <w:proofErr w:type="spellEnd"/>
       <w:r>
         <w:rPr>
           <w:rFonts w:ascii="Calibri" w:eastAsia="Times New Roman" w:hAnsi="Calibri" w:cs="Calibri"/>
@@ -4560,27 +6916,7 @@
           <w:lang w:val="en-IN" w:eastAsia="en-IN"/>
           <w14:ligatures w14:val="none"/>
         </w:rPr>
-        <w:t xml:space="preserve">, and the </w:t>
-      </w:r>
-      <w:r>
-        <w:rPr>
-          <w:rFonts w:ascii="Calibri" w:eastAsia="Times New Roman" w:hAnsi="Calibri" w:cs="Calibri"/>
-          <w:color w:val="000000"/>
-          <w:kern w:val="0"/>
-          <w:lang w:val="en-IN" w:eastAsia="en-IN"/>
-          <w14:ligatures w14:val="none"/>
-        </w:rPr>
-        <w:t>“Download Displayed Biomarker Data From Literature”</w:t>
-      </w:r>
-      <w:r>
-        <w:rPr>
-          <w:rFonts w:ascii="Calibri" w:eastAsia="Times New Roman" w:hAnsi="Calibri" w:cs="Calibri"/>
-          <w:color w:val="000000"/>
-          <w:kern w:val="0"/>
-          <w:lang w:val="en-IN" w:eastAsia="en-IN"/>
-          <w14:ligatures w14:val="none"/>
-        </w:rPr>
-        <w:t xml:space="preserve"> button has the string “Gene ” or the string “Protein ” </w:t>
+        <w:t xml:space="preserve">, and the “Download Displayed Biomarker Data From Literature” button has the string “Gene ” or the string “Protein ” </w:t>
       </w:r>
       <w:r>
         <w:rPr>
@@ -4632,6 +6968,7 @@
         </w:rPr>
         <w:t xml:space="preserve"> The </w:t>
       </w:r>
+      <w:proofErr w:type="spellStart"/>
       <w:r>
         <w:rPr>
           <w:rFonts w:ascii="Calibri" w:eastAsia="Times New Roman" w:hAnsi="Calibri" w:cs="Calibri"/>
@@ -4642,6 +6979,7 @@
         </w:rPr>
         <w:t>Biomarkers_in_Cancer_Prospective_Studies_Data_Table</w:t>
       </w:r>
+      <w:proofErr w:type="spellEnd"/>
       <w:r>
         <w:rPr>
           <w:rFonts w:ascii="Calibri" w:eastAsia="Times New Roman" w:hAnsi="Calibri" w:cs="Calibri"/>
@@ -4652,6 +6990,7 @@
         </w:rPr>
         <w:t xml:space="preserve">, </w:t>
       </w:r>
+      <w:proofErr w:type="spellStart"/>
       <w:r>
         <w:rPr>
           <w:rFonts w:ascii="Calibri" w:eastAsia="Times New Roman" w:hAnsi="Calibri" w:cs="Calibri"/>
@@ -4672,25 +7011,27 @@
         </w:rPr>
         <w:t>Biomarkers_in_Cancer_Prospective_Studies_Data_Table</w:t>
       </w:r>
-      <w:r>
-        <w:rPr>
-          <w:rFonts w:ascii="Calibri" w:eastAsia="Times New Roman" w:hAnsi="Calibri" w:cs="Calibri"/>
-          <w:color w:val="000000"/>
-          <w:kern w:val="0"/>
-          <w:lang w:val="en-IN" w:eastAsia="en-IN"/>
-          <w14:ligatures w14:val="none"/>
-        </w:rPr>
-        <w:t>,</w:t>
-      </w:r>
-      <w:r>
-        <w:rPr>
-          <w:rFonts w:ascii="Calibri" w:eastAsia="Times New Roman" w:hAnsi="Calibri" w:cs="Calibri"/>
-          <w:color w:val="000000"/>
-          <w:kern w:val="0"/>
-          <w:lang w:val="en-IN" w:eastAsia="en-IN"/>
-          <w14:ligatures w14:val="none"/>
-        </w:rPr>
-        <w:t xml:space="preserve"> and Protein_</w:t>
+      <w:proofErr w:type="spellEnd"/>
+      <w:r>
+        <w:rPr>
+          <w:rFonts w:ascii="Calibri" w:eastAsia="Times New Roman" w:hAnsi="Calibri" w:cs="Calibri"/>
+          <w:color w:val="000000"/>
+          <w:kern w:val="0"/>
+          <w:lang w:val="en-IN" w:eastAsia="en-IN"/>
+          <w14:ligatures w14:val="none"/>
+        </w:rPr>
+        <w:t xml:space="preserve">, and </w:t>
+      </w:r>
+      <w:proofErr w:type="spellStart"/>
+      <w:r>
+        <w:rPr>
+          <w:rFonts w:ascii="Calibri" w:eastAsia="Times New Roman" w:hAnsi="Calibri" w:cs="Calibri"/>
+          <w:color w:val="000000"/>
+          <w:kern w:val="0"/>
+          <w:lang w:val="en-IN" w:eastAsia="en-IN"/>
+          <w14:ligatures w14:val="none"/>
+        </w:rPr>
+        <w:t>Protein_</w:t>
       </w:r>
       <w:r>
         <w:rPr>
@@ -4702,25 +7043,16 @@
         </w:rPr>
         <w:t>Biomarkers_in_Cancer_Prospective_Studies_Data_Table</w:t>
       </w:r>
-      <w:r>
-        <w:rPr>
-          <w:rFonts w:ascii="Calibri" w:eastAsia="Times New Roman" w:hAnsi="Calibri" w:cs="Calibri"/>
-          <w:color w:val="000000"/>
-          <w:kern w:val="0"/>
-          <w:lang w:val="en-IN" w:eastAsia="en-IN"/>
-          <w14:ligatures w14:val="none"/>
-        </w:rPr>
-        <w:t xml:space="preserve"> tables</w:t>
-      </w:r>
-      <w:r>
-        <w:rPr>
-          <w:rFonts w:ascii="Calibri" w:eastAsia="Times New Roman" w:hAnsi="Calibri" w:cs="Calibri"/>
-          <w:color w:val="000000"/>
-          <w:kern w:val="0"/>
-          <w:lang w:val="en-IN" w:eastAsia="en-IN"/>
-          <w14:ligatures w14:val="none"/>
-        </w:rPr>
-        <w:t xml:space="preserve"> </w:t>
+      <w:proofErr w:type="spellEnd"/>
+      <w:r>
+        <w:rPr>
+          <w:rFonts w:ascii="Calibri" w:eastAsia="Times New Roman" w:hAnsi="Calibri" w:cs="Calibri"/>
+          <w:color w:val="000000"/>
+          <w:kern w:val="0"/>
+          <w:lang w:val="en-IN" w:eastAsia="en-IN"/>
+          <w14:ligatures w14:val="none"/>
+        </w:rPr>
+        <w:t xml:space="preserve"> tables </w:t>
       </w:r>
       <w:r>
         <w:rPr>
@@ -4766,6 +7098,7 @@
           <w14:ligatures w14:val="none"/>
         </w:rPr>
       </w:pPr>
+      <w:proofErr w:type="spellStart"/>
       <w:r>
         <w:rPr>
           <w:rFonts w:ascii="Calibri" w:eastAsia="Times New Roman" w:hAnsi="Calibri" w:cs="Calibri"/>
@@ -4776,7 +7109,20 @@
           <w:lang w:val="en-IN" w:eastAsia="en-IN"/>
           <w14:ligatures w14:val="none"/>
         </w:rPr>
-        <w:t>Installment 25:</w:t>
+        <w:t>Installment</w:t>
+      </w:r>
+      <w:proofErr w:type="spellEnd"/>
+      <w:r>
+        <w:rPr>
+          <w:rFonts w:ascii="Calibri" w:eastAsia="Times New Roman" w:hAnsi="Calibri" w:cs="Calibri"/>
+          <w:b/>
+          <w:bCs/>
+          <w:color w:val="000000"/>
+          <w:kern w:val="0"/>
+          <w:lang w:val="en-IN" w:eastAsia="en-IN"/>
+          <w14:ligatures w14:val="none"/>
+        </w:rPr>
+        <w:t xml:space="preserve"> 25:</w:t>
       </w:r>
     </w:p>
     <w:p>
@@ -4839,17 +7185,760 @@
           <w:lang w:val="en-IN" w:eastAsia="en-IN"/>
           <w14:ligatures w14:val="none"/>
         </w:rPr>
-        <w:t>, found in the Database_Demo folder (this folder),</w:t>
-      </w:r>
-      <w:r>
-        <w:rPr>
-          <w:rFonts w:ascii="Calibri" w:eastAsia="Times New Roman" w:hAnsi="Calibri" w:cs="Calibri"/>
-          <w:color w:val="000000"/>
-          <w:kern w:val="0"/>
-          <w:lang w:val="en-IN" w:eastAsia="en-IN"/>
-          <w14:ligatures w14:val="none"/>
-        </w:rPr>
-        <w:t xml:space="preserve"> within it, after ensuring that the font size and table and cell widths and text-wrapping are optimised for ease of readability of the content. </w:t>
+        <w:t xml:space="preserve">, found in the </w:t>
+      </w:r>
+      <w:proofErr w:type="spellStart"/>
+      <w:r>
+        <w:rPr>
+          <w:rFonts w:ascii="Calibri" w:eastAsia="Times New Roman" w:hAnsi="Calibri" w:cs="Calibri"/>
+          <w:color w:val="000000"/>
+          <w:kern w:val="0"/>
+          <w:lang w:val="en-IN" w:eastAsia="en-IN"/>
+          <w14:ligatures w14:val="none"/>
+        </w:rPr>
+        <w:t>Database_Demo</w:t>
+      </w:r>
+      <w:proofErr w:type="spellEnd"/>
+      <w:r>
+        <w:rPr>
+          <w:rFonts w:ascii="Calibri" w:eastAsia="Times New Roman" w:hAnsi="Calibri" w:cs="Calibri"/>
+          <w:color w:val="000000"/>
+          <w:kern w:val="0"/>
+          <w:lang w:val="en-IN" w:eastAsia="en-IN"/>
+          <w14:ligatures w14:val="none"/>
+        </w:rPr>
+        <w:t xml:space="preserve"> folder (this folder),</w:t>
+      </w:r>
+      <w:r>
+        <w:rPr>
+          <w:rFonts w:ascii="Calibri" w:eastAsia="Times New Roman" w:hAnsi="Calibri" w:cs="Calibri"/>
+          <w:color w:val="000000"/>
+          <w:kern w:val="0"/>
+          <w:lang w:val="en-IN" w:eastAsia="en-IN"/>
+          <w14:ligatures w14:val="none"/>
+        </w:rPr>
+        <w:t xml:space="preserve"> within it, after ensuring that the font size and table and cell widths and text-wrapping are optimised for ease of readability of the content.</w:t>
+      </w:r>
+    </w:p>
+    <w:p>
+      <w:pPr>
+        <w:rPr>
+          <w:rFonts w:ascii="Calibri" w:eastAsia="Times New Roman" w:hAnsi="Calibri" w:cs="Calibri"/>
+          <w:color w:val="000000"/>
+          <w:kern w:val="0"/>
+          <w:lang w:val="en-IN" w:eastAsia="en-IN"/>
+          <w14:ligatures w14:val="none"/>
+        </w:rPr>
+      </w:pPr>
+    </w:p>
+    <w:p>
+      <w:pPr>
+        <w:rPr>
+          <w:rFonts w:ascii="Calibri" w:eastAsia="Times New Roman" w:hAnsi="Calibri" w:cs="Calibri"/>
+          <w:b/>
+          <w:bCs/>
+          <w:color w:val="000000"/>
+          <w:kern w:val="0"/>
+          <w:lang w:val="en-IN" w:eastAsia="en-IN"/>
+          <w14:ligatures w14:val="none"/>
+        </w:rPr>
+      </w:pPr>
+      <w:proofErr w:type="spellStart"/>
+      <w:r>
+        <w:rPr>
+          <w:rFonts w:ascii="Calibri" w:eastAsia="Times New Roman" w:hAnsi="Calibri" w:cs="Calibri"/>
+          <w:b/>
+          <w:bCs/>
+          <w:color w:val="000000"/>
+          <w:kern w:val="0"/>
+          <w:lang w:val="en-IN" w:eastAsia="en-IN"/>
+          <w14:ligatures w14:val="none"/>
+        </w:rPr>
+        <w:t>Installment</w:t>
+      </w:r>
+      <w:proofErr w:type="spellEnd"/>
+      <w:r>
+        <w:rPr>
+          <w:rFonts w:ascii="Calibri" w:eastAsia="Times New Roman" w:hAnsi="Calibri" w:cs="Calibri"/>
+          <w:b/>
+          <w:bCs/>
+          <w:color w:val="000000"/>
+          <w:kern w:val="0"/>
+          <w:lang w:val="en-IN" w:eastAsia="en-IN"/>
+          <w14:ligatures w14:val="none"/>
+        </w:rPr>
+        <w:t xml:space="preserve"> 26:</w:t>
+      </w:r>
+    </w:p>
+    <w:p>
+      <w:pPr>
+        <w:rPr>
+          <w:rFonts w:ascii="Calibri" w:eastAsia="Times New Roman" w:hAnsi="Calibri" w:cs="Calibri"/>
+          <w:color w:val="000000"/>
+          <w:kern w:val="0"/>
+          <w:lang w:val="en-IN" w:eastAsia="en-IN"/>
+          <w14:ligatures w14:val="none"/>
+        </w:rPr>
+      </w:pPr>
+    </w:p>
+    <w:p>
+      <w:r>
+        <w:t xml:space="preserve">All three "Biomarker Data" tables are displayed in a rather squashed manner, from side to side. Please add a horizontal scroll bar for each of those displays and adjust the text content of the displayed tables for these database tables so that </w:t>
+      </w:r>
+      <w:proofErr w:type="gramStart"/>
+      <w:r>
+        <w:t>he</w:t>
+      </w:r>
+      <w:proofErr w:type="gramEnd"/>
+      <w:r>
+        <w:t xml:space="preserve"> text is more legible and less squeezed horizontally.</w:t>
+      </w:r>
+    </w:p>
+    <w:p/>
+    <w:p>
+      <w:pPr>
+        <w:rPr>
+          <w:b/>
+          <w:bCs/>
+        </w:rPr>
+      </w:pPr>
+      <w:proofErr w:type="spellStart"/>
+      <w:r>
+        <w:rPr>
+          <w:b/>
+          <w:bCs/>
+        </w:rPr>
+        <w:t>Installment</w:t>
+      </w:r>
+      <w:proofErr w:type="spellEnd"/>
+      <w:r>
+        <w:rPr>
+          <w:b/>
+          <w:bCs/>
+        </w:rPr>
+        <w:t xml:space="preserve"> 27:</w:t>
+      </w:r>
+    </w:p>
+    <w:p/>
+    <w:p>
+      <w:pPr>
+        <w:rPr>
+          <w:rFonts w:ascii="Calibri" w:eastAsia="Times New Roman" w:hAnsi="Calibri" w:cs="Calibri"/>
+          <w:color w:val="000000"/>
+          <w:kern w:val="0"/>
+          <w:lang w:val="en-IN" w:eastAsia="en-IN"/>
+          <w14:ligatures w14:val="none"/>
+        </w:rPr>
+      </w:pPr>
+      <w:r>
+        <w:t xml:space="preserve">Please update the filtering logic used to form the </w:t>
+      </w:r>
+      <w:proofErr w:type="spellStart"/>
+      <w:r>
+        <w:rPr>
+          <w:rFonts w:ascii="Calibri" w:eastAsia="Times New Roman" w:hAnsi="Calibri" w:cs="Calibri"/>
+          <w:color w:val="000000"/>
+          <w:kern w:val="0"/>
+          <w:lang w:val="en-IN" w:eastAsia="en-IN"/>
+          <w14:ligatures w14:val="none"/>
+        </w:rPr>
+        <w:t>Gene_</w:t>
+      </w:r>
+      <w:r>
+        <w:rPr>
+          <w:rFonts w:ascii="Calibri" w:eastAsia="Times New Roman" w:hAnsi="Calibri" w:cs="Calibri"/>
+          <w:color w:val="000000"/>
+          <w:kern w:val="0"/>
+          <w:lang w:val="en-IN" w:eastAsia="en-IN"/>
+          <w14:ligatures w14:val="none"/>
+        </w:rPr>
+        <w:t>Biomarkers_in_Cancer_Prospective_Studies_Data_Table</w:t>
+      </w:r>
+      <w:proofErr w:type="spellEnd"/>
+      <w:r>
+        <w:rPr>
+          <w:rFonts w:ascii="Calibri" w:eastAsia="Times New Roman" w:hAnsi="Calibri" w:cs="Calibri"/>
+          <w:color w:val="000000"/>
+          <w:kern w:val="0"/>
+          <w:lang w:val="en-IN" w:eastAsia="en-IN"/>
+          <w14:ligatures w14:val="none"/>
+        </w:rPr>
+        <w:t xml:space="preserve">, and </w:t>
+      </w:r>
+      <w:proofErr w:type="spellStart"/>
+      <w:r>
+        <w:rPr>
+          <w:rFonts w:ascii="Calibri" w:eastAsia="Times New Roman" w:hAnsi="Calibri" w:cs="Calibri"/>
+          <w:color w:val="000000"/>
+          <w:kern w:val="0"/>
+          <w:lang w:val="en-IN" w:eastAsia="en-IN"/>
+          <w14:ligatures w14:val="none"/>
+        </w:rPr>
+        <w:t>Protein_</w:t>
+      </w:r>
+      <w:r>
+        <w:rPr>
+          <w:rFonts w:ascii="Calibri" w:eastAsia="Times New Roman" w:hAnsi="Calibri" w:cs="Calibri"/>
+          <w:color w:val="000000"/>
+          <w:kern w:val="0"/>
+          <w:lang w:val="en-IN" w:eastAsia="en-IN"/>
+          <w14:ligatures w14:val="none"/>
+        </w:rPr>
+        <w:t>Biomarkers_in_Cancer_Prospective_Studies_Data_Table</w:t>
+      </w:r>
+      <w:proofErr w:type="spellEnd"/>
+      <w:r>
+        <w:rPr>
+          <w:rFonts w:ascii="Calibri" w:eastAsia="Times New Roman" w:hAnsi="Calibri" w:cs="Calibri"/>
+          <w:color w:val="000000"/>
+          <w:kern w:val="0"/>
+          <w:lang w:val="en-IN" w:eastAsia="en-IN"/>
+          <w14:ligatures w14:val="none"/>
+        </w:rPr>
+        <w:t xml:space="preserve"> tables from the </w:t>
+      </w:r>
+      <w:proofErr w:type="spellStart"/>
+      <w:r>
+        <w:rPr>
+          <w:rFonts w:ascii="Calibri" w:eastAsia="Times New Roman" w:hAnsi="Calibri" w:cs="Calibri"/>
+          <w:color w:val="000000"/>
+          <w:kern w:val="0"/>
+          <w:lang w:val="en-IN" w:eastAsia="en-IN"/>
+          <w14:ligatures w14:val="none"/>
+        </w:rPr>
+        <w:t>Biomarkers_in_Cancer_Prospective_Studies_Data_Table</w:t>
+      </w:r>
+      <w:proofErr w:type="spellEnd"/>
+      <w:r>
+        <w:rPr>
+          <w:rFonts w:ascii="Calibri" w:eastAsia="Times New Roman" w:hAnsi="Calibri" w:cs="Calibri"/>
+          <w:color w:val="000000"/>
+          <w:kern w:val="0"/>
+          <w:lang w:val="en-IN" w:eastAsia="en-IN"/>
+          <w14:ligatures w14:val="none"/>
+        </w:rPr>
+        <w:t xml:space="preserve"> table, by ensuring that the string being searched for within the contents of the Protein_Gene_or_Other field, i.e., the string “Protein” for the </w:t>
+      </w:r>
+      <w:proofErr w:type="spellStart"/>
+      <w:r>
+        <w:rPr>
+          <w:rFonts w:ascii="Calibri" w:eastAsia="Times New Roman" w:hAnsi="Calibri" w:cs="Calibri"/>
+          <w:color w:val="000000"/>
+          <w:kern w:val="0"/>
+          <w:lang w:val="en-IN" w:eastAsia="en-IN"/>
+          <w14:ligatures w14:val="none"/>
+        </w:rPr>
+        <w:t>Protein_</w:t>
+      </w:r>
+      <w:r>
+        <w:rPr>
+          <w:rFonts w:ascii="Calibri" w:eastAsia="Times New Roman" w:hAnsi="Calibri" w:cs="Calibri"/>
+          <w:color w:val="000000"/>
+          <w:kern w:val="0"/>
+          <w:lang w:val="en-IN" w:eastAsia="en-IN"/>
+          <w14:ligatures w14:val="none"/>
+        </w:rPr>
+        <w:t>Biomarkers_in_Cancer_Prospective_Studies_Data_Table</w:t>
+      </w:r>
+      <w:proofErr w:type="spellEnd"/>
+      <w:r>
+        <w:rPr>
+          <w:rFonts w:ascii="Calibri" w:eastAsia="Times New Roman" w:hAnsi="Calibri" w:cs="Calibri"/>
+          <w:color w:val="000000"/>
+          <w:kern w:val="0"/>
+          <w:lang w:val="en-IN" w:eastAsia="en-IN"/>
+          <w14:ligatures w14:val="none"/>
+        </w:rPr>
+        <w:t xml:space="preserve"> table and the string “Gene” for the </w:t>
+      </w:r>
+      <w:proofErr w:type="spellStart"/>
+      <w:r>
+        <w:rPr>
+          <w:rFonts w:ascii="Calibri" w:eastAsia="Times New Roman" w:hAnsi="Calibri" w:cs="Calibri"/>
+          <w:color w:val="000000"/>
+          <w:kern w:val="0"/>
+          <w:lang w:val="en-IN" w:eastAsia="en-IN"/>
+          <w14:ligatures w14:val="none"/>
+        </w:rPr>
+        <w:t>Gene_</w:t>
+      </w:r>
+      <w:r>
+        <w:rPr>
+          <w:rFonts w:ascii="Calibri" w:eastAsia="Times New Roman" w:hAnsi="Calibri" w:cs="Calibri"/>
+          <w:color w:val="000000"/>
+          <w:kern w:val="0"/>
+          <w:lang w:val="en-IN" w:eastAsia="en-IN"/>
+          <w14:ligatures w14:val="none"/>
+        </w:rPr>
+        <w:t>Biomarkers_in_Cancer_Prospective_Studies_Data_Table</w:t>
+      </w:r>
+      <w:proofErr w:type="spellEnd"/>
+      <w:r>
+        <w:rPr>
+          <w:rFonts w:ascii="Calibri" w:eastAsia="Times New Roman" w:hAnsi="Calibri" w:cs="Calibri"/>
+          <w:color w:val="000000"/>
+          <w:kern w:val="0"/>
+          <w:lang w:val="en-IN" w:eastAsia="en-IN"/>
+          <w14:ligatures w14:val="none"/>
+        </w:rPr>
+        <w:t xml:space="preserve"> table are not simply matched to just any occurrence of the searched for string as a sub-string within a cell in the pertinent field, but , rather is matched to the occurrence of the sought-after string as a word. Use the following logic to define the occurrence of the search string as a ‘word’ substring within the field being searched: The </w:t>
+      </w:r>
+      <w:r>
+        <w:rPr>
+          <w:rFonts w:ascii="Calibri" w:eastAsia="Times New Roman" w:hAnsi="Calibri" w:cs="Calibri"/>
+          <w:color w:val="000000"/>
+          <w:kern w:val="0"/>
+          <w:lang w:val="en-IN" w:eastAsia="en-IN"/>
+          <w14:ligatures w14:val="none"/>
+        </w:rPr>
+        <w:t>occurrence of the search string is flanked on each side (prefix side and suffix side) by at least one space or at least one non-letter character, for the search to find a search hit within the field.</w:t>
+      </w:r>
+    </w:p>
+    <w:p>
+      <w:pPr>
+        <w:rPr>
+          <w:rFonts w:ascii="Calibri" w:eastAsia="Times New Roman" w:hAnsi="Calibri" w:cs="Calibri"/>
+          <w:color w:val="000000"/>
+          <w:kern w:val="0"/>
+          <w:lang w:val="en-IN" w:eastAsia="en-IN"/>
+          <w14:ligatures w14:val="none"/>
+        </w:rPr>
+      </w:pPr>
+    </w:p>
+    <w:p>
+      <w:pPr>
+        <w:rPr>
+          <w:rFonts w:ascii="Calibri" w:eastAsia="Times New Roman" w:hAnsi="Calibri" w:cs="Calibri"/>
+          <w:b/>
+          <w:bCs/>
+          <w:color w:val="000000"/>
+          <w:kern w:val="0"/>
+          <w:lang w:val="en-IN" w:eastAsia="en-IN"/>
+          <w14:ligatures w14:val="none"/>
+        </w:rPr>
+      </w:pPr>
+      <w:proofErr w:type="spellStart"/>
+      <w:r>
+        <w:rPr>
+          <w:rFonts w:ascii="Calibri" w:eastAsia="Times New Roman" w:hAnsi="Calibri" w:cs="Calibri"/>
+          <w:b/>
+          <w:bCs/>
+          <w:color w:val="000000"/>
+          <w:kern w:val="0"/>
+          <w:lang w:val="en-IN" w:eastAsia="en-IN"/>
+          <w14:ligatures w14:val="none"/>
+        </w:rPr>
+        <w:t>Installment</w:t>
+      </w:r>
+      <w:proofErr w:type="spellEnd"/>
+      <w:r>
+        <w:rPr>
+          <w:rFonts w:ascii="Calibri" w:eastAsia="Times New Roman" w:hAnsi="Calibri" w:cs="Calibri"/>
+          <w:b/>
+          <w:bCs/>
+          <w:color w:val="000000"/>
+          <w:kern w:val="0"/>
+          <w:lang w:val="en-IN" w:eastAsia="en-IN"/>
+          <w14:ligatures w14:val="none"/>
+        </w:rPr>
+        <w:t xml:space="preserve"> 28:</w:t>
+      </w:r>
+    </w:p>
+    <w:p>
+      <w:pPr>
+        <w:rPr>
+          <w:rFonts w:ascii="Calibri" w:eastAsia="Times New Roman" w:hAnsi="Calibri" w:cs="Calibri"/>
+          <w:color w:val="000000"/>
+          <w:kern w:val="0"/>
+          <w:lang w:val="en-IN" w:eastAsia="en-IN"/>
+          <w14:ligatures w14:val="none"/>
+        </w:rPr>
+      </w:pPr>
+    </w:p>
+    <w:p>
+      <w:pPr>
+        <w:rPr>
+          <w:rFonts w:ascii="Calibri" w:eastAsia="Times New Roman" w:hAnsi="Calibri" w:cs="Calibri"/>
+          <w:color w:val="000000"/>
+          <w:kern w:val="0"/>
+          <w:lang w:val="en-IN" w:eastAsia="en-IN"/>
+          <w14:ligatures w14:val="none"/>
+        </w:rPr>
+      </w:pPr>
+      <w:r>
+        <w:rPr>
+          <w:rFonts w:ascii="Calibri" w:eastAsia="Times New Roman" w:hAnsi="Calibri" w:cs="Calibri"/>
+          <w:color w:val="000000"/>
+          <w:kern w:val="0"/>
+          <w:lang w:val="en-IN" w:eastAsia="en-IN"/>
+          <w14:ligatures w14:val="none"/>
+        </w:rPr>
+        <w:t xml:space="preserve">In the present folder, </w:t>
+      </w:r>
+      <w:proofErr w:type="spellStart"/>
+      <w:r>
+        <w:rPr>
+          <w:rFonts w:ascii="Calibri" w:eastAsia="Times New Roman" w:hAnsi="Calibri" w:cs="Calibri"/>
+          <w:color w:val="000000"/>
+          <w:kern w:val="0"/>
+          <w:lang w:val="en-IN" w:eastAsia="en-IN"/>
+          <w14:ligatures w14:val="none"/>
+        </w:rPr>
+        <w:t>Database_Demo</w:t>
+      </w:r>
+      <w:proofErr w:type="spellEnd"/>
+      <w:r>
+        <w:rPr>
+          <w:rFonts w:ascii="Calibri" w:eastAsia="Times New Roman" w:hAnsi="Calibri" w:cs="Calibri"/>
+          <w:color w:val="000000"/>
+          <w:kern w:val="0"/>
+          <w:lang w:val="en-IN" w:eastAsia="en-IN"/>
+          <w14:ligatures w14:val="none"/>
+        </w:rPr>
+        <w:t>, p</w:t>
+      </w:r>
+      <w:r>
+        <w:rPr>
+          <w:rFonts w:ascii="Calibri" w:eastAsia="Times New Roman" w:hAnsi="Calibri" w:cs="Calibri"/>
+          <w:color w:val="000000"/>
+          <w:kern w:val="0"/>
+          <w:lang w:val="en-IN" w:eastAsia="en-IN"/>
+          <w14:ligatures w14:val="none"/>
+        </w:rPr>
+        <w:t xml:space="preserve">lease update the text message in the About Us section </w:t>
+      </w:r>
+      <w:r>
+        <w:rPr>
+          <w:rFonts w:ascii="Calibri" w:eastAsia="Times New Roman" w:hAnsi="Calibri" w:cs="Calibri"/>
+          <w:color w:val="000000"/>
+          <w:kern w:val="0"/>
+          <w:lang w:val="en-IN" w:eastAsia="en-IN"/>
+          <w14:ligatures w14:val="none"/>
+        </w:rPr>
+        <w:t xml:space="preserve">of the website </w:t>
+      </w:r>
+      <w:r>
+        <w:rPr>
+          <w:rFonts w:ascii="Calibri" w:eastAsia="Times New Roman" w:hAnsi="Calibri" w:cs="Calibri"/>
+          <w:color w:val="000000"/>
+          <w:kern w:val="0"/>
+          <w:lang w:val="en-IN" w:eastAsia="en-IN"/>
+          <w14:ligatures w14:val="none"/>
+        </w:rPr>
+        <w:t>to read as follows:</w:t>
+      </w:r>
+    </w:p>
+    <w:p>
+      <w:pPr>
+        <w:rPr>
+          <w:rFonts w:ascii="Calibri" w:eastAsia="Times New Roman" w:hAnsi="Calibri" w:cs="Calibri"/>
+          <w:color w:val="000000"/>
+          <w:kern w:val="0"/>
+          <w:lang w:val="en-IN" w:eastAsia="en-IN"/>
+          <w14:ligatures w14:val="none"/>
+        </w:rPr>
+      </w:pPr>
+      <w:r>
+        <w:rPr>
+          <w:rFonts w:ascii="Calibri" w:eastAsia="Times New Roman" w:hAnsi="Calibri" w:cs="Calibri"/>
+          <w:color w:val="000000"/>
+          <w:kern w:val="0"/>
+          <w:lang w:val="en-IN" w:eastAsia="en-IN"/>
+          <w14:ligatures w14:val="none"/>
+        </w:rPr>
+        <w:t>‘</w:t>
+      </w:r>
+      <w:r>
+        <w:rPr>
+          <w:rFonts w:ascii="Calibri" w:eastAsia="Times New Roman" w:hAnsi="Calibri" w:cs="Calibri"/>
+          <w:color w:val="000000"/>
+          <w:kern w:val="0"/>
+          <w:lang w:eastAsia="en-IN"/>
+          <w14:ligatures w14:val="none"/>
+        </w:rPr>
+        <w:t>This is a demo website meant to demonstrate some of the functionality intended for the final ICDTRA website. Currently, the Cancer Genomics section offers a limited selection of differential expression data from the genomics expression database EMBL-EBI Expression Atlas (</w:t>
+      </w:r>
+      <w:hyperlink r:id="rId11" w:tgtFrame="_blank" w:history="1">
+        <w:r>
+          <w:rPr>
+            <w:rStyle w:val="Hyperlink"/>
+            <w:rFonts w:ascii="Calibri" w:eastAsia="Times New Roman" w:hAnsi="Calibri" w:cs="Calibri"/>
+            <w:kern w:val="0"/>
+            <w:lang w:eastAsia="en-IN"/>
+            <w14:ligatures w14:val="none"/>
+          </w:rPr>
+          <w:t>https://www.ebi.ac.uk/gxa/home</w:t>
+        </w:r>
+      </w:hyperlink>
+      <w:r>
+        <w:rPr>
+          <w:rFonts w:ascii="Calibri" w:eastAsia="Times New Roman" w:hAnsi="Calibri" w:cs="Calibri"/>
+          <w:color w:val="000000"/>
+          <w:kern w:val="0"/>
+          <w:lang w:eastAsia="en-IN"/>
+          <w14:ligatures w14:val="none"/>
+        </w:rPr>
+        <w:t>)</w:t>
+      </w:r>
+      <w:r>
+        <w:rPr>
+          <w:rFonts w:ascii="Calibri" w:eastAsia="Times New Roman" w:hAnsi="Calibri" w:cs="Calibri"/>
+          <w:color w:val="000000"/>
+          <w:kern w:val="0"/>
+          <w:lang w:eastAsia="en-IN"/>
+          <w14:ligatures w14:val="none"/>
+        </w:rPr>
+        <w:t>, within the “Differential Gene Expression” sub-section, which</w:t>
+      </w:r>
+      <w:r>
+        <w:rPr>
+          <w:rFonts w:ascii="Calibri" w:eastAsia="Times New Roman" w:hAnsi="Calibri" w:cs="Calibri"/>
+          <w:color w:val="000000"/>
+          <w:kern w:val="0"/>
+          <w:lang w:eastAsia="en-IN"/>
+          <w14:ligatures w14:val="none"/>
+        </w:rPr>
+        <w:t xml:space="preserve"> also offers lists of the names of proteins/genes associated with signalling pathways, as sourced from the </w:t>
+      </w:r>
+      <w:proofErr w:type="spellStart"/>
+      <w:r>
+        <w:rPr>
+          <w:rFonts w:ascii="Calibri" w:eastAsia="Times New Roman" w:hAnsi="Calibri" w:cs="Calibri"/>
+          <w:color w:val="000000"/>
+          <w:kern w:val="0"/>
+          <w:lang w:eastAsia="en-IN"/>
+          <w14:ligatures w14:val="none"/>
+        </w:rPr>
+        <w:t>Reactome</w:t>
+      </w:r>
+      <w:proofErr w:type="spellEnd"/>
+      <w:r>
+        <w:rPr>
+          <w:rFonts w:ascii="Calibri" w:eastAsia="Times New Roman" w:hAnsi="Calibri" w:cs="Calibri"/>
+          <w:color w:val="000000"/>
+          <w:kern w:val="0"/>
+          <w:lang w:eastAsia="en-IN"/>
+          <w14:ligatures w14:val="none"/>
+        </w:rPr>
+        <w:t xml:space="preserve"> database's Pathway Browser (</w:t>
+      </w:r>
+      <w:hyperlink r:id="rId12" w:tgtFrame="_blank" w:history="1">
+        <w:r>
+          <w:rPr>
+            <w:rStyle w:val="Hyperlink"/>
+            <w:rFonts w:ascii="Calibri" w:eastAsia="Times New Roman" w:hAnsi="Calibri" w:cs="Calibri"/>
+            <w:kern w:val="0"/>
+            <w:lang w:eastAsia="en-IN"/>
+            <w14:ligatures w14:val="none"/>
+          </w:rPr>
+          <w:t>https://reactome.org/PathwayBrowser/</w:t>
+        </w:r>
+      </w:hyperlink>
+      <w:r>
+        <w:rPr>
+          <w:rFonts w:ascii="Calibri" w:eastAsia="Times New Roman" w:hAnsi="Calibri" w:cs="Calibri"/>
+          <w:color w:val="000000"/>
+          <w:kern w:val="0"/>
+          <w:lang w:eastAsia="en-IN"/>
+          <w14:ligatures w14:val="none"/>
+        </w:rPr>
+        <w:t xml:space="preserve">). </w:t>
+      </w:r>
+      <w:r>
+        <w:rPr>
+          <w:rFonts w:ascii="Calibri" w:eastAsia="Times New Roman" w:hAnsi="Calibri" w:cs="Calibri"/>
+          <w:color w:val="000000"/>
+          <w:kern w:val="0"/>
+          <w:lang w:eastAsia="en-IN"/>
+          <w14:ligatures w14:val="none"/>
+        </w:rPr>
+        <w:t xml:space="preserve">The “Gene Biomarker Data </w:t>
+      </w:r>
+      <w:proofErr w:type="gramStart"/>
+      <w:r>
+        <w:rPr>
+          <w:rFonts w:ascii="Calibri" w:eastAsia="Times New Roman" w:hAnsi="Calibri" w:cs="Calibri"/>
+          <w:color w:val="000000"/>
+          <w:kern w:val="0"/>
+          <w:lang w:eastAsia="en-IN"/>
+          <w14:ligatures w14:val="none"/>
+        </w:rPr>
+        <w:t>From</w:t>
+      </w:r>
+      <w:proofErr w:type="gramEnd"/>
+      <w:r>
+        <w:rPr>
+          <w:rFonts w:ascii="Calibri" w:eastAsia="Times New Roman" w:hAnsi="Calibri" w:cs="Calibri"/>
+          <w:color w:val="000000"/>
+          <w:kern w:val="0"/>
+          <w:lang w:eastAsia="en-IN"/>
+          <w14:ligatures w14:val="none"/>
+        </w:rPr>
+        <w:t xml:space="preserve"> Literature” sub-section lists data on biomarkers gathered from the literature on cancer. </w:t>
+      </w:r>
+      <w:r>
+        <w:rPr>
+          <w:rFonts w:ascii="Calibri" w:eastAsia="Times New Roman" w:hAnsi="Calibri" w:cs="Calibri"/>
+          <w:color w:val="000000"/>
+          <w:kern w:val="0"/>
+          <w:lang w:eastAsia="en-IN"/>
+          <w14:ligatures w14:val="none"/>
+        </w:rPr>
+        <w:t xml:space="preserve">The Cancer Literature section currently allows users to search through a set of research articles featuring "cancer" and "differential expression" together in the title and/or the abstract, as well as listing "India" as the affiliation address of at least one of the authors of the paper. The list of publications can be viewed, and the articles can be downloaded as PDF files, in cases where the articles are open-source. The Cancer Proteomics section will operate similarly to the Cancer Genomics section, although </w:t>
+      </w:r>
+      <w:r>
+        <w:rPr>
+          <w:rFonts w:ascii="Calibri" w:eastAsia="Times New Roman" w:hAnsi="Calibri" w:cs="Calibri"/>
+          <w:color w:val="000000"/>
+          <w:kern w:val="0"/>
+          <w:lang w:eastAsia="en-IN"/>
+          <w14:ligatures w14:val="none"/>
+        </w:rPr>
+        <w:t>the “differential protein expression with biological fold-change from a proteomics database”</w:t>
+      </w:r>
+      <w:r>
+        <w:rPr>
+          <w:rFonts w:ascii="Calibri" w:eastAsia="Times New Roman" w:hAnsi="Calibri" w:cs="Calibri"/>
+          <w:color w:val="000000"/>
+          <w:kern w:val="0"/>
+          <w:lang w:eastAsia="en-IN"/>
+          <w14:ligatures w14:val="none"/>
+        </w:rPr>
+        <w:t xml:space="preserve"> </w:t>
+      </w:r>
+      <w:r>
+        <w:rPr>
+          <w:rFonts w:ascii="Calibri" w:eastAsia="Times New Roman" w:hAnsi="Calibri" w:cs="Calibri"/>
+          <w:color w:val="000000"/>
+          <w:kern w:val="0"/>
+          <w:lang w:eastAsia="en-IN"/>
+          <w14:ligatures w14:val="none"/>
+        </w:rPr>
+        <w:t xml:space="preserve">part of this section is </w:t>
+      </w:r>
+      <w:r>
+        <w:rPr>
+          <w:rFonts w:ascii="Calibri" w:eastAsia="Times New Roman" w:hAnsi="Calibri" w:cs="Calibri"/>
+          <w:color w:val="000000"/>
+          <w:kern w:val="0"/>
+          <w:lang w:eastAsia="en-IN"/>
+          <w14:ligatures w14:val="none"/>
+        </w:rPr>
+        <w:t>not active, at present, owing to difficulties in obtaining freely available differential expression data, organised in a database</w:t>
+      </w:r>
+      <w:r>
+        <w:rPr>
+          <w:rFonts w:ascii="Calibri" w:eastAsia="Times New Roman" w:hAnsi="Calibri" w:cs="Calibri"/>
+          <w:color w:val="000000"/>
+          <w:kern w:val="0"/>
+          <w:lang w:eastAsia="en-IN"/>
+          <w14:ligatures w14:val="none"/>
+        </w:rPr>
+        <w:t>, through automation</w:t>
+      </w:r>
+      <w:r>
+        <w:rPr>
+          <w:rFonts w:ascii="Calibri" w:eastAsia="Times New Roman" w:hAnsi="Calibri" w:cs="Calibri"/>
+          <w:color w:val="000000"/>
+          <w:kern w:val="0"/>
+          <w:lang w:eastAsia="en-IN"/>
+          <w14:ligatures w14:val="none"/>
+        </w:rPr>
+        <w:t>. The</w:t>
+      </w:r>
+      <w:r>
+        <w:rPr>
+          <w:rFonts w:ascii="Calibri" w:eastAsia="Times New Roman" w:hAnsi="Calibri" w:cs="Calibri"/>
+          <w:color w:val="000000"/>
+          <w:kern w:val="0"/>
+          <w:lang w:eastAsia="en-IN"/>
+          <w14:ligatures w14:val="none"/>
+        </w:rPr>
+        <w:t xml:space="preserve"> Diagnostics section presently displays biomarker data drawn, from the literature on cancer, by Google’s Notebook LM </w:t>
+      </w:r>
+      <w:r>
+        <w:rPr>
+          <w:rFonts w:ascii="Calibri" w:eastAsia="Times New Roman" w:hAnsi="Calibri" w:cs="Calibri"/>
+          <w:color w:val="000000"/>
+          <w:kern w:val="0"/>
+          <w:lang w:eastAsia="en-IN"/>
+          <w14:ligatures w14:val="none"/>
+        </w:rPr>
+        <w:t>(</w:t>
+      </w:r>
+      <w:hyperlink r:id="rId13" w:history="1">
+        <w:r>
+          <w:rPr>
+            <w:rStyle w:val="Hyperlink"/>
+            <w:rFonts w:ascii="Calibri" w:eastAsia="Times New Roman" w:hAnsi="Calibri" w:cs="Calibri"/>
+            <w:kern w:val="0"/>
+            <w:lang w:eastAsia="en-IN"/>
+            <w14:ligatures w14:val="none"/>
+          </w:rPr>
+          <w:t>https://notebooklm.google/</w:t>
+        </w:r>
+      </w:hyperlink>
+      <w:r>
+        <w:rPr>
+          <w:rFonts w:ascii="Calibri" w:eastAsia="Times New Roman" w:hAnsi="Calibri" w:cs="Calibri"/>
+          <w:color w:val="000000"/>
+          <w:kern w:val="0"/>
+          <w:lang w:eastAsia="en-IN"/>
+          <w14:ligatures w14:val="none"/>
+        </w:rPr>
+        <w:t xml:space="preserve"> ). The corresponding sub-sections in the Cancer Genomics and Cancer Proteomics sections are derived from the table in this section</w:t>
+      </w:r>
+      <w:r>
+        <w:rPr>
+          <w:rFonts w:ascii="Calibri" w:eastAsia="Times New Roman" w:hAnsi="Calibri" w:cs="Calibri"/>
+          <w:color w:val="000000"/>
+          <w:kern w:val="0"/>
+          <w:lang w:eastAsia="en-IN"/>
+          <w14:ligatures w14:val="none"/>
+        </w:rPr>
+        <w:t>.</w:t>
+      </w:r>
+      <w:r>
+        <w:rPr>
+          <w:rFonts w:ascii="Calibri" w:eastAsia="Times New Roman" w:hAnsi="Calibri" w:cs="Calibri"/>
+          <w:color w:val="000000"/>
+          <w:kern w:val="0"/>
+          <w:lang w:eastAsia="en-IN"/>
+          <w14:ligatures w14:val="none"/>
+        </w:rPr>
+        <w:t xml:space="preserve"> The Treatment Options section presently displays a list of National Cancer Grid (NCG) member hospitals/institutes listed by the Tata Memorial Centre (TMC) (</w:t>
+      </w:r>
+      <w:hyperlink r:id="rId14" w:history="1">
+        <w:r>
+          <w:rPr>
+            <w:rStyle w:val="Hyperlink"/>
+            <w:rFonts w:ascii="Calibri" w:eastAsia="Times New Roman" w:hAnsi="Calibri" w:cs="Calibri"/>
+            <w:kern w:val="0"/>
+            <w:lang w:eastAsia="en-IN"/>
+            <w14:ligatures w14:val="none"/>
+          </w:rPr>
+          <w:t>https://www.ncgindia.org/</w:t>
+        </w:r>
+      </w:hyperlink>
+      <w:r>
+        <w:rPr>
+          <w:rFonts w:ascii="Calibri" w:eastAsia="Times New Roman" w:hAnsi="Calibri" w:cs="Calibri"/>
+          <w:color w:val="000000"/>
+          <w:kern w:val="0"/>
+          <w:lang w:eastAsia="en-IN"/>
+          <w14:ligatures w14:val="none"/>
+        </w:rPr>
+        <w:t xml:space="preserve"> ). At present, the Clinical Trials and Education sections are placeholders, and will be updated to reflect the inputs of clinician scientists and cancer educators, respectively, in due course of time.</w:t>
+      </w:r>
+      <w:r>
+        <w:rPr>
+          <w:rFonts w:ascii="Calibri" w:eastAsia="Times New Roman" w:hAnsi="Calibri" w:cs="Calibri"/>
+          <w:color w:val="000000"/>
+          <w:kern w:val="0"/>
+          <w:lang w:val="en-IN" w:eastAsia="en-IN"/>
+          <w14:ligatures w14:val="none"/>
+        </w:rPr>
+        <w:t>’</w:t>
       </w:r>
     </w:p>
     <w:sectPr>
@@ -6450,7 +9539,6 @@
   <w:style w:type="character" w:default="1" w:styleId="DefaultParagraphFont">
     <w:name w:val="Default Paragraph Font"/>
     <w:uiPriority w:val="1"/>
-    <w:semiHidden/>
     <w:unhideWhenUsed/>
   </w:style>
   <w:style w:type="table" w:default="1" w:styleId="TableNormal">

</xml_diff>

<commit_message>
Further updates prior to screening
</commit_message>
<xml_diff>
--- a/Prompt_to_Cursor_Instructions_Log.docx
+++ b/Prompt_to_Cursor_Instructions_Log.docx
@@ -2279,31 +2279,7 @@
     <w:p/>
     <w:p>
       <w:r>
-        <w:t xml:space="preserve">Adjust the code for the Cancer Genomics section to include a clickable button labelled “Load Differential Expression Data </w:t>
-      </w:r>
-      <w:proofErr w:type="gramStart"/>
-      <w:r>
-        <w:t>From</w:t>
-      </w:r>
-      <w:proofErr w:type="gramEnd"/>
-      <w:r>
-        <w:t xml:space="preserve"> Cancer Literature” above the Differential Gene Expression with Biological Fold Change display panel, just to the right of the label for this panel. Clicking on this button clears all the display panels and the search box, and deselects all the options in the drop-down menus. Then, it loads two options in the Proteins display panel- (1) Differential Gene Expression </w:t>
-      </w:r>
-      <w:proofErr w:type="gramStart"/>
-      <w:r>
-        <w:t>From</w:t>
-      </w:r>
-      <w:proofErr w:type="gramEnd"/>
-      <w:r>
-        <w:t xml:space="preserve"> Literature and (2) Differential Gene Expression </w:t>
-      </w:r>
-      <w:proofErr w:type="gramStart"/>
-      <w:r>
-        <w:t>From</w:t>
-      </w:r>
-      <w:proofErr w:type="gramEnd"/>
-      <w:r>
-        <w:t xml:space="preserve"> Literature</w:t>
+        <w:t>Adjust the code for the Cancer Genomics section to include a clickable button labelled “Load Differential Expression Data From Cancer Literature” above the Differential Gene Expression with Biological Fold Change display panel, just to the right of the label for this panel. Clicking on this button clears all the display panels and the search box, and deselects all the options in the drop-down menus. Then, it loads two options in the Proteins display panel- (1) Differential Gene Expression From Literature and (2) Differential Gene Expression From Literature</w:t>
       </w:r>
       <w:r>
         <w:t xml:space="preserve">- </w:t>
@@ -2363,23 +2339,7 @@
     </w:p>
     <w:p>
       <w:r>
-        <w:t xml:space="preserve">The Proteins panel in this section of the website has two options displayed in it- (1) Differential Protein Expression </w:t>
-      </w:r>
-      <w:proofErr w:type="gramStart"/>
-      <w:r>
-        <w:t>From</w:t>
-      </w:r>
-      <w:proofErr w:type="gramEnd"/>
-      <w:r>
-        <w:t xml:space="preserve"> Literature and (2) Differential Protein Expression </w:t>
-      </w:r>
-      <w:proofErr w:type="gramStart"/>
-      <w:r>
-        <w:t>From</w:t>
-      </w:r>
-      <w:proofErr w:type="gramEnd"/>
-      <w:r>
-        <w:t xml:space="preserve"> Literature- Directly Quoted Data. Each option has a check box to its left. Clicking on either option’s check box loads the corresponding data </w:t>
+        <w:t xml:space="preserve">The Proteins panel in this section of the website has two options displayed in it- (1) Differential Protein Expression From Literature and (2) Differential Protein Expression From Literature- Directly Quoted Data. Each option has a check box to its left. Clicking on either option’s check box loads the corresponding data </w:t>
       </w:r>
       <w:r>
         <w:t>in the Differential Protein Expression with Biological Fold Change panel, from the two tables derived from the two CSVs Differential_Protein_Expression_From_Literature.csv and Differential_Protein_Expression_From_Literature_Direct_Quote.csv, respectively. Deselecting either check box removes the corresponding data from the Differential Protein Expression with Biological Fold Change panel, without removing the headers at the top, unless all the options in the Proteins panel have been deselected (in which case all content is removed from the Differential Protein Expression with Biological Fold Change panel). After one dataset has been loaded into the Differential Protein Expression with Biological Fold Change panel, all subsequent datasets are loaded into it below the pre-existing data in the panel, without loading the headers/column titles of the subsequently added datasets.</w:t>
@@ -3812,29 +3772,7 @@
           <w:lang w:eastAsia="en-IN"/>
           <w14:ligatures w14:val="none"/>
         </w:rPr>
-        <w:t xml:space="preserve">The panel will bear a label just above it, and left-aligned, that will read “Biomarker Data </w:t>
-      </w:r>
-      <w:proofErr w:type="gramStart"/>
-      <w:r>
-        <w:rPr>
-          <w:rFonts w:ascii="Calibri" w:eastAsia="Times New Roman" w:hAnsi="Calibri" w:cs="Calibri"/>
-          <w:color w:val="000000"/>
-          <w:kern w:val="0"/>
-          <w:lang w:eastAsia="en-IN"/>
-          <w14:ligatures w14:val="none"/>
-        </w:rPr>
-        <w:t>From</w:t>
-      </w:r>
-      <w:proofErr w:type="gramEnd"/>
-      <w:r>
-        <w:rPr>
-          <w:rFonts w:ascii="Calibri" w:eastAsia="Times New Roman" w:hAnsi="Calibri" w:cs="Calibri"/>
-          <w:color w:val="000000"/>
-          <w:kern w:val="0"/>
-          <w:lang w:eastAsia="en-IN"/>
-          <w14:ligatures w14:val="none"/>
-        </w:rPr>
-        <w:t xml:space="preserve"> Literature”. </w:t>
+        <w:t xml:space="preserve">The panel will bear a label just above it, and left-aligned, that will read “Biomarker Data From Literature”. </w:t>
       </w:r>
       <w:r>
         <w:rPr>
@@ -3996,29 +3934,7 @@
           <w:lang w:eastAsia="en-IN"/>
           <w14:ligatures w14:val="none"/>
         </w:rPr>
-        <w:t xml:space="preserve">the rows, showing all the available values of the same column, except those rows currently hidden by the filtering logic of the other drop-down menus in the table. Clicking on any other option- besides “All”- in any of these drop-down menus causes the rows to be filtered to only display rows that contain exactly the same value, in the same column, as the option of the drop-down menu that was clicked. Add a button labelled “Download Displayed Biomarker Data </w:t>
-      </w:r>
-      <w:proofErr w:type="gramStart"/>
-      <w:r>
-        <w:rPr>
-          <w:rFonts w:ascii="Calibri" w:eastAsia="Times New Roman" w:hAnsi="Calibri" w:cs="Calibri"/>
-          <w:color w:val="000000"/>
-          <w:kern w:val="0"/>
-          <w:lang w:eastAsia="en-IN"/>
-          <w14:ligatures w14:val="none"/>
-        </w:rPr>
-        <w:t>From</w:t>
-      </w:r>
-      <w:proofErr w:type="gramEnd"/>
-      <w:r>
-        <w:rPr>
-          <w:rFonts w:ascii="Calibri" w:eastAsia="Times New Roman" w:hAnsi="Calibri" w:cs="Calibri"/>
-          <w:color w:val="000000"/>
-          <w:kern w:val="0"/>
-          <w:lang w:eastAsia="en-IN"/>
-          <w14:ligatures w14:val="none"/>
-        </w:rPr>
-        <w:t xml:space="preserve"> Literature” just below the display panel. Clicking on the button triggers a download of any currently displayed tabular data in the panel, as an output CSV file named “Biomarker_Data_From_Literature.csv”.</w:t>
+        <w:t>the rows, showing all the available values of the same column, except those rows currently hidden by the filtering logic of the other drop-down menus in the table. Clicking on any other option- besides “All”- in any of these drop-down menus causes the rows to be filtered to only display rows that contain exactly the same value, in the same column, as the option of the drop-down menu that was clicked. Add a button labelled “Download Displayed Biomarker Data From Literature” just below the display panel. Clicking on the button triggers a download of any currently displayed tabular data in the panel, as an output CSV file named “Biomarker_Data_From_Literature.csv”.</w:t>
       </w:r>
     </w:p>
     <w:p>
@@ -4137,51 +4053,7 @@
           <w:lang w:eastAsia="en-IN"/>
           <w14:ligatures w14:val="none"/>
         </w:rPr>
-        <w:t xml:space="preserve">Gene Biomarker Data </w:t>
-      </w:r>
-      <w:proofErr w:type="gramStart"/>
-      <w:r>
-        <w:rPr>
-          <w:rFonts w:ascii="Calibri" w:eastAsia="Times New Roman" w:hAnsi="Calibri" w:cs="Calibri"/>
-          <w:color w:val="000000"/>
-          <w:kern w:val="0"/>
-          <w:lang w:eastAsia="en-IN"/>
-          <w14:ligatures w14:val="none"/>
-        </w:rPr>
-        <w:t>From</w:t>
-      </w:r>
-      <w:proofErr w:type="gramEnd"/>
-      <w:r>
-        <w:rPr>
-          <w:rFonts w:ascii="Calibri" w:eastAsia="Times New Roman" w:hAnsi="Calibri" w:cs="Calibri"/>
-          <w:color w:val="000000"/>
-          <w:kern w:val="0"/>
-          <w:lang w:eastAsia="en-IN"/>
-          <w14:ligatures w14:val="none"/>
-        </w:rPr>
-        <w:t xml:space="preserve"> Literature”, while the “Cancer Proteomics” drop-down menu will offer the options “Differential Protein Expression” and “Protein Biomarker Data </w:t>
-      </w:r>
-      <w:proofErr w:type="gramStart"/>
-      <w:r>
-        <w:rPr>
-          <w:rFonts w:ascii="Calibri" w:eastAsia="Times New Roman" w:hAnsi="Calibri" w:cs="Calibri"/>
-          <w:color w:val="000000"/>
-          <w:kern w:val="0"/>
-          <w:lang w:eastAsia="en-IN"/>
-          <w14:ligatures w14:val="none"/>
-        </w:rPr>
-        <w:t>From</w:t>
-      </w:r>
-      <w:proofErr w:type="gramEnd"/>
-      <w:r>
-        <w:rPr>
-          <w:rFonts w:ascii="Calibri" w:eastAsia="Times New Roman" w:hAnsi="Calibri" w:cs="Calibri"/>
-          <w:color w:val="000000"/>
-          <w:kern w:val="0"/>
-          <w:lang w:eastAsia="en-IN"/>
-          <w14:ligatures w14:val="none"/>
-        </w:rPr>
-        <w:t xml:space="preserve"> Literature”. Clicking on the respective ‘Gene/Protein Differential Expression’ options of these two top-level options’ drop-down menus leads to a section below the top-</w:t>
+        <w:t>Gene Biomarker Data From Literature”, while the “Cancer Proteomics” drop-down menu will offer the options “Differential Protein Expression” and “Protein Biomarker Data From Literature”. Clicking on the respective ‘Gene/Protein Differential Expression’ options of these two top-level options’ drop-down menus leads to a section below the top-</w:t>
       </w:r>
       <w:r>
         <w:rPr>
@@ -4618,15 +4490,7 @@
     </w:p>
     <w:p>
       <w:r>
-        <w:t xml:space="preserve">All three "Biomarker Data" tables are displayed in a rather squashed manner, from side to side. Please add a horizontal scroll bar for each of those displays and adjust the text content of the displayed tables for these database tables so that </w:t>
-      </w:r>
-      <w:proofErr w:type="gramStart"/>
-      <w:r>
-        <w:t>he</w:t>
-      </w:r>
-      <w:proofErr w:type="gramEnd"/>
-      <w:r>
-        <w:t xml:space="preserve"> text is more legible and less squeezed horizontally.</w:t>
+        <w:t>All three "Biomarker Data" tables are displayed in a rather squashed manner, from side to side. Please add a horizontal scroll bar for each of those displays and adjust the text content of the displayed tables for these database tables so that he text is more legible and less squeezed horizontally.</w:t>
       </w:r>
     </w:p>
     <w:p/>
@@ -4991,29 +4855,7 @@
           <w:lang w:eastAsia="en-IN"/>
           <w14:ligatures w14:val="none"/>
         </w:rPr>
-        <w:t xml:space="preserve">). The “Gene Biomarker Data </w:t>
-      </w:r>
-      <w:proofErr w:type="gramStart"/>
-      <w:r>
-        <w:rPr>
-          <w:rFonts w:ascii="Calibri" w:eastAsia="Times New Roman" w:hAnsi="Calibri" w:cs="Calibri"/>
-          <w:color w:val="000000"/>
-          <w:kern w:val="0"/>
-          <w:lang w:eastAsia="en-IN"/>
-          <w14:ligatures w14:val="none"/>
-        </w:rPr>
-        <w:t>From</w:t>
-      </w:r>
-      <w:proofErr w:type="gramEnd"/>
-      <w:r>
-        <w:rPr>
-          <w:rFonts w:ascii="Calibri" w:eastAsia="Times New Roman" w:hAnsi="Calibri" w:cs="Calibri"/>
-          <w:color w:val="000000"/>
-          <w:kern w:val="0"/>
-          <w:lang w:eastAsia="en-IN"/>
-          <w14:ligatures w14:val="none"/>
-        </w:rPr>
-        <w:t xml:space="preserve"> Literature” sub-section lists data on biomarkers gathered from the literature on cancer. The Cancer Literature section currently allows users to search through a set of research articles featuring "cancer" and "differential expression" together in the title and/or the abstract, as well as listing "India" as the affiliation address of at least one of the authors of the paper. The list of publications can be viewed, and the articles can be downloaded as PDF files, in cases where the articles are open-source. The Cancer Proteomics section will operate similarly to the Cancer Genomics section, although the “differential protein expression with biological fold-change from a proteomics database” part of this section is not active, at present, owing to difficulties in obtaining freely available differential expression data, organised in a database, through automation. The Diagnostics section presently displays biomarker data drawn from the literature on cancer, by Google’s Notebook LM </w:t>
+        <w:t xml:space="preserve">). The “Gene Biomarker Data From Literature” sub-section lists data on biomarkers gathered from the literature on cancer. The Cancer Literature section currently allows users to search through a set of research articles featuring "cancer" and "differential expression" together in the title and/or the abstract, as well as listing "India" as the affiliation address of at least one of the authors of the paper. The list of publications can be viewed, and the articles can be downloaded as PDF files, in cases where the articles are open-source. The Cancer Proteomics section will operate similarly to the Cancer Genomics section, although the “differential protein expression with biological fold-change from a proteomics database” part of this section is not active, at present, owing to difficulties in obtaining freely available differential expression data, organised in a database, through automation. The Diagnostics section presently displays biomarker data drawn from the literature on cancer, by Google’s Notebook LM </w:t>
       </w:r>
       <w:r>
         <w:rPr>
@@ -5269,61 +5111,17 @@
           <w:lang w:eastAsia="en-IN"/>
           <w14:ligatures w14:val="none"/>
         </w:rPr>
-        <w:t xml:space="preserve">menu will be “Biomarker Data </w:t>
-      </w:r>
-      <w:proofErr w:type="gramStart"/>
-      <w:r>
-        <w:rPr>
-          <w:rFonts w:ascii="Calibri" w:eastAsia="Times New Roman" w:hAnsi="Calibri" w:cs="Calibri"/>
-          <w:color w:val="000000"/>
-          <w:kern w:val="0"/>
-          <w:lang w:eastAsia="en-IN"/>
-          <w14:ligatures w14:val="none"/>
-        </w:rPr>
-        <w:t>From</w:t>
-      </w:r>
-      <w:proofErr w:type="gramEnd"/>
-      <w:r>
-        <w:rPr>
-          <w:rFonts w:ascii="Calibri" w:eastAsia="Times New Roman" w:hAnsi="Calibri" w:cs="Calibri"/>
-          <w:color w:val="000000"/>
-          <w:kern w:val="0"/>
-          <w:lang w:eastAsia="en-IN"/>
-          <w14:ligatures w14:val="none"/>
-        </w:rPr>
-        <w:t xml:space="preserve"> Literature”, “Diagnostic Tools”, and “Biorepositories”. Clicking on the “</w:t>
-      </w:r>
-      <w:r>
-        <w:rPr>
-          <w:rFonts w:ascii="Calibri" w:eastAsia="Times New Roman" w:hAnsi="Calibri" w:cs="Calibri"/>
-          <w:color w:val="000000"/>
-          <w:kern w:val="0"/>
-          <w:lang w:eastAsia="en-IN"/>
-          <w14:ligatures w14:val="none"/>
-        </w:rPr>
-        <w:t xml:space="preserve">Biomarker Data </w:t>
-      </w:r>
-      <w:proofErr w:type="gramStart"/>
-      <w:r>
-        <w:rPr>
-          <w:rFonts w:ascii="Calibri" w:eastAsia="Times New Roman" w:hAnsi="Calibri" w:cs="Calibri"/>
-          <w:color w:val="000000"/>
-          <w:kern w:val="0"/>
-          <w:lang w:eastAsia="en-IN"/>
-          <w14:ligatures w14:val="none"/>
-        </w:rPr>
-        <w:t>From</w:t>
-      </w:r>
-      <w:proofErr w:type="gramEnd"/>
-      <w:r>
-        <w:rPr>
-          <w:rFonts w:ascii="Calibri" w:eastAsia="Times New Roman" w:hAnsi="Calibri" w:cs="Calibri"/>
-          <w:color w:val="000000"/>
-          <w:kern w:val="0"/>
-          <w:lang w:eastAsia="en-IN"/>
-          <w14:ligatures w14:val="none"/>
-        </w:rPr>
-        <w:t xml:space="preserve"> Literature</w:t>
+        <w:t>menu will be “Biomarker Data From Literature”, “Diagnostic Tools”, and “Biorepositories”. Clicking on the “</w:t>
+      </w:r>
+      <w:r>
+        <w:rPr>
+          <w:rFonts w:ascii="Calibri" w:eastAsia="Times New Roman" w:hAnsi="Calibri" w:cs="Calibri"/>
+          <w:color w:val="000000"/>
+          <w:kern w:val="0"/>
+          <w:lang w:eastAsia="en-IN"/>
+          <w14:ligatures w14:val="none"/>
+        </w:rPr>
+        <w:t>Biomarker Data From Literature</w:t>
       </w:r>
       <w:r>
         <w:rPr>
@@ -6055,29 +5853,7 @@
           <w:lang w:val="en-IN" w:eastAsia="en-IN"/>
           <w14:ligatures w14:val="none"/>
         </w:rPr>
-        <w:t xml:space="preserve">Please update the website’s top-level menu’s “Clinical Trials” button to show a drop-down menu when the user hovers the mouse cursor over it. The content of this drop-down menu will follow the same rules for visibility within the field of view of the screen, as obeyed by the pre-existing drop-down menus made visible upon hovering over other top-level menu items. The options in this drop-down menu, accessed from the top-level menu “Clinical Trials” button, will have the options “Guidelines </w:t>
-      </w:r>
-      <w:proofErr w:type="gramStart"/>
-      <w:r>
-        <w:rPr>
-          <w:rFonts w:ascii="Calibri" w:eastAsia="Times New Roman" w:hAnsi="Calibri" w:cs="Calibri"/>
-          <w:color w:val="000000"/>
-          <w:kern w:val="0"/>
-          <w:lang w:val="en-IN" w:eastAsia="en-IN"/>
-          <w14:ligatures w14:val="none"/>
-        </w:rPr>
-        <w:t>For</w:t>
-      </w:r>
-      <w:proofErr w:type="gramEnd"/>
-      <w:r>
-        <w:rPr>
-          <w:rFonts w:ascii="Calibri" w:eastAsia="Times New Roman" w:hAnsi="Calibri" w:cs="Calibri"/>
-          <w:color w:val="000000"/>
-          <w:kern w:val="0"/>
-          <w:lang w:val="en-IN" w:eastAsia="en-IN"/>
-          <w14:ligatures w14:val="none"/>
-        </w:rPr>
-        <w:t xml:space="preserve"> Patient Selection”, “Drug Response Prediction”, “Druggable Targets- Signalling and Biochemical Pathways</w:t>
+        <w:t>Please update the website’s top-level menu’s “Clinical Trials” button to show a drop-down menu when the user hovers the mouse cursor over it. The content of this drop-down menu will follow the same rules for visibility within the field of view of the screen, as obeyed by the pre-existing drop-down menus made visible upon hovering over other top-level menu items. The options in this drop-down menu, accessed from the top-level menu “Clinical Trials” button, will have the options “Guidelines For Patient Selection”, “Drug Response Prediction”, “Druggable Targets- Signalling and Biochemical Pathways</w:t>
       </w:r>
       <w:r>
         <w:rPr>
@@ -6141,29 +5917,7 @@
           <w:lang w:val="en-IN" w:eastAsia="en-IN"/>
           <w14:ligatures w14:val="none"/>
         </w:rPr>
-        <w:t xml:space="preserve">Guidelines </w:t>
-      </w:r>
-      <w:proofErr w:type="gramStart"/>
-      <w:r>
-        <w:rPr>
-          <w:rFonts w:ascii="Calibri" w:eastAsia="Times New Roman" w:hAnsi="Calibri" w:cs="Calibri"/>
-          <w:color w:val="000000"/>
-          <w:kern w:val="0"/>
-          <w:lang w:val="en-IN" w:eastAsia="en-IN"/>
-          <w14:ligatures w14:val="none"/>
-        </w:rPr>
-        <w:t>For</w:t>
-      </w:r>
-      <w:proofErr w:type="gramEnd"/>
-      <w:r>
-        <w:rPr>
-          <w:rFonts w:ascii="Calibri" w:eastAsia="Times New Roman" w:hAnsi="Calibri" w:cs="Calibri"/>
-          <w:color w:val="000000"/>
-          <w:kern w:val="0"/>
-          <w:lang w:val="en-IN" w:eastAsia="en-IN"/>
-          <w14:ligatures w14:val="none"/>
-        </w:rPr>
-        <w:t xml:space="preserve"> Patient Selection</w:t>
+        <w:t>Guidelines For Patient Selection</w:t>
       </w:r>
       <w:r>
         <w:rPr>
@@ -7180,29 +6934,7 @@
           <w:lang w:val="en-IN" w:eastAsia="en-IN"/>
           <w14:ligatures w14:val="none"/>
         </w:rPr>
-        <w:t xml:space="preserve">Please add sub-sections options as a drop-down menu that appears when the user hovers the mouse cursor over the top-level menu item “Education”. These sub-sections will be titled “Cancer Biology Education”, “High-Throughput Cancer Data </w:t>
-      </w:r>
-      <w:proofErr w:type="gramStart"/>
-      <w:r>
-        <w:rPr>
-          <w:rFonts w:ascii="Calibri" w:eastAsia="Times New Roman" w:hAnsi="Calibri" w:cs="Calibri"/>
-          <w:color w:val="000000"/>
-          <w:kern w:val="0"/>
-          <w:lang w:val="en-IN" w:eastAsia="en-IN"/>
-          <w14:ligatures w14:val="none"/>
-        </w:rPr>
-        <w:t>In</w:t>
-      </w:r>
-      <w:proofErr w:type="gramEnd"/>
-      <w:r>
-        <w:rPr>
-          <w:rFonts w:ascii="Calibri" w:eastAsia="Times New Roman" w:hAnsi="Calibri" w:cs="Calibri"/>
-          <w:color w:val="000000"/>
-          <w:kern w:val="0"/>
-          <w:lang w:val="en-IN" w:eastAsia="en-IN"/>
-          <w14:ligatures w14:val="none"/>
-        </w:rPr>
-        <w:t xml:space="preserve"> India”, and “Cancer Awareness Programmes”.</w:t>
+        <w:t>Please add sub-sections options as a drop-down menu that appears when the user hovers the mouse cursor over the top-level menu item “Education”. These sub-sections will be titled “Cancer Biology Education”, “High-Throughput Cancer Data In India”, and “Cancer Awareness Programmes”.</w:t>
       </w:r>
       <w:r>
         <w:rPr>
@@ -7264,29 +6996,7 @@
           <w:lang w:val="en-IN" w:eastAsia="en-IN"/>
           <w14:ligatures w14:val="none"/>
         </w:rPr>
-        <w:t xml:space="preserve">“High-Throughput Cancer Data </w:t>
-      </w:r>
-      <w:proofErr w:type="gramStart"/>
-      <w:r>
-        <w:rPr>
-          <w:rFonts w:ascii="Calibri" w:eastAsia="Times New Roman" w:hAnsi="Calibri" w:cs="Calibri"/>
-          <w:color w:val="000000"/>
-          <w:kern w:val="0"/>
-          <w:lang w:val="en-IN" w:eastAsia="en-IN"/>
-          <w14:ligatures w14:val="none"/>
-        </w:rPr>
-        <w:t>In</w:t>
-      </w:r>
-      <w:proofErr w:type="gramEnd"/>
-      <w:r>
-        <w:rPr>
-          <w:rFonts w:ascii="Calibri" w:eastAsia="Times New Roman" w:hAnsi="Calibri" w:cs="Calibri"/>
-          <w:color w:val="000000"/>
-          <w:kern w:val="0"/>
-          <w:lang w:val="en-IN" w:eastAsia="en-IN"/>
-          <w14:ligatures w14:val="none"/>
-        </w:rPr>
-        <w:t xml:space="preserve"> India”</w:t>
+        <w:t>“High-Throughput Cancer Data In India”</w:t>
       </w:r>
       <w:r>
         <w:rPr>
@@ -7721,6 +7431,243 @@
           <w14:ligatures w14:val="none"/>
         </w:rPr>
       </w:pPr>
+      <w:r>
+        <w:rPr>
+          <w:rFonts w:ascii="Calibri" w:eastAsia="Times New Roman" w:hAnsi="Calibri" w:cs="Calibri"/>
+          <w:color w:val="000000"/>
+          <w:kern w:val="0"/>
+          <w:lang w:val="en-IN" w:eastAsia="en-IN"/>
+          <w14:ligatures w14:val="none"/>
+        </w:rPr>
+        <w:t>Instalment 37:</w:t>
+      </w:r>
+    </w:p>
+    <w:p>
+      <w:pPr>
+        <w:jc w:val="both"/>
+        <w:rPr>
+          <w:rFonts w:ascii="Calibri" w:eastAsia="Times New Roman" w:hAnsi="Calibri" w:cs="Calibri"/>
+          <w:color w:val="000000"/>
+          <w:kern w:val="0"/>
+          <w:lang w:val="en-IN" w:eastAsia="en-IN"/>
+          <w14:ligatures w14:val="none"/>
+        </w:rPr>
+      </w:pPr>
+    </w:p>
+    <w:p>
+      <w:pPr>
+        <w:jc w:val="both"/>
+        <w:rPr>
+          <w:rFonts w:ascii="Calibri" w:eastAsia="Times New Roman" w:hAnsi="Calibri" w:cs="Calibri"/>
+          <w:color w:val="000000"/>
+          <w:kern w:val="0"/>
+          <w:lang w:val="en-IN" w:eastAsia="en-IN"/>
+          <w14:ligatures w14:val="none"/>
+        </w:rPr>
+      </w:pPr>
+      <w:r>
+        <w:rPr>
+          <w:rFonts w:ascii="Calibri" w:eastAsia="Times New Roman" w:hAnsi="Calibri" w:cs="Calibri"/>
+          <w:color w:val="000000"/>
+          <w:kern w:val="0"/>
+          <w:lang w:val="en-IN" w:eastAsia="en-IN"/>
+          <w14:ligatures w14:val="none"/>
+        </w:rPr>
+        <w:lastRenderedPageBreak/>
+        <w:t>Please update the text of the text message displayed in the “About Us” section of the website to read as follows:</w:t>
+      </w:r>
+    </w:p>
+    <w:p>
+      <w:pPr>
+        <w:jc w:val="both"/>
+        <w:rPr>
+          <w:rFonts w:ascii="Calibri" w:eastAsia="Times New Roman" w:hAnsi="Calibri" w:cs="Calibri"/>
+          <w:color w:val="000000"/>
+          <w:kern w:val="0"/>
+          <w:lang w:val="en-IN" w:eastAsia="en-IN"/>
+          <w14:ligatures w14:val="none"/>
+        </w:rPr>
+      </w:pPr>
+      <w:r>
+        <w:rPr>
+          <w:rFonts w:ascii="Calibri" w:eastAsia="Times New Roman" w:hAnsi="Calibri" w:cs="Calibri"/>
+          <w:color w:val="000000"/>
+          <w:kern w:val="0"/>
+          <w:lang w:val="en-IN" w:eastAsia="en-IN"/>
+          <w14:ligatures w14:val="none"/>
+        </w:rPr>
+        <w:t>‘</w:t>
+      </w:r>
+      <w:r>
+        <w:rPr>
+          <w:rFonts w:ascii="Calibri" w:eastAsia="Times New Roman" w:hAnsi="Calibri" w:cs="Calibri"/>
+          <w:color w:val="000000"/>
+          <w:kern w:val="0"/>
+          <w:lang w:eastAsia="en-IN"/>
+          <w14:ligatures w14:val="none"/>
+        </w:rPr>
+        <w:t>This is a demo website meant to demonstrate some of the functionality intended for the final ICDTRA website. Currently, the Cancer Genomics section offers a limited selection of differential expression data from the genomics expression database EMBL-EBI Expression Atlas (</w:t>
+      </w:r>
+      <w:hyperlink r:id="rId26" w:tgtFrame="_blank" w:history="1">
+        <w:r>
+          <w:rPr>
+            <w:rStyle w:val="Hyperlink"/>
+            <w:rFonts w:ascii="Calibri" w:eastAsia="Times New Roman" w:hAnsi="Calibri" w:cs="Calibri"/>
+            <w:kern w:val="0"/>
+            <w:lang w:eastAsia="en-IN"/>
+            <w14:ligatures w14:val="none"/>
+          </w:rPr>
+          <w:t>https://www.ebi.ac.uk/gxa/home</w:t>
+        </w:r>
+      </w:hyperlink>
+      <w:r>
+        <w:rPr>
+          <w:rFonts w:ascii="Calibri" w:eastAsia="Times New Roman" w:hAnsi="Calibri" w:cs="Calibri"/>
+          <w:color w:val="000000"/>
+          <w:kern w:val="0"/>
+          <w:lang w:eastAsia="en-IN"/>
+          <w14:ligatures w14:val="none"/>
+        </w:rPr>
+        <w:t xml:space="preserve">), within the “Differential Gene Expression” sub-section, which also offers lists of the names of proteins/genes associated with signalling pathways, as sourced from the </w:t>
+      </w:r>
+      <w:proofErr w:type="spellStart"/>
+      <w:r>
+        <w:rPr>
+          <w:rFonts w:ascii="Calibri" w:eastAsia="Times New Roman" w:hAnsi="Calibri" w:cs="Calibri"/>
+          <w:color w:val="000000"/>
+          <w:kern w:val="0"/>
+          <w:lang w:eastAsia="en-IN"/>
+          <w14:ligatures w14:val="none"/>
+        </w:rPr>
+        <w:t>Reactome</w:t>
+      </w:r>
+      <w:proofErr w:type="spellEnd"/>
+      <w:r>
+        <w:rPr>
+          <w:rFonts w:ascii="Calibri" w:eastAsia="Times New Roman" w:hAnsi="Calibri" w:cs="Calibri"/>
+          <w:color w:val="000000"/>
+          <w:kern w:val="0"/>
+          <w:lang w:eastAsia="en-IN"/>
+          <w14:ligatures w14:val="none"/>
+        </w:rPr>
+        <w:t xml:space="preserve"> database’s Pathway Browser (</w:t>
+      </w:r>
+      <w:hyperlink r:id="rId27" w:tgtFrame="_blank" w:history="1">
+        <w:r>
+          <w:rPr>
+            <w:rStyle w:val="Hyperlink"/>
+            <w:rFonts w:ascii="Calibri" w:eastAsia="Times New Roman" w:hAnsi="Calibri" w:cs="Calibri"/>
+            <w:kern w:val="0"/>
+            <w:lang w:eastAsia="en-IN"/>
+            <w14:ligatures w14:val="none"/>
+          </w:rPr>
+          <w:t>https://reactome.org/PathwayBrowser/</w:t>
+        </w:r>
+      </w:hyperlink>
+      <w:r>
+        <w:rPr>
+          <w:rFonts w:ascii="Calibri" w:eastAsia="Times New Roman" w:hAnsi="Calibri" w:cs="Calibri"/>
+          <w:color w:val="000000"/>
+          <w:kern w:val="0"/>
+          <w:lang w:eastAsia="en-IN"/>
+          <w14:ligatures w14:val="none"/>
+        </w:rPr>
+        <w:t>). The “Gene Biomarker Data From Literature” sub-section lists data on biomarkers gathered from the literature on cancer. The Cancer Literature section currently allows users to search through a set of research articles featuring “cancer” and “differential expression” together in the title and/or the abstract, as well as listing “India” as the affiliation address of at least one of the authors of the paper. The list of publications can be viewed, and the articles can be downloaded as PDF files, in cases where the articles are open-source. The Cancer Proteomics section will operate similarly to the Cancer Genomics section, although the “differential protein expression with biological fold-change from a proteomics database” part of this section is not active, at present, owing to difficulties in obtaining freely available differential expression data, organised in a database, through automation. The Diagnostics section presently displays biomarker data drawn from the literature on cancer, by Google’s Notebook LM (</w:t>
+      </w:r>
+      <w:hyperlink r:id="rId28" w:tgtFrame="_blank" w:history="1">
+        <w:r>
+          <w:rPr>
+            <w:rStyle w:val="Hyperlink"/>
+            <w:rFonts w:ascii="Calibri" w:eastAsia="Times New Roman" w:hAnsi="Calibri" w:cs="Calibri"/>
+            <w:kern w:val="0"/>
+            <w:lang w:eastAsia="en-IN"/>
+            <w14:ligatures w14:val="none"/>
+          </w:rPr>
+          <w:t>https://notebooklm.google/</w:t>
+        </w:r>
+      </w:hyperlink>
+      <w:r>
+        <w:rPr>
+          <w:rFonts w:ascii="Calibri" w:eastAsia="Times New Roman" w:hAnsi="Calibri" w:cs="Calibri"/>
+          <w:color w:val="000000"/>
+          <w:kern w:val="0"/>
+          <w:lang w:eastAsia="en-IN"/>
+          <w14:ligatures w14:val="none"/>
+        </w:rPr>
+        <w:t xml:space="preserve">). The corresponding sub-sections in the Cancer Genomics and Cancer Proteomics sections are derived from the table in this section. </w:t>
+      </w:r>
+      <w:r>
+        <w:rPr>
+          <w:rFonts w:ascii="Calibri" w:eastAsia="Times New Roman" w:hAnsi="Calibri" w:cs="Calibri"/>
+          <w:color w:val="000000"/>
+          <w:kern w:val="0"/>
+          <w:lang w:eastAsia="en-IN"/>
+          <w14:ligatures w14:val="none"/>
+        </w:rPr>
+        <w:t xml:space="preserve">The Diagnostics section also mentions approaches that could be taken for providing information on diagnostics tools/techniques and biorepositories. The latter is useful for promoting research collaboration of cancer biorepositories with basic science cancer researchers. </w:t>
+      </w:r>
+      <w:r>
+        <w:rPr>
+          <w:rFonts w:ascii="Calibri" w:eastAsia="Times New Roman" w:hAnsi="Calibri" w:cs="Calibri"/>
+          <w:color w:val="000000"/>
+          <w:kern w:val="0"/>
+          <w:lang w:eastAsia="en-IN"/>
+          <w14:ligatures w14:val="none"/>
+        </w:rPr>
+        <w:t>The Treatment Options section presently displays a list of National Cancer Grid (NCG) member hospitals/institutes listed by the Tata Memorial Centre (TMC) (</w:t>
+      </w:r>
+      <w:hyperlink r:id="rId29" w:tgtFrame="_blank" w:history="1">
+        <w:r>
+          <w:rPr>
+            <w:rStyle w:val="Hyperlink"/>
+            <w:rFonts w:ascii="Calibri" w:eastAsia="Times New Roman" w:hAnsi="Calibri" w:cs="Calibri"/>
+            <w:kern w:val="0"/>
+            <w:lang w:eastAsia="en-IN"/>
+            <w14:ligatures w14:val="none"/>
+          </w:rPr>
+          <w:t>https://www.ncgindia.org/</w:t>
+        </w:r>
+      </w:hyperlink>
+      <w:r>
+        <w:rPr>
+          <w:rFonts w:ascii="Calibri" w:eastAsia="Times New Roman" w:hAnsi="Calibri" w:cs="Calibri"/>
+          <w:color w:val="000000"/>
+          <w:kern w:val="0"/>
+          <w:lang w:eastAsia="en-IN"/>
+          <w14:ligatures w14:val="none"/>
+        </w:rPr>
+        <w:t>).</w:t>
+      </w:r>
+      <w:r>
+        <w:rPr>
+          <w:rFonts w:ascii="Calibri" w:eastAsia="Times New Roman" w:hAnsi="Calibri" w:cs="Calibri"/>
+          <w:color w:val="000000"/>
+          <w:kern w:val="0"/>
+          <w:lang w:eastAsia="en-IN"/>
+          <w14:ligatures w14:val="none"/>
+        </w:rPr>
+        <w:t xml:space="preserve"> It also lists approaches to providing information to the user on drugs available in the Indian market. The Clinical Trials section </w:t>
+      </w:r>
+      <w:r>
+        <w:rPr>
+          <w:rFonts w:ascii="Calibri" w:eastAsia="Times New Roman" w:hAnsi="Calibri" w:cs="Calibri"/>
+          <w:color w:val="000000"/>
+          <w:kern w:val="0"/>
+          <w:lang w:eastAsia="en-IN"/>
+          <w14:ligatures w14:val="none"/>
+        </w:rPr>
+        <w:t>lists approaches to informing the user about guidelines for the selection of patients as study subjects, drug-response prediction, druggable protein targets, and drugs under clinical trials. The Education section states that the cancer biology sub-section will be developed by referring to cancer biology review articles and taking input from the faculty at TMC-ACTREC. The Education section also houses sub-sections on high-throughput cancer data and cancer awareness programmes in India, providing relevant resources for both sub-sections.</w:t>
+      </w:r>
+      <w:r>
+        <w:rPr>
+          <w:rFonts w:ascii="Calibri" w:eastAsia="Times New Roman" w:hAnsi="Calibri" w:cs="Calibri"/>
+          <w:color w:val="000000"/>
+          <w:kern w:val="0"/>
+          <w:lang w:eastAsia="en-IN"/>
+          <w14:ligatures w14:val="none"/>
+        </w:rPr>
+        <w:t>’</w:t>
+      </w:r>
     </w:p>
     <w:sectPr>
       <w:pgSz w:w="11906" w:h="16838"/>
@@ -9436,7 +9383,6 @@
   <w:style w:type="character" w:default="1" w:styleId="DefaultParagraphFont">
     <w:name w:val="Default Paragraph Font"/>
     <w:uiPriority w:val="1"/>
-    <w:semiHidden/>
     <w:unhideWhenUsed/>
   </w:style>
   <w:style w:type="table" w:default="1" w:styleId="TableNormal">

</xml_diff>